<commit_message>
CMS I Exam 4: Carter's L23 Valvular Heart Disease, with his spoken slide corrections
4 pages (Quiz 1/2 + Vignettes 1/2), questions held at 2-4 per lesion across all nine valve
lesions plus prosthetics (Carter: 'just as likely a tricuspid question as an aortic one');
every form has mechanical valve -> warfarin. His corrections win over the slides: slide 28's
AR murmur is diastolic (strike 'Holosystolic'), slide 29's 'cause of MR' is AR. Contested
facts left unkeyed (slide 29 leaflet, slide 74 valve by age, slide 38 Valsalva); unmentioned
deck errors (slides 31, 44, 52, 53, 65) flagged in the guide, never keyed as printed.
Guide section 4 with erratum and deck-error boxes, 3 cram topics, 3 Arcade decks (103 cards),
Clin Med Pro E4 updated.

Co-Authored-By: Claude Opus 5.5 (1M context) <noreply@anthropic.com>
</commit_message>
<xml_diff>
--- a/Clinical Medicine and Surgery I Exam 4/cms-exam-4-clin-med-pro-guide.docx
+++ b/Clinical Medicine and Surgery I Exam 4/cms-exam-4-clin-med-pro-guide.docx
@@ -9553,7 +9553,7 @@
           <w:b w:val="0"/>
           <w:i w:val="0"/>
         </w:rPr>
-        <w:t xml:space="preserve"> Slide corrections from the lecture to be added. Dr. Carter said in class that some of these slides contain mistakes; facts the slides contradict are not keyed below until the lecture transcript settles them.</w:t>
+        <w:t xml:space="preserve"> Corrections from the lecture (25 September): Dr. Carter struck two slide errors in class. Slide 28: the aortic regurgitation murmur is a high-pitched blowing DIASTOLIC murmur, not holosystolic. Slide 29: echocardiography determines the cause of AORTIC regurgitation (aortic root dilation, dissection), not mitral regurgitation. Not keyed: which leaflet flutters on echo (slide 29; he changed mitral to aortic, against standard teaching), valve type by age (slide 74), the mitral stenosis maneuvers (slide 38 Valsalva), the overlapping mild and moderate mitral stenosis bands (slide 40), and pulmonic regurgitation "almost always congenital" (slide 64; he gave iatrogenic as the most common cause). Deck errors he did not mention: slide 44 labels the mitral regurgitation definition "Mitral Stenosis"; slide 52 lists aortic balloon valvuloplasty for children under mitral regurgitation; slide 53 says "MS" on the mitral regurgitation referral slide; slide 65 gives tricuspid inflow "from the LA" (it is right atrium to right ventricle, slide 66); slide 31 lists dobutamine as a vasodilator (it is an inotrope). He also said a tricuspid question is as likely on the test as an aortic one, grading is tested only for aortic and mitral stenosis (plus severe regurgitation = regurgitant fraction 50% or more), and the suffusion sign is not tested.</w:t>
       </w:r>
     </w:p>
     <w:p>
@@ -9568,217 +9568,11 @@
         <w:t>Aortic stenosis</w:t>
       </w:r>
       <w:r>
-        <w:br/>
-      </w:r>
-      <w:r>
-        <w:rPr>
-          <w:b w:val="0"/>
-          <w:i w:val="0"/>
-        </w:rPr>
-        <w:t>Name of Condition</w:t>
-      </w:r>
-      <w:r>
-        <w:rPr>
-          <w:b w:val="0"/>
-          <w:i w:val="0"/>
-        </w:rPr>
-        <w:t xml:space="preserve">Aortic stenosis (AS) </w:t>
-      </w:r>
-      <w:r>
-        <w:rPr>
-          <w:b w:val="0"/>
-          <w:i w:val="0"/>
-        </w:rPr>
-        <w:t>Slide 11</w:t>
-      </w:r>
-      <w:r>
-        <w:rPr>
-          <w:b w:val="0"/>
-          <w:i w:val="0"/>
-        </w:rPr>
-        <w:t>Definition</w:t>
-      </w:r>
-      <w:r>
-        <w:rPr>
-          <w:b w:val="0"/>
-          <w:i w:val="0"/>
-        </w:rPr>
-        <w:t xml:space="preserve">Obstruction of left ventricular outflow across the aortic valve; the most common valvular disease </w:t>
-      </w:r>
-      <w:r>
-        <w:rPr>
-          <w:b w:val="0"/>
-          <w:i w:val="0"/>
-        </w:rPr>
-        <w:t>Slide 11</w:t>
-      </w:r>
-      <w:r>
-        <w:rPr>
-          <w:b w:val="0"/>
-          <w:i w:val="0"/>
-        </w:rPr>
-        <w:t>Etiology (cause)</w:t>
-      </w:r>
-      <w:r>
-        <w:rPr>
-          <w:b w:val="0"/>
-          <w:i w:val="0"/>
-        </w:rPr>
-        <w:t xml:space="preserve">Degenerative (atherosclerosis: hyperlipidemia, diabetes, smoking): most common cause over age 70; congenital bicuspid aortic valve: most common cause under 70; acquired: rheumatic heart disease (autoimmune reaction to group A beta-hemolytic streptococci), endocarditis </w:t>
-      </w:r>
-      <w:r>
-        <w:rPr>
-          <w:b w:val="0"/>
-          <w:i w:val="0"/>
-        </w:rPr>
-        <w:t>Slide 12</w:t>
-      </w:r>
-      <w:r>
-        <w:rPr>
-          <w:b w:val="0"/>
-          <w:i w:val="0"/>
-        </w:rPr>
-        <w:t>Epidemiology (who)</w:t>
-      </w:r>
-      <w:r>
-        <w:rPr>
-          <w:b w:val="0"/>
-          <w:i w:val="0"/>
-        </w:rPr>
-        <w:t xml:space="preserve">80% of symptomatic AS patients are men; present in 25% of patients over 65 and 35% over 70; 10–20% progress to significant AS within 10–15 years </w:t>
-      </w:r>
-      <w:r>
-        <w:rPr>
-          <w:b w:val="0"/>
-          <w:i w:val="0"/>
-        </w:rPr>
-        <w:t>Slide 13</w:t>
-      </w:r>
-      <w:r>
-        <w:rPr>
-          <w:b w:val="0"/>
-          <w:i w:val="0"/>
-        </w:rPr>
-        <w:t>Risk Factors</w:t>
-      </w:r>
-      <w:r>
-        <w:rPr>
-          <w:b w:val="0"/>
-          <w:i w:val="0"/>
-        </w:rPr>
-        <w:t xml:space="preserve">Hypertension; hyperlipidemia; smoking </w:t>
-      </w:r>
-      <w:r>
-        <w:rPr>
-          <w:b w:val="0"/>
-          <w:i w:val="0"/>
-        </w:rPr>
-        <w:t>Slide 13</w:t>
-      </w:r>
-      <w:r>
-        <w:rPr>
-          <w:b w:val="0"/>
-          <w:i w:val="0"/>
-        </w:rPr>
-        <w:t>Pathology</w:t>
-      </w:r>
-      <w:r>
-        <w:rPr>
-          <w:b w:val="0"/>
-          <w:i w:val="0"/>
-        </w:rPr>
-        <w:t xml:space="preserve">LV (left ventricular) outflow obstruction → LV pressure overload → myocyte remodeling → concentric LVH (left ventricular hypertrophy) → diastolic HF (heart failure) with preserved ejection fraction </w:t>
-      </w:r>
-      <w:r>
-        <w:rPr>
-          <w:b w:val="0"/>
-          <w:i w:val="0"/>
-        </w:rPr>
-        <w:t>Slides 14, 15</w:t>
-      </w:r>
-      <w:r>
-        <w:rPr>
-          <w:b w:val="0"/>
-          <w:i w:val="0"/>
-        </w:rPr>
-        <w:t>Clinical Manifestation</w:t>
-      </w:r>
-      <w:r>
-        <w:rPr>
-          <w:b w:val="0"/>
-          <w:i w:val="0"/>
-        </w:rPr>
-        <w:t xml:space="preserve">Symptoms rare until orifice ~1 cm (normal 3–4 cm), age 60–80; insidious. Cardinal symptoms with survival: angina 5 y, syncope 3 y (both usually exertional), CHF (congestive heart failure)/exertional dyspnea 2 y (most common, worst prognosis). Harsh systolic ejection crescendo-decrescendo murmur at 2nd right ICS (intercostal space)/RUSB (right upper sternal border), radiates to carotids; decreased by Valsalva, standing, handgrip; increased by squatting, sitting forward. Forceful LV apex beat with delayed/weak carotid pulse suggests severe AS </w:t>
-      </w:r>
-      <w:r>
-        <w:rPr>
-          <w:b w:val="0"/>
-          <w:i w:val="0"/>
-        </w:rPr>
-        <w:t>Slides 16, 17, 22</w:t>
-      </w:r>
-      <w:r>
-        <w:rPr>
-          <w:b w:val="0"/>
-          <w:i w:val="0"/>
-        </w:rPr>
-        <w:t>Diagnosis</w:t>
-      </w:r>
-      <w:r>
-        <w:rPr>
-          <w:b w:val="0"/>
-          <w:i w:val="0"/>
-        </w:rPr>
-        <w:t xml:space="preserve">ECG (electrocardiogram): LVH in severe AS (low sensitivity); TTE (transthoracic echocardiogram): thickened, calcified leaflets, reduced systolic opening, LVH; TEE (transesophageal echocardiogram) useful for congenital; left heart catheterization definitive. Severe: area &lt;1.0 cm, mean gradient &gt;40 mmHg, jet velocity &gt;4.0 m/s; moderate area 1.0–1.5 cm, gradient 25–40 mmHg; mild area &gt;1.5 cm, gradient &lt;25 mmHg. Exertional chest pressure, shortness of breath or syncope → echo </w:t>
-      </w:r>
-      <w:r>
-        <w:rPr>
-          <w:b w:val="0"/>
-          <w:i w:val="0"/>
-        </w:rPr>
-        <w:t>Slides 18, 19, 22</w:t>
-      </w:r>
-      <w:r>
-        <w:rPr>
-          <w:b w:val="0"/>
-          <w:i w:val="0"/>
-        </w:rPr>
-        <w:t>Treatment/Therapy</w:t>
-      </w:r>
-      <w:r>
-        <w:rPr>
-          <w:b w:val="0"/>
-          <w:i w:val="0"/>
-        </w:rPr>
-        <w:t xml:space="preserve">Medical therapy not effective (mild/moderate only); preload dependent: avoid strenuous activity/competitive sports, dehydration, hypovolemia; if hypertension avoid beta blockers and calcium channel blockers; if angina avoid nitrates. Surgery if severe AS AND symptomatic LV systolic dysfunction, or bicuspid valve: TAVR (transcatheter aortic valve replacement); mechanical valve (lifelong anticoagulation) vs biological (none); children/young adults: PABV (percutaneous aortic balloon valvuloplasty). Refer all AS on echo to cardiology </w:t>
-      </w:r>
-      <w:r>
-        <w:rPr>
-          <w:b w:val="0"/>
-          <w:i w:val="0"/>
-        </w:rPr>
-        <w:t>Slides 20, 21, 22</w:t>
-      </w:r>
-      <w:r>
-        <w:rPr>
-          <w:b w:val="0"/>
-          <w:i w:val="0"/>
-        </w:rPr>
-        <w:t>Mortality ★</w:t>
-      </w:r>
-      <w:r>
-        <w:rPr>
-          <w:b w:val="0"/>
-          <w:i w:val="0"/>
-        </w:rPr>
-        <w:t xml:space="preserve">Symptomatic AS 3-year mortality 75%; prognosis severely worsens once symptomatic; survival after onset: angina 5 y, syncope 3 y, CHF 2 y; average age of death 63 (graph) </w:t>
-      </w:r>
-      <w:r>
-        <w:rPr>
-          <w:b w:val="0"/>
-          <w:i w:val="0"/>
-        </w:rPr>
-        <w:t>Slides 16, 22</w:t>
+        <w:rPr>
+          <w:b w:val="0"/>
+          <w:i w:val="0"/>
+        </w:rPr>
+        <w:t>★ Professor emphasized</w:t>
       </w:r>
     </w:p>
     <w:p>
@@ -9790,213 +9584,7 @@
           <w:b w:val="0"/>
           <w:i w:val="0"/>
         </w:rPr>
-        <w:t>Aortic regurgitation</w:t>
-      </w:r>
-      <w:r>
-        <w:rPr>
-          <w:b w:val="0"/>
-          <w:i w:val="0"/>
-        </w:rPr>
-        <w:t>2 not covered</w:t>
-      </w:r>
-      <w:r>
-        <w:br/>
-      </w:r>
-      <w:r>
-        <w:rPr>
-          <w:b w:val="0"/>
-          <w:i w:val="0"/>
-        </w:rPr>
-        <w:t>Name of Condition</w:t>
-      </w:r>
-      <w:r>
-        <w:rPr>
-          <w:b w:val="0"/>
-          <w:i w:val="0"/>
-        </w:rPr>
-        <w:t xml:space="preserve">Aortic regurgitation / insufficiency (AR) </w:t>
-      </w:r>
-      <w:r>
-        <w:rPr>
-          <w:b w:val="0"/>
-          <w:i w:val="0"/>
-        </w:rPr>
-        <w:t>Slide 23</w:t>
-      </w:r>
-      <w:r>
-        <w:rPr>
-          <w:b w:val="0"/>
-          <w:i w:val="0"/>
-        </w:rPr>
-        <w:t>Definition</w:t>
-      </w:r>
-      <w:r>
-        <w:rPr>
-          <w:b w:val="0"/>
-          <w:i w:val="0"/>
-        </w:rPr>
-        <w:t xml:space="preserve">Incomplete aortic valve closure causing blood to flow back into the LV (left ventricle) </w:t>
-      </w:r>
-      <w:r>
-        <w:rPr>
-          <w:b w:val="0"/>
-          <w:i w:val="0"/>
-        </w:rPr>
-        <w:t>Slide 23</w:t>
-      </w:r>
-      <w:r>
-        <w:rPr>
-          <w:b w:val="0"/>
-          <w:i w:val="0"/>
-        </w:rPr>
-        <w:t>Etiology (cause)</w:t>
-      </w:r>
-      <w:r>
-        <w:rPr>
-          <w:b w:val="0"/>
-          <w:i w:val="0"/>
-        </w:rPr>
-        <w:t xml:space="preserve">Valve disease, aortic root disease or both. Valvular: congenital bicuspid, endocarditis, rheumatic fever, myxomatous (collagen), trauma, syphilis, ankylosing spondylitis. Root: aortic dissection, cystic medial degeneration, Marfan syndrome, nonsyndromic familial aneurysm, aortitis, hypertension. Acute AR: myocardial infarction, endocarditis, aortic dissection, trauma </w:t>
-      </w:r>
-      <w:r>
-        <w:rPr>
-          <w:b w:val="0"/>
-          <w:i w:val="0"/>
-        </w:rPr>
-        <w:t>Slides 24, 26</w:t>
-      </w:r>
-      <w:r>
-        <w:rPr>
-          <w:b w:val="0"/>
-          <w:i w:val="0"/>
-        </w:rPr>
-        <w:t>Epidemiology (who)</w:t>
-      </w:r>
-      <w:r>
-        <w:rPr>
-          <w:b w:val="0"/>
-          <w:i w:val="0"/>
-        </w:rPr>
-        <w:t>Not covered in the lecture</w:t>
-      </w:r>
-      <w:r>
-        <w:rPr>
-          <w:b w:val="0"/>
-          <w:i w:val="0"/>
-        </w:rPr>
-        <w:t>Risk Factors</w:t>
-      </w:r>
-      <w:r>
-        <w:rPr>
-          <w:b w:val="0"/>
-          <w:i w:val="0"/>
-        </w:rPr>
-        <w:t>Not covered in the lecture</w:t>
-      </w:r>
-      <w:r>
-        <w:rPr>
-          <w:b w:val="0"/>
-          <w:i w:val="0"/>
-        </w:rPr>
-        <w:t>Pathology</w:t>
-      </w:r>
-      <w:r>
-        <w:rPr>
-          <w:b w:val="0"/>
-          <w:i w:val="0"/>
-        </w:rPr>
-        <w:t xml:space="preserve">Incomplete closure → diastolic backflow into LV → eccentric hypertrophy and dilation → LV dilation (systolic HF (heart failure)) → HF with reduced ejection fraction </w:t>
-      </w:r>
-      <w:r>
-        <w:rPr>
-          <w:b w:val="0"/>
-          <w:i w:val="0"/>
-        </w:rPr>
-        <w:t>Slide 25</w:t>
-      </w:r>
-      <w:r>
-        <w:rPr>
-          <w:b w:val="0"/>
-          <w:i w:val="0"/>
-        </w:rPr>
-        <w:t>Clinical Manifestation</w:t>
-      </w:r>
-      <w:r>
-        <w:rPr>
-          <w:b w:val="0"/>
-          <w:i w:val="0"/>
-        </w:rPr>
-        <w:t xml:space="preserve">Acute: cardiogenic shock, pulmonary edema. Chronic: asymptomatic 10–15 years until decompensation; CHF (congestive heart failure) symptoms (exertional sinus tachycardia, exertional dyspnea, orthopnea, PND (paroxysmal nocturnal dyspnea), diaphoresis, anginal pain). High-pitched blowing murmur at 3rd ICS (intercostal space)/LUSB (left upper sternal border), radiates to apex, severity proportional to duration, displaced PMI (point of maximal impulse); decreased by Valsalva, standing; increased by squatting, sitting forward, handgrip. de Musset sign (head bobbing); Corrigan pulse (water hammer or collapsing pulse: very rapid upstroke then rapid collapse); bounding pulses, wide pulse pressure, thrills </w:t>
-      </w:r>
-      <w:r>
-        <w:rPr>
-          <w:b w:val="0"/>
-          <w:i w:val="0"/>
-        </w:rPr>
-        <w:t>Slides 26, 27, 28</w:t>
-      </w:r>
-      <w:r>
-        <w:rPr>
-          <w:b w:val="0"/>
-          <w:i w:val="0"/>
-        </w:rPr>
-        <w:t>Diagnosis</w:t>
-      </w:r>
-      <w:r>
-        <w:rPr>
-          <w:b w:val="0"/>
-          <w:i w:val="0"/>
-        </w:rPr>
-        <w:t xml:space="preserve">ECG (electrocardiogram): LVH (left ventricular hypertrophy) in chronic AR, non-specific; echo: diastolic fluttering of the anterior mitral leaflet from the regurgitant jet; catheterization definitive but not necessary. Severity: mild &lt;0.1 cm² / &lt;30 mL per beat / &lt;30% regurgitant fraction; moderate 0.10–0.29 / 30–59 / 30–49%; severe &gt;0.30 / &gt;60 / &gt;50% </w:t>
-      </w:r>
-      <w:r>
-        <w:rPr>
-          <w:b w:val="0"/>
-          <w:i w:val="0"/>
-        </w:rPr>
-        <w:t>Slides 29, 30</w:t>
-      </w:r>
-      <w:r>
-        <w:rPr>
-          <w:b w:val="0"/>
-          <w:i w:val="0"/>
-        </w:rPr>
-        <w:t>Treatment/Therapy</w:t>
-      </w:r>
-      <w:r>
-        <w:rPr>
-          <w:b w:val="0"/>
-          <w:i w:val="0"/>
-        </w:rPr>
-        <w:t xml:space="preserve">AR with HF with preserved ejection fraction or asymptomatic: afterload reduction (ACE inhibitor (angiotensin-converting enzyme inhibitor)/ARB (angiotensin receptor blocker), dihydropyridine calcium channel blockers, hydralazine). Acute severe AR: emergency valve replacement/repair (ideally &lt;24 h); if delayed, ICU IV diuretics plus nitroprusside and dobutamine. Chronic AR with mildly reduced or reduced ejection fraction (symptomatic or not): surgical candidate. Refer any audible murmur; dilated aortic root monitored by cardiology </w:t>
-      </w:r>
-      <w:r>
-        <w:rPr>
-          <w:b w:val="0"/>
-          <w:i w:val="0"/>
-        </w:rPr>
-        <w:t>Slides 31, 32</w:t>
-      </w:r>
-      <w:r>
-        <w:rPr>
-          <w:b w:val="0"/>
-          <w:i w:val="0"/>
-        </w:rPr>
-        <w:t>Mortality ★</w:t>
-      </w:r>
-      <w:r>
-        <w:rPr>
-          <w:b w:val="0"/>
-          <w:i w:val="0"/>
-        </w:rPr>
-        <w:t xml:space="preserve">"Survival rate 2–3 yrs" stated for chronic AR with mildly reduced or reduced ejection fraction (context unclear) </w:t>
-      </w:r>
-      <w:r>
-        <w:rPr>
-          <w:b w:val="0"/>
-          <w:i w:val="0"/>
-        </w:rPr>
-        <w:t>Slide 31</w:t>
+        <w:t>★ Severe = area under 1.0, mean gradient over 40, jet over 4 ("4, 40 and 1"); angina 5 / syncope 3 / heart failure 2 years; preload dependent</w:t>
       </w:r>
     </w:p>
     <w:p>
@@ -10008,23 +9596,6 @@
           <w:b w:val="0"/>
           <w:i w:val="0"/>
         </w:rPr>
-        <w:t>Mitral stenosis</w:t>
-      </w:r>
-      <w:r>
-        <w:rPr>
-          <w:b w:val="0"/>
-          <w:i w:val="0"/>
-        </w:rPr>
-        <w:t>1 not covered</w:t>
-      </w:r>
-      <w:r>
-        <w:br/>
-      </w:r>
-      <w:r>
-        <w:rPr>
-          <w:b w:val="0"/>
-          <w:i w:val="0"/>
-        </w:rPr>
         <w:t>Name of Condition</w:t>
       </w:r>
       <w:r>
@@ -10032,14 +9603,14 @@
           <w:b w:val="0"/>
           <w:i w:val="0"/>
         </w:rPr>
-        <w:t xml:space="preserve">Mitral stenosis (MS) </w:t>
-      </w:r>
-      <w:r>
-        <w:rPr>
-          <w:b w:val="0"/>
-          <w:i w:val="0"/>
-        </w:rPr>
-        <w:t>Slide 33</w:t>
+        <w:t xml:space="preserve">Aortic stenosis (AS) </w:t>
+      </w:r>
+      <w:r>
+        <w:rPr>
+          <w:b w:val="0"/>
+          <w:i w:val="0"/>
+        </w:rPr>
+        <w:t>Slide 11</w:t>
       </w:r>
       <w:r>
         <w:rPr>
@@ -10053,14 +9624,14 @@
           <w:b w:val="0"/>
           <w:i w:val="0"/>
         </w:rPr>
-        <w:t xml:space="preserve">Obstruction of left atrial outflow across the mitral valve </w:t>
-      </w:r>
-      <w:r>
-        <w:rPr>
-          <w:b w:val="0"/>
-          <w:i w:val="0"/>
-        </w:rPr>
-        <w:t>Slide 33</w:t>
+        <w:t xml:space="preserve">Obstruction of left ventricular outflow across the aortic valve; the most common valvular disease </w:t>
+      </w:r>
+      <w:r>
+        <w:rPr>
+          <w:b w:val="0"/>
+          <w:i w:val="0"/>
+        </w:rPr>
+        <w:t>Slide 11</w:t>
       </w:r>
       <w:r>
         <w:rPr>
@@ -10074,14 +9645,14 @@
           <w:b w:val="0"/>
           <w:i w:val="0"/>
         </w:rPr>
-        <w:t xml:space="preserve">Rheumatic heart disease: most common cause </w:t>
-      </w:r>
-      <w:r>
-        <w:rPr>
-          <w:b w:val="0"/>
-          <w:i w:val="0"/>
-        </w:rPr>
-        <w:t>Slide 34</w:t>
+        <w:t xml:space="preserve">Degenerative (atherosclerosis: hyperlipidemia, diabetes, smoking): most common cause over age 70; congenital bicuspid aortic valve: most common cause under 70; acquired: rheumatic heart disease (autoimmune reaction to group A beta-hemolytic streptococci), endocarditis </w:t>
+      </w:r>
+      <w:r>
+        <w:rPr>
+          <w:b w:val="0"/>
+          <w:i w:val="0"/>
+        </w:rPr>
+        <w:t>Slide 12</w:t>
       </w:r>
       <w:r>
         <w:rPr>
@@ -10095,14 +9666,14 @@
           <w:b w:val="0"/>
           <w:i w:val="0"/>
         </w:rPr>
-        <w:t xml:space="preserve">80% of MS due to rheumatic fever are women; usually diagnosed ~20 years after rheumatic fever; rare in developed countries (less rheumatic fever) </w:t>
-      </w:r>
-      <w:r>
-        <w:rPr>
-          <w:b w:val="0"/>
-          <w:i w:val="0"/>
-        </w:rPr>
-        <w:t>Slide 34</w:t>
+        <w:t xml:space="preserve">80% of symptomatic AS patients are men; present in 25% of patients over 65 and 35% over 70; 10–20% progress to significant AS within 10–15 years </w:t>
+      </w:r>
+      <w:r>
+        <w:rPr>
+          <w:b w:val="0"/>
+          <w:i w:val="0"/>
+        </w:rPr>
+        <w:t>Slide 13</w:t>
       </w:r>
       <w:r>
         <w:rPr>
@@ -10116,14 +9687,14 @@
           <w:b w:val="0"/>
           <w:i w:val="0"/>
         </w:rPr>
-        <w:t xml:space="preserve">Rheumatic fever </w:t>
-      </w:r>
-      <w:r>
-        <w:rPr>
-          <w:b w:val="0"/>
-          <w:i w:val="0"/>
-        </w:rPr>
-        <w:t>Slide 34</w:t>
+        <w:t xml:space="preserve">Hypertension; hyperlipidemia; smoking </w:t>
+      </w:r>
+      <w:r>
+        <w:rPr>
+          <w:b w:val="0"/>
+          <w:i w:val="0"/>
+        </w:rPr>
+        <w:t>Slide 13</w:t>
       </w:r>
       <w:r>
         <w:rPr>
@@ -10137,14 +9708,14 @@
           <w:b w:val="0"/>
           <w:i w:val="0"/>
         </w:rPr>
-        <w:t xml:space="preserve">Thickened, immobile leaflets narrow the orifice → raised LA (left atrial) size/pressure → AF (atrial fibrillation; thromboembolism risk) → pulmonary vasoconstriction, raised pulmonary artery pressure, RV (right ventricular) pressure overload → right HF (heart failure); HF with preserved ejection fraction </w:t>
-      </w:r>
-      <w:r>
-        <w:rPr>
-          <w:b w:val="0"/>
-          <w:i w:val="0"/>
-        </w:rPr>
-        <w:t>Slides 35, 36</w:t>
+        <w:t xml:space="preserve">LV (left ventricular) outflow obstruction → LV pressure overload → myocyte remodeling → concentric LVH (left ventricular hypertrophy) → diastolic HF (heart failure) with preserved ejection fraction </w:t>
+      </w:r>
+      <w:r>
+        <w:rPr>
+          <w:b w:val="0"/>
+          <w:i w:val="0"/>
+        </w:rPr>
+        <w:t>Slides 14, 15</w:t>
       </w:r>
       <w:r>
         <w:rPr>
@@ -10158,14 +9729,14 @@
           <w:b w:val="0"/>
           <w:i w:val="0"/>
         </w:rPr>
-        <w:t xml:space="preserve">Symptoms rare until orifice ~1/3 normal; left-sided HF symptoms (dyspnea on exertion, cough, orthopnea, paroxysmal nocturnal dyspnea, fatigue); hemoptysis (high LA pressure ruptures bronchial vein anastomoses); hoarseness, Ortner syndrome (enlarged LA compressing the left recurrent laryngeal nerve); dysphagia (LA on esophagus). Low-pitched decrescendo-crescendo rumbling diastolic murmur at apex, starting with an opening snap (sound after S2 as the stiff valve opens); bell, left lateral decubitus; increased by exertion and squatting/handgrip (the slide's Valsalva effect is contested; awaiting the lecture correction) </w:t>
-      </w:r>
-      <w:r>
-        <w:rPr>
-          <w:b w:val="0"/>
-          <w:i w:val="0"/>
-        </w:rPr>
-        <w:t>Slides 37, 38</w:t>
+        <w:t xml:space="preserve">Symptoms rare until orifice ~1 cm (normal 3–4 cm), age 60–80; insidious. Cardinal symptoms with survival: angina 5 y, syncope 3 y (both usually exertional), CHF (congestive heart failure)/exertional dyspnea 2 y (most common, worst prognosis). Harsh systolic ejection crescendo-decrescendo murmur at 2nd right ICS (intercostal space)/RUSB (right upper sternal border), radiates to carotids; decreased by Valsalva, standing, handgrip; increased by squatting, sitting forward. Forceful LV apex beat with delayed/weak carotid pulse suggests severe AS </w:t>
+      </w:r>
+      <w:r>
+        <w:rPr>
+          <w:b w:val="0"/>
+          <w:i w:val="0"/>
+        </w:rPr>
+        <w:t>Slides 16, 17, 22</w:t>
       </w:r>
       <w:r>
         <w:rPr>
@@ -10179,14 +9750,14 @@
           <w:b w:val="0"/>
           <w:i w:val="0"/>
         </w:rPr>
-        <w:t xml:space="preserve">ECG (electrocardiogram): LA abnormality, AF common in severe MS, RVH (right ventricular hypertrophy) with pulmonary hypertension; TTE (transthoracic echocardiogram): large LA, stenotic mitral valve; catheterization not necessary. Severity: mild 1.5–2.5 cm / &lt;5 mmHg / 1.0–1.5 m/s / proximal flow absent; moderate 1.0–1.5 / 6–10 / 1.5–3.0 / usually present; severe &lt;1.0 / &gt;10 / &gt;3.0 / always present. Dyspnea on exertion or orthopnea → echo </w:t>
-      </w:r>
-      <w:r>
-        <w:rPr>
-          <w:b w:val="0"/>
-          <w:i w:val="0"/>
-        </w:rPr>
-        <w:t>Slides 39, 40, 43</w:t>
+        <w:t xml:space="preserve">ECG (electrocardiogram): LVH in severe AS (low sensitivity); TTE (transthoracic echocardiogram): thickened, calcified leaflets, reduced systolic opening, LVH; TEE (transesophageal echocardiogram) useful for congenital; left heart catheterization definitive. Severe: area &lt;1.0 cm², mean gradient &gt;40 mmHg, jet velocity &gt;4.0 m/s; moderate area 1.0–1.5, gradient 25–40 mmHg, jet 3.0–4.0; mild area &gt;1.5, gradient &lt;25 mmHg, jet &lt;3.0. Exertional chest pressure, shortness of breath or syncope → echo </w:t>
+      </w:r>
+      <w:r>
+        <w:rPr>
+          <w:b w:val="0"/>
+          <w:i w:val="0"/>
+        </w:rPr>
+        <w:t>Slides 18, 19, 22</w:t>
       </w:r>
       <w:r>
         <w:rPr>
@@ -10200,14 +9771,14 @@
           <w:b w:val="0"/>
           <w:i w:val="0"/>
         </w:rPr>
-        <w:t xml:space="preserve">Asymptomatic in sinus rhythm: no therapy; dyspnea/orthopnea: loop diuretics (furosemide, bumetanide). Surgery if severe MS AND symptomatic dyspnea or pulmonary hypertension: percutaneous balloon valvotomy; valve replacement (moderate symptoms or pulmonary hypertension). Refer everyone with MS on echo </w:t>
-      </w:r>
-      <w:r>
-        <w:rPr>
-          <w:b w:val="0"/>
-          <w:i w:val="0"/>
-        </w:rPr>
-        <w:t>Slides 41, 42, 43</w:t>
+        <w:t xml:space="preserve">Medical therapy not effective (mild/moderate only); preload dependent: avoid strenuous activity/competitive sports, dehydration, hypovolemia; if hypertension avoid beta blockers and calcium channel blockers; if angina avoid nitrates. Surgery if severe AS AND symptomatic LV systolic dysfunction, or bicuspid valve: TAVR (transcatheter aortic valve replacement); mechanical valve (lifelong anticoagulation) vs biological (none); children/young adults: PABV (percutaneous aortic balloon valvuloplasty). Refer all AS on echo to cardiology </w:t>
+      </w:r>
+      <w:r>
+        <w:rPr>
+          <w:b w:val="0"/>
+          <w:i w:val="0"/>
+        </w:rPr>
+        <w:t>Slides 20, 21, 22</w:t>
       </w:r>
       <w:r>
         <w:rPr>
@@ -10221,7 +9792,14 @@
           <w:b w:val="0"/>
           <w:i w:val="0"/>
         </w:rPr>
-        <w:t>Not covered in the lecture</w:t>
+        <w:t xml:space="preserve">Symptomatic AS 3-year mortality 75%; prognosis severely worsens once symptomatic; survival after onset: angina 5 y, syncope 3 y, CHF 2 y; average age of death 63 (graph) </w:t>
+      </w:r>
+      <w:r>
+        <w:rPr>
+          <w:b w:val="0"/>
+          <w:i w:val="0"/>
+        </w:rPr>
+        <w:t>Slides 16, 22</w:t>
       </w:r>
     </w:p>
     <w:p>
@@ -10233,206 +9811,21 @@
           <w:b w:val="0"/>
           <w:i w:val="0"/>
         </w:rPr>
-        <w:t>Mitral regurgitation</w:t>
-      </w:r>
-      <w:r>
-        <w:rPr>
-          <w:b w:val="0"/>
-          <w:i w:val="0"/>
-        </w:rPr>
-        <w:t>3 not covered</w:t>
-      </w:r>
-      <w:r>
-        <w:br/>
-      </w:r>
-      <w:r>
-        <w:rPr>
-          <w:b w:val="0"/>
-          <w:i w:val="0"/>
-        </w:rPr>
-        <w:t>Name of Condition</w:t>
-      </w:r>
-      <w:r>
-        <w:rPr>
-          <w:b w:val="0"/>
-          <w:i w:val="0"/>
-        </w:rPr>
-        <w:t xml:space="preserve">Mitral regurgitation / insufficiency (MR) </w:t>
-      </w:r>
-      <w:r>
-        <w:rPr>
-          <w:b w:val="0"/>
-          <w:i w:val="0"/>
-        </w:rPr>
-        <w:t>Slide 44</w:t>
-      </w:r>
-      <w:r>
-        <w:rPr>
-          <w:b w:val="0"/>
-          <w:i w:val="0"/>
-        </w:rPr>
-        <w:t>Definition</w:t>
-      </w:r>
-      <w:r>
-        <w:rPr>
-          <w:b w:val="0"/>
-          <w:i w:val="0"/>
-        </w:rPr>
-        <w:t xml:space="preserve">Backflow (regurgitation/insufficiency) through the mitral valve, the valve that regulates flow from the LA (left atrium) to the LV (left ventricle) </w:t>
-      </w:r>
-      <w:r>
-        <w:rPr>
-          <w:b w:val="0"/>
-          <w:i w:val="0"/>
-        </w:rPr>
-        <w:t>Slide 44</w:t>
-      </w:r>
-      <w:r>
-        <w:rPr>
-          <w:b w:val="0"/>
-          <w:i w:val="0"/>
-        </w:rPr>
-        <w:t>Etiology (cause)</w:t>
-      </w:r>
-      <w:r>
-        <w:rPr>
-          <w:b w:val="0"/>
-          <w:i w:val="0"/>
-        </w:rPr>
-        <w:t xml:space="preserve">Acute: MI (myocardial infarction) with papillary muscle rupture, infective endocarditis, rheumatic fever, chordae tendineae rupture, acute LV dilation (myocarditis/ischemia), prosthetic mitral valve failure. Chronic: MVP (mitral valve prolapse), infective endocarditis, rheumatic fever, HOCM (hypertrophic obstructive cardiomyopathy), dilated cardiomyopathy </w:t>
-      </w:r>
-      <w:r>
-        <w:rPr>
-          <w:b w:val="0"/>
-          <w:i w:val="0"/>
-        </w:rPr>
-        <w:t>Slide 45</w:t>
-      </w:r>
-      <w:r>
-        <w:rPr>
-          <w:b w:val="0"/>
-          <w:i w:val="0"/>
-        </w:rPr>
-        <w:t>Epidemiology (who)</w:t>
-      </w:r>
-      <w:r>
-        <w:rPr>
-          <w:b w:val="0"/>
-          <w:i w:val="0"/>
-        </w:rPr>
-        <w:t>Not covered in the lecture</w:t>
-      </w:r>
-      <w:r>
-        <w:rPr>
-          <w:b w:val="0"/>
-          <w:i w:val="0"/>
-        </w:rPr>
-        <w:t>Risk Factors</w:t>
-      </w:r>
-      <w:r>
-        <w:rPr>
-          <w:b w:val="0"/>
-          <w:i w:val="0"/>
-        </w:rPr>
-        <w:t>Not covered in the lecture</w:t>
-      </w:r>
-      <w:r>
-        <w:rPr>
-          <w:b w:val="0"/>
-          <w:i w:val="0"/>
-        </w:rPr>
-        <w:t>Pathology</w:t>
-      </w:r>
-      <w:r>
-        <w:rPr>
-          <w:b w:val="0"/>
-          <w:i w:val="0"/>
-        </w:rPr>
-        <w:t xml:space="preserve">Systolic backflow into LA → LA dilation with pressure/volume overload → LV dilation with eccentric hypertrophy (systolic HF (heart failure)). Acute MR: reduced LA/LV pressures avoid right HF; chronic → right HF → HF with reduced ejection fraction → combined right and left HF </w:t>
-      </w:r>
-      <w:r>
-        <w:rPr>
-          <w:b w:val="0"/>
-          <w:i w:val="0"/>
-        </w:rPr>
-        <w:t>Slides 46, 47</w:t>
-      </w:r>
-      <w:r>
-        <w:rPr>
-          <w:b w:val="0"/>
-          <w:i w:val="0"/>
-        </w:rPr>
-        <w:t>Clinical Manifestation</w:t>
-      </w:r>
-      <w:r>
-        <w:rPr>
-          <w:b w:val="0"/>
-          <w:i w:val="0"/>
-        </w:rPr>
-        <w:t xml:space="preserve">Mild–moderate isolated MR usually asymptomatic; palpitations; acute: left-HF symptoms (dyspnea, fatigue, orthopnea, paroxysmal nocturnal dyspnea, rales, elevated JVP (jugular venous pressure), leg edema); chronic → left HF → pulmonary hypertension → combined HF. Holosystolic blowing murmur at apex, best in left lateral decubitus, radiates to axilla, ± S3, ± thrill; increased by squatting, handgrip; decreased by standing, Valsalva </w:t>
-      </w:r>
-      <w:r>
-        <w:rPr>
-          <w:b w:val="0"/>
-          <w:i w:val="0"/>
-        </w:rPr>
-        <w:t>Slides 47, 48</w:t>
-      </w:r>
-      <w:r>
-        <w:rPr>
-          <w:b w:val="0"/>
-          <w:i w:val="0"/>
-        </w:rPr>
-        <w:t>Diagnosis</w:t>
-      </w:r>
-      <w:r>
-        <w:rPr>
-          <w:b w:val="0"/>
-          <w:i w:val="0"/>
-        </w:rPr>
-        <w:t xml:space="preserve">ECG (electrocardiogram): LA enlargement, LVH (left ventricular hypertrophy) in severe MR (low sensitivity); TTE (transthoracic echocardiogram): regurgitant flow, LVH, LA enlargement; left heart catheterization not required. Severity: mild &lt;0.20 cm² / &lt;30 mL / &lt;30% regurgitant fraction; moderate 0.20–0.39 / 30–59 / 30–49%; severe &gt;0.40 / &gt;60 / &gt;50% </w:t>
-      </w:r>
-      <w:r>
-        <w:rPr>
-          <w:b w:val="0"/>
-          <w:i w:val="0"/>
-        </w:rPr>
-        <w:t>Slides 49, 50</w:t>
-      </w:r>
-      <w:r>
-        <w:rPr>
-          <w:b w:val="0"/>
-          <w:i w:val="0"/>
-        </w:rPr>
-        <w:t>Treatment/Therapy</w:t>
-      </w:r>
-      <w:r>
-        <w:rPr>
-          <w:b w:val="0"/>
-          <w:i w:val="0"/>
-        </w:rPr>
-        <w:t xml:space="preserve">Medical: increase forward cardiac output while reducing regurgitant volume; treat comorbid AF (atrial fibrillation) and pulmonary hypertension. Surgery for severe MR, symptomatic LV systolic dysfunction, ejection fraction &lt;60%, LV end-systolic dimension &gt;40 mm: mitral valve clip, TMVR (transcatheter mitral valve replacement), mechanical valve (lifelong anticoagulation) vs biological (none) </w:t>
-      </w:r>
-      <w:r>
-        <w:rPr>
-          <w:b w:val="0"/>
-          <w:i w:val="0"/>
-        </w:rPr>
-        <w:t>Slides 51, 52</w:t>
-      </w:r>
-      <w:r>
-        <w:rPr>
-          <w:b w:val="0"/>
-          <w:i w:val="0"/>
-        </w:rPr>
-        <w:t>Mortality ★</w:t>
-      </w:r>
-      <w:r>
-        <w:rPr>
-          <w:b w:val="0"/>
-          <w:i w:val="0"/>
-        </w:rPr>
-        <w:t>Not covered in the lecture</w:t>
+        <w:t>Aortic regurgitation</w:t>
+      </w:r>
+      <w:r>
+        <w:rPr>
+          <w:b w:val="0"/>
+          <w:i w:val="0"/>
+        </w:rPr>
+        <w:t>★ Professor emphasized</w:t>
+      </w:r>
+      <w:r>
+        <w:rPr>
+          <w:b w:val="0"/>
+          <w:i w:val="0"/>
+        </w:rPr>
+        <w:t>2 not covered</w:t>
       </w:r>
     </w:p>
     <w:p>
@@ -10444,213 +9837,7 @@
           <w:b w:val="0"/>
           <w:i w:val="0"/>
         </w:rPr>
-        <w:t>Mitral valve prolapse</w:t>
-      </w:r>
-      <w:r>
-        <w:rPr>
-          <w:b w:val="0"/>
-          <w:i w:val="0"/>
-        </w:rPr>
-        <w:t>2 not covered</w:t>
-      </w:r>
-      <w:r>
-        <w:br/>
-      </w:r>
-      <w:r>
-        <w:rPr>
-          <w:b w:val="0"/>
-          <w:i w:val="0"/>
-        </w:rPr>
-        <w:t>Name of Condition</w:t>
-      </w:r>
-      <w:r>
-        <w:rPr>
-          <w:b w:val="0"/>
-          <w:i w:val="0"/>
-        </w:rPr>
-        <w:t xml:space="preserve">Mitral valve prolapse (MVP) </w:t>
-      </w:r>
-      <w:r>
-        <w:rPr>
-          <w:b w:val="0"/>
-          <w:i w:val="0"/>
-        </w:rPr>
-        <w:t>Slide 54</w:t>
-      </w:r>
-      <w:r>
-        <w:rPr>
-          <w:b w:val="0"/>
-          <w:i w:val="0"/>
-        </w:rPr>
-        <w:t>Definition</w:t>
-      </w:r>
-      <w:r>
-        <w:rPr>
-          <w:b w:val="0"/>
-          <w:i w:val="0"/>
-        </w:rPr>
-        <w:t xml:space="preserve">Flaring of the mitral valve leaflets into the left atrium during systole </w:t>
-      </w:r>
-      <w:r>
-        <w:rPr>
-          <w:b w:val="0"/>
-          <w:i w:val="0"/>
-        </w:rPr>
-        <w:t>Slide 54</w:t>
-      </w:r>
-      <w:r>
-        <w:rPr>
-          <w:b w:val="0"/>
-          <w:i w:val="0"/>
-        </w:rPr>
-        <w:t>Etiology (cause)</w:t>
-      </w:r>
-      <w:r>
-        <w:rPr>
-          <w:b w:val="0"/>
-          <w:i w:val="0"/>
-        </w:rPr>
-        <w:t xml:space="preserve">Myxomatous degeneration of the mitral valve </w:t>
-      </w:r>
-      <w:r>
-        <w:rPr>
-          <w:b w:val="0"/>
-          <w:i w:val="0"/>
-        </w:rPr>
-        <w:t>Slide 54</w:t>
-      </w:r>
-      <w:r>
-        <w:rPr>
-          <w:b w:val="0"/>
-          <w:i w:val="0"/>
-        </w:rPr>
-        <w:t>Epidemiology (who)</w:t>
-      </w:r>
-      <w:r>
-        <w:rPr>
-          <w:b w:val="0"/>
-          <w:i w:val="0"/>
-        </w:rPr>
-        <w:t xml:space="preserve">Usually healthy women 15–30 years old </w:t>
-      </w:r>
-      <w:r>
-        <w:rPr>
-          <w:b w:val="0"/>
-          <w:i w:val="0"/>
-        </w:rPr>
-        <w:t>Slide 54</w:t>
-      </w:r>
-      <w:r>
-        <w:rPr>
-          <w:b w:val="0"/>
-          <w:i w:val="0"/>
-        </w:rPr>
-        <w:t>Risk Factors</w:t>
-      </w:r>
-      <w:r>
-        <w:rPr>
-          <w:b w:val="0"/>
-          <w:i w:val="0"/>
-        </w:rPr>
-        <w:t>Not covered in the lecture</w:t>
-      </w:r>
-      <w:r>
-        <w:rPr>
-          <w:b w:val="0"/>
-          <w:i w:val="0"/>
-        </w:rPr>
-        <w:t>Pathology</w:t>
-      </w:r>
-      <w:r>
-        <w:rPr>
-          <w:b w:val="0"/>
-          <w:i w:val="0"/>
-        </w:rPr>
-        <w:t xml:space="preserve">Contested on the slides; awaiting the lecture correction </w:t>
-      </w:r>
-      <w:r>
-        <w:rPr>
-          <w:b w:val="0"/>
-          <w:i w:val="0"/>
-        </w:rPr>
-        <w:t>Slide 54</w:t>
-      </w:r>
-      <w:r>
-        <w:rPr>
-          <w:b w:val="0"/>
-          <w:i w:val="0"/>
-        </w:rPr>
-        <w:t>Clinical Manifestation</w:t>
-      </w:r>
-      <w:r>
-        <w:rPr>
-          <w:b w:val="0"/>
-          <w:i w:val="0"/>
-        </w:rPr>
-        <w:t xml:space="preserve">Usually benign and asymptomatic; mid-systolic click at the apex; may develop MR (mitral regurgitation) symptoms and signs </w:t>
-      </w:r>
-      <w:r>
-        <w:rPr>
-          <w:b w:val="0"/>
-          <w:i w:val="0"/>
-        </w:rPr>
-        <w:t>Slide 54</w:t>
-      </w:r>
-      <w:r>
-        <w:rPr>
-          <w:b w:val="0"/>
-          <w:i w:val="0"/>
-        </w:rPr>
-        <w:t>Diagnosis</w:t>
-      </w:r>
-      <w:r>
-        <w:rPr>
-          <w:b w:val="0"/>
-          <w:i w:val="0"/>
-        </w:rPr>
-        <w:t xml:space="preserve">Echocardiogram: thickened, redundant mitral leaflets (&gt;5 mm) </w:t>
-      </w:r>
-      <w:r>
-        <w:rPr>
-          <w:b w:val="0"/>
-          <w:i w:val="0"/>
-        </w:rPr>
-        <w:t>Slide 54</w:t>
-      </w:r>
-      <w:r>
-        <w:rPr>
-          <w:b w:val="0"/>
-          <w:i w:val="0"/>
-        </w:rPr>
-        <w:t>Treatment/Therapy</w:t>
-      </w:r>
-      <w:r>
-        <w:rPr>
-          <w:b w:val="0"/>
-          <w:i w:val="0"/>
-        </w:rPr>
-        <w:t xml:space="preserve">Usually none; if it progresses to MR: clip, TMVR (transcatheter mitral valve replacement), biological or mechanical replacement </w:t>
-      </w:r>
-      <w:r>
-        <w:rPr>
-          <w:b w:val="0"/>
-          <w:i w:val="0"/>
-        </w:rPr>
-        <w:t>Slide 54</w:t>
-      </w:r>
-      <w:r>
-        <w:rPr>
-          <w:b w:val="0"/>
-          <w:i w:val="0"/>
-        </w:rPr>
-        <w:t>Mortality ★</w:t>
-      </w:r>
-      <w:r>
-        <w:rPr>
-          <w:b w:val="0"/>
-          <w:i w:val="0"/>
-        </w:rPr>
-        <w:t>Not covered in the lecture</w:t>
+        <w:t>★ Corrigan pulse goes with aortic regurgitation; severe = regurgitant fraction 50% or more; the murmur is diastolic (slide 28 corrected in class)</w:t>
       </w:r>
     </w:p>
     <w:p>
@@ -10662,23 +9849,6 @@
           <w:b w:val="0"/>
           <w:i w:val="0"/>
         </w:rPr>
-        <w:t>Pulmonic stenosis</w:t>
-      </w:r>
-      <w:r>
-        <w:rPr>
-          <w:b w:val="0"/>
-          <w:i w:val="0"/>
-        </w:rPr>
-        <w:t>2 not covered</w:t>
-      </w:r>
-      <w:r>
-        <w:br/>
-      </w:r>
-      <w:r>
-        <w:rPr>
-          <w:b w:val="0"/>
-          <w:i w:val="0"/>
-        </w:rPr>
         <w:t>Name of Condition</w:t>
       </w:r>
       <w:r>
@@ -10686,14 +9856,14 @@
           <w:b w:val="0"/>
           <w:i w:val="0"/>
         </w:rPr>
-        <w:t xml:space="preserve">Pulmonic stenosis (PS) </w:t>
-      </w:r>
-      <w:r>
-        <w:rPr>
-          <w:b w:val="0"/>
-          <w:i w:val="0"/>
-        </w:rPr>
-        <w:t>Slide 55</w:t>
+        <w:t xml:space="preserve">Aortic regurgitation / insufficiency (AR) </w:t>
+      </w:r>
+      <w:r>
+        <w:rPr>
+          <w:b w:val="0"/>
+          <w:i w:val="0"/>
+        </w:rPr>
+        <w:t>Slide 23</w:t>
       </w:r>
       <w:r>
         <w:rPr>
@@ -10707,14 +9877,14 @@
           <w:b w:val="0"/>
           <w:i w:val="0"/>
         </w:rPr>
-        <w:t xml:space="preserve">Right ventricular outflow obstruction of blood to the lungs </w:t>
-      </w:r>
-      <w:r>
-        <w:rPr>
-          <w:b w:val="0"/>
-          <w:i w:val="0"/>
-        </w:rPr>
-        <w:t>Slide 55</w:t>
+        <w:t xml:space="preserve">Incomplete aortic valve closure causing blood to flow back into the LV (left ventricle) </w:t>
+      </w:r>
+      <w:r>
+        <w:rPr>
+          <w:b w:val="0"/>
+          <w:i w:val="0"/>
+        </w:rPr>
+        <w:t>Slide 23</w:t>
       </w:r>
       <w:r>
         <w:rPr>
@@ -10728,14 +9898,14 @@
           <w:b w:val="0"/>
           <w:i w:val="0"/>
         </w:rPr>
-        <w:t xml:space="preserve">Almost always congenital; carcinoid disease; commonly part of tetralogy of Fallot </w:t>
-      </w:r>
-      <w:r>
-        <w:rPr>
-          <w:b w:val="0"/>
-          <w:i w:val="0"/>
-        </w:rPr>
-        <w:t>Slide 55</w:t>
+        <w:t xml:space="preserve">Valve disease, aortic root disease or both. Valvular: congenital bicuspid, endocarditis, rheumatic fever, myxomatous (collagen), trauma, syphilis, ankylosing spondylitis. Root: aortic dissection, cystic medial degeneration, Marfan syndrome, nonsyndromic familial aneurysm, aortitis, hypertension. Acute AR: myocardial infarction, endocarditis, aortic dissection, trauma </w:t>
+      </w:r>
+      <w:r>
+        <w:rPr>
+          <w:b w:val="0"/>
+          <w:i w:val="0"/>
+        </w:rPr>
+        <w:t>Slides 24, 26</w:t>
       </w:r>
       <w:r>
         <w:rPr>
@@ -10777,14 +9947,14 @@
           <w:b w:val="0"/>
           <w:i w:val="0"/>
         </w:rPr>
-        <w:t xml:space="preserve">Increased RV (right ventricular) pressure → RV pressure overload → RVH (right ventricular hypertrophy; diastolic failure); RV volume overload → dilated right HF (heart failure; systolic failure) </w:t>
-      </w:r>
-      <w:r>
-        <w:rPr>
-          <w:b w:val="0"/>
-          <w:i w:val="0"/>
-        </w:rPr>
-        <w:t>Slide 56</w:t>
+        <w:t xml:space="preserve">Incomplete closure → diastolic backflow into LV → eccentric hypertrophy and dilation → LV dilation (systolic HF (heart failure)) → HF with reduced ejection fraction </w:t>
+      </w:r>
+      <w:r>
+        <w:rPr>
+          <w:b w:val="0"/>
+          <w:i w:val="0"/>
+        </w:rPr>
+        <w:t>Slide 25</w:t>
       </w:r>
       <w:r>
         <w:rPr>
@@ -10798,14 +9968,14 @@
           <w:b w:val="0"/>
           <w:i w:val="0"/>
         </w:rPr>
-        <w:t xml:space="preserve">Mild–moderate usually asymptomatic; severe: right-HF symptoms (exertional dyspnea, fatigue, angina, syncope). Harsh high-pitched crescendo-decrescendo mid-systolic ejection murmur at left 2nd–4th ICS (intercostal space)/LUSB (left upper sternal border), increases with inspiration; split S2. Late: right HF, hepatomegaly, ascites, edema </w:t>
-      </w:r>
-      <w:r>
-        <w:rPr>
-          <w:b w:val="0"/>
-          <w:i w:val="0"/>
-        </w:rPr>
-        <w:t>Slide 57</w:t>
+        <w:t xml:space="preserve">Acute: cardiogenic shock, pulmonary edema. Chronic: asymptomatic 10–15 years until decompensation; CHF (congestive heart failure) symptoms (exertional sinus tachycardia, exertional dyspnea, orthopnea, PND (paroxysmal nocturnal dyspnea), diaphoresis, anginal pain). High-pitched blowing DIASTOLIC murmur (slide 28's "Holosystolic" struck in class) at 3rd ICS (intercostal space)/LUSB (left upper sternal border), radiates to apex, severity proportional to duration, displaced PMI (point of maximal impulse); decreased by Valsalva, standing; increased by squatting, sitting forward, handgrip. de Musset sign (head bobbing); Corrigan pulse (water hammer or collapsing pulse: very rapid upstroke then rapid collapse); bounding pulses, wide pulse pressure, thrills </w:t>
+      </w:r>
+      <w:r>
+        <w:rPr>
+          <w:b w:val="0"/>
+          <w:i w:val="0"/>
+        </w:rPr>
+        <w:t>Slides 26, 27, 28</w:t>
       </w:r>
       <w:r>
         <w:rPr>
@@ -10819,14 +9989,14 @@
           <w:b w:val="0"/>
           <w:i w:val="0"/>
         </w:rPr>
-        <w:t xml:space="preserve">ECG (electrocardiogram): right axis deviation, RVH; echo: abnormal valve motion, increased peak jet on Doppler. Mild &lt;3 m/s and &lt;36 mmHg; moderate 3–4 m/s and 36–60; severe &gt;4 m/s and &gt;60 </w:t>
-      </w:r>
-      <w:r>
-        <w:rPr>
-          <w:b w:val="0"/>
-          <w:i w:val="0"/>
-        </w:rPr>
-        <w:t>Slide 58</w:t>
+        <w:t xml:space="preserve">ECG (electrocardiogram): LVH (left ventricular hypertrophy) in chronic AR, non-specific; echo: determines the cause of AR (aortic root dilation, aortic dissection; slide 29's "MR" corrected to AR in class); which leaflet flutters on echo is unsettled and not keyed; catheterization definitive but not necessary. Severity: severe = regurgitant fraction 50% or more (moderate 30–49%, mild &lt;30%) </w:t>
+      </w:r>
+      <w:r>
+        <w:rPr>
+          <w:b w:val="0"/>
+          <w:i w:val="0"/>
+        </w:rPr>
+        <w:t>Slides 29, 30</w:t>
       </w:r>
       <w:r>
         <w:rPr>
@@ -10840,14 +10010,14 @@
           <w:b w:val="0"/>
           <w:i w:val="0"/>
         </w:rPr>
-        <w:t xml:space="preserve">Mild–moderate: none. Severe with symptoms: diuretics for right-HF symptoms, pulmonic balloon valvuloplasty; severe congenital may need replacement. Refer to cardiology if seen on echo </w:t>
-      </w:r>
-      <w:r>
-        <w:rPr>
-          <w:b w:val="0"/>
-          <w:i w:val="0"/>
-        </w:rPr>
-        <w:t>Slide 59</w:t>
+        <w:t xml:space="preserve">AR with HF with preserved ejection fraction or asymptomatic: afterload reduction (ACE inhibitor (angiotensin-converting enzyme inhibitor)/ARB (angiotensin receptor blocker), dihydropyridine calcium channel blockers, hydralazine). Acute severe AR: emergency valve replacement/repair (ideally &lt;24 h); if delayed, ICU IV (intravenous) diuretics plus nitroprusside (the slide also lists dobutamine as a "vasodilator"; it is an inotrope). Chronic AR with mildly reduced or reduced ejection fraction (symptomatic or not): surgical candidate. Refer any audible murmur; dilated aortic root monitored by cardiology </w:t>
+      </w:r>
+      <w:r>
+        <w:rPr>
+          <w:b w:val="0"/>
+          <w:i w:val="0"/>
+        </w:rPr>
+        <w:t>Slides 31, 32</w:t>
       </w:r>
       <w:r>
         <w:rPr>
@@ -10861,14 +10031,14 @@
           <w:b w:val="0"/>
           <w:i w:val="0"/>
         </w:rPr>
-        <w:t xml:space="preserve">Mild–moderate: 94% 20-year survival </w:t>
-      </w:r>
-      <w:r>
-        <w:rPr>
-          <w:b w:val="0"/>
-          <w:i w:val="0"/>
-        </w:rPr>
-        <w:t>Slide 59</w:t>
+        <w:t xml:space="preserve">Untreated severe AR with mildly reduced or reduced ejection fraction: survival 2–3 years (clarified in the lecture) </w:t>
+      </w:r>
+      <w:r>
+        <w:rPr>
+          <w:b w:val="0"/>
+          <w:i w:val="0"/>
+        </w:rPr>
+        <w:t>Slide 31</w:t>
       </w:r>
     </w:p>
     <w:p>
@@ -10880,206 +10050,21 @@
           <w:b w:val="0"/>
           <w:i w:val="0"/>
         </w:rPr>
-        <w:t>Pulmonic regurgitation</w:t>
-      </w:r>
-      <w:r>
-        <w:rPr>
-          <w:b w:val="0"/>
-          <w:i w:val="0"/>
-        </w:rPr>
-        <w:t>3 not covered</w:t>
-      </w:r>
-      <w:r>
-        <w:br/>
-      </w:r>
-      <w:r>
-        <w:rPr>
-          <w:b w:val="0"/>
-          <w:i w:val="0"/>
-        </w:rPr>
-        <w:t>Name of Condition</w:t>
-      </w:r>
-      <w:r>
-        <w:rPr>
-          <w:b w:val="0"/>
-          <w:i w:val="0"/>
-        </w:rPr>
-        <w:t xml:space="preserve">Pulmonic regurgitation / insufficiency (PR) </w:t>
-      </w:r>
-      <w:r>
-        <w:rPr>
-          <w:b w:val="0"/>
-          <w:i w:val="0"/>
-        </w:rPr>
-        <w:t>Slide 60</w:t>
-      </w:r>
-      <w:r>
-        <w:rPr>
-          <w:b w:val="0"/>
-          <w:i w:val="0"/>
-        </w:rPr>
-        <w:t>Definition</w:t>
-      </w:r>
-      <w:r>
-        <w:rPr>
-          <w:b w:val="0"/>
-          <w:i w:val="0"/>
-        </w:rPr>
-        <w:t xml:space="preserve">Incomplete pulmonic valve closure causing blood to flow back into the RV (right ventricle) </w:t>
-      </w:r>
-      <w:r>
-        <w:rPr>
-          <w:b w:val="0"/>
-          <w:i w:val="0"/>
-        </w:rPr>
-        <w:t>Slide 60</w:t>
-      </w:r>
-      <w:r>
-        <w:rPr>
-          <w:b w:val="0"/>
-          <w:i w:val="0"/>
-        </w:rPr>
-        <w:t>Etiology (cause)</w:t>
-      </w:r>
-      <w:r>
-        <w:rPr>
-          <w:b w:val="0"/>
-          <w:i w:val="0"/>
-        </w:rPr>
-        <w:t xml:space="preserve">High-pressure cause: pulmonary hypertension. Low-pressure causes: congenital (bicuspid); carcinoid disease; iatrogenic (after surgical valvotomy/valvectomy/valvuloplasty for RV outflow obstruction). Which cause is most common is contested on the slides </w:t>
-      </w:r>
-      <w:r>
-        <w:rPr>
-          <w:b w:val="0"/>
-          <w:i w:val="0"/>
-        </w:rPr>
-        <w:t>Slide 61</w:t>
-      </w:r>
-      <w:r>
-        <w:rPr>
-          <w:b w:val="0"/>
-          <w:i w:val="0"/>
-        </w:rPr>
-        <w:t>Epidemiology (who)</w:t>
-      </w:r>
-      <w:r>
-        <w:rPr>
-          <w:b w:val="0"/>
-          <w:i w:val="0"/>
-        </w:rPr>
-        <w:t>Not covered in the lecture</w:t>
-      </w:r>
-      <w:r>
-        <w:rPr>
-          <w:b w:val="0"/>
-          <w:i w:val="0"/>
-        </w:rPr>
-        <w:t>Risk Factors</w:t>
-      </w:r>
-      <w:r>
-        <w:rPr>
-          <w:b w:val="0"/>
-          <w:i w:val="0"/>
-        </w:rPr>
-        <w:t>Not covered in the lecture</w:t>
-      </w:r>
-      <w:r>
-        <w:rPr>
-          <w:b w:val="0"/>
-          <w:i w:val="0"/>
-        </w:rPr>
-        <w:t>Pathology</w:t>
-      </w:r>
-      <w:r>
-        <w:rPr>
-          <w:b w:val="0"/>
-          <w:i w:val="0"/>
-        </w:rPr>
-        <w:t xml:space="preserve">Retrograde flow from the pulmonary artery → RV overload </w:t>
-      </w:r>
-      <w:r>
-        <w:rPr>
-          <w:b w:val="0"/>
-          <w:i w:val="0"/>
-        </w:rPr>
-        <w:t>Slide 62</w:t>
-      </w:r>
-      <w:r>
-        <w:rPr>
-          <w:b w:val="0"/>
-          <w:i w:val="0"/>
-        </w:rPr>
-        <w:t>Clinical Manifestation</w:t>
-      </w:r>
-      <w:r>
-        <w:rPr>
-          <w:b w:val="0"/>
-          <w:i w:val="0"/>
-        </w:rPr>
-        <w:t xml:space="preserve">Right-sided HF (heart failure): fatigue, peripheral edema, JVD (jugular venous distension), ascites. Brief high-pitched decrescendo early diastolic murmur at 2nd left ICS (intercostal space), radiating to mid right sternal border with full inspiration (Graham Steell murmur); louder with more venous return (inspiration, squatting, supine), softer with less (expiration, standing) </w:t>
-      </w:r>
-      <w:r>
-        <w:rPr>
-          <w:b w:val="0"/>
-          <w:i w:val="0"/>
-        </w:rPr>
-        <w:t>Slides 62, 63</w:t>
-      </w:r>
-      <w:r>
-        <w:rPr>
-          <w:b w:val="0"/>
-          <w:i w:val="0"/>
-        </w:rPr>
-        <w:t>Diagnosis</w:t>
-      </w:r>
-      <w:r>
-        <w:rPr>
-          <w:b w:val="0"/>
-          <w:i w:val="0"/>
-        </w:rPr>
-        <w:t xml:space="preserve">Usually an incidental finding on echocardiogram or physical exam </w:t>
-      </w:r>
-      <w:r>
-        <w:rPr>
-          <w:b w:val="0"/>
-          <w:i w:val="0"/>
-        </w:rPr>
-        <w:t>Slide 64</w:t>
-      </w:r>
-      <w:r>
-        <w:rPr>
-          <w:b w:val="0"/>
-          <w:i w:val="0"/>
-        </w:rPr>
-        <w:t>Treatment/Therapy</w:t>
-      </w:r>
-      <w:r>
-        <w:rPr>
-          <w:b w:val="0"/>
-          <w:i w:val="0"/>
-        </w:rPr>
-        <w:t xml:space="preserve">Treat the underlying condition; refer when seen on echo or with right-HF symptoms/signs </w:t>
-      </w:r>
-      <w:r>
-        <w:rPr>
-          <w:b w:val="0"/>
-          <w:i w:val="0"/>
-        </w:rPr>
-        <w:t>Slide 64</w:t>
-      </w:r>
-      <w:r>
-        <w:rPr>
-          <w:b w:val="0"/>
-          <w:i w:val="0"/>
-        </w:rPr>
-        <w:t>Mortality ★</w:t>
-      </w:r>
-      <w:r>
-        <w:rPr>
-          <w:b w:val="0"/>
-          <w:i w:val="0"/>
-        </w:rPr>
-        <w:t>Not covered in the lecture</w:t>
+        <w:t>Mitral stenosis</w:t>
+      </w:r>
+      <w:r>
+        <w:rPr>
+          <w:b w:val="0"/>
+          <w:i w:val="0"/>
+        </w:rPr>
+        <w:t>★ Professor emphasized</w:t>
+      </w:r>
+      <w:r>
+        <w:rPr>
+          <w:b w:val="0"/>
+          <w:i w:val="0"/>
+        </w:rPr>
+        <w:t>1 not covered</w:t>
       </w:r>
     </w:p>
     <w:p>
@@ -11091,213 +10076,7 @@
           <w:b w:val="0"/>
           <w:i w:val="0"/>
         </w:rPr>
-        <w:t>Tricuspid stenosis</w:t>
-      </w:r>
-      <w:r>
-        <w:rPr>
-          <w:b w:val="0"/>
-          <w:i w:val="0"/>
-        </w:rPr>
-        <w:t>2 not covered</w:t>
-      </w:r>
-      <w:r>
-        <w:br/>
-      </w:r>
-      <w:r>
-        <w:rPr>
-          <w:b w:val="0"/>
-          <w:i w:val="0"/>
-        </w:rPr>
-        <w:t>Name of Condition</w:t>
-      </w:r>
-      <w:r>
-        <w:rPr>
-          <w:b w:val="0"/>
-          <w:i w:val="0"/>
-        </w:rPr>
-        <w:t xml:space="preserve">Tricuspid stenosis (TS) </w:t>
-      </w:r>
-      <w:r>
-        <w:rPr>
-          <w:b w:val="0"/>
-          <w:i w:val="0"/>
-        </w:rPr>
-        <w:t>Slide 65</w:t>
-      </w:r>
-      <w:r>
-        <w:rPr>
-          <w:b w:val="0"/>
-          <w:i w:val="0"/>
-        </w:rPr>
-        <w:t>Definition</w:t>
-      </w:r>
-      <w:r>
-        <w:rPr>
-          <w:b w:val="0"/>
-          <w:i w:val="0"/>
-        </w:rPr>
-        <w:t xml:space="preserve">Right ventricular inflow obstruction; narrowed tricuspid valve (the valve between the RA (right atrium) and RV (right ventricle)) </w:t>
-      </w:r>
-      <w:r>
-        <w:rPr>
-          <w:b w:val="0"/>
-          <w:i w:val="0"/>
-        </w:rPr>
-        <w:t>Slides 65, 66</w:t>
-      </w:r>
-      <w:r>
-        <w:rPr>
-          <w:b w:val="0"/>
-          <w:i w:val="0"/>
-        </w:rPr>
-        <w:t>Etiology (cause)</w:t>
-      </w:r>
-      <w:r>
-        <w:rPr>
-          <w:b w:val="0"/>
-          <w:i w:val="0"/>
-        </w:rPr>
-        <w:t xml:space="preserve">Most commonly rheumatic fever worldwide; in the US almost always congenital; carcinoid disease </w:t>
-      </w:r>
-      <w:r>
-        <w:rPr>
-          <w:b w:val="0"/>
-          <w:i w:val="0"/>
-        </w:rPr>
-        <w:t>Slide 65</w:t>
-      </w:r>
-      <w:r>
-        <w:rPr>
-          <w:b w:val="0"/>
-          <w:i w:val="0"/>
-        </w:rPr>
-        <w:t>Epidemiology (who)</w:t>
-      </w:r>
-      <w:r>
-        <w:rPr>
-          <w:b w:val="0"/>
-          <w:i w:val="0"/>
-        </w:rPr>
-        <w:t xml:space="preserve">Most common in women </w:t>
-      </w:r>
-      <w:r>
-        <w:rPr>
-          <w:b w:val="0"/>
-          <w:i w:val="0"/>
-        </w:rPr>
-        <w:t>Slide 65</w:t>
-      </w:r>
-      <w:r>
-        <w:rPr>
-          <w:b w:val="0"/>
-          <w:i w:val="0"/>
-        </w:rPr>
-        <w:t>Risk Factors</w:t>
-      </w:r>
-      <w:r>
-        <w:rPr>
-          <w:b w:val="0"/>
-          <w:i w:val="0"/>
-        </w:rPr>
-        <w:t>Not covered in the lecture</w:t>
-      </w:r>
-      <w:r>
-        <w:rPr>
-          <w:b w:val="0"/>
-          <w:i w:val="0"/>
-        </w:rPr>
-        <w:t>Pathology</w:t>
-      </w:r>
-      <w:r>
-        <w:rPr>
-          <w:b w:val="0"/>
-          <w:i w:val="0"/>
-        </w:rPr>
-        <w:t xml:space="preserve">Narrowed tricuspid valve → obstructed RA-to-RV inflow → RA dilation and hypertrophy, low cardiac output, portal congestion → right HF (heart failure) without RV dysfunction </w:t>
-      </w:r>
-      <w:r>
-        <w:rPr>
-          <w:b w:val="0"/>
-          <w:i w:val="0"/>
-        </w:rPr>
-        <w:t>Slide 66</w:t>
-      </w:r>
-      <w:r>
-        <w:rPr>
-          <w:b w:val="0"/>
-          <w:i w:val="0"/>
-        </w:rPr>
-        <w:t>Clinical Manifestation</w:t>
-      </w:r>
-      <w:r>
-        <w:rPr>
-          <w:b w:val="0"/>
-          <w:i w:val="0"/>
-        </w:rPr>
-        <w:t xml:space="preserve">Mild–moderate usually asymptomatic; severe: fluttering discomfort in the neck, cold skin (low cardiac output), RUQ (right upper quadrant) pain (enlarged liver). Soft opening snap and mid-diastolic rumble at left lower sternal border near the xiphoid, increases with inspiration; JVD (jugular venous distension); suffusion sign (dusky face with dilated scalp veins when supine) </w:t>
-      </w:r>
-      <w:r>
-        <w:rPr>
-          <w:b w:val="0"/>
-          <w:i w:val="0"/>
-        </w:rPr>
-        <w:t>Slide 67</w:t>
-      </w:r>
-      <w:r>
-        <w:rPr>
-          <w:b w:val="0"/>
-          <w:i w:val="0"/>
-        </w:rPr>
-        <w:t>Diagnosis</w:t>
-      </w:r>
-      <w:r>
-        <w:rPr>
-          <w:b w:val="0"/>
-          <w:i w:val="0"/>
-        </w:rPr>
-        <w:t xml:space="preserve">ECG (electrocardiogram): RA enlargement out of proportion to RVH (right ventricular hypertrophy); echo: abnormal valve motion, increased peak jet. Mild &lt;3 m/s and &lt;36 mmHg; moderate 3–4 and 36–64; severe &gt;4 and &gt;64 </w:t>
-      </w:r>
-      <w:r>
-        <w:rPr>
-          <w:b w:val="0"/>
-          <w:i w:val="0"/>
-        </w:rPr>
-        <w:t>Slide 68</w:t>
-      </w:r>
-      <w:r>
-        <w:rPr>
-          <w:b w:val="0"/>
-          <w:i w:val="0"/>
-        </w:rPr>
-        <w:t>Treatment/Therapy</w:t>
-      </w:r>
-      <w:r>
-        <w:rPr>
-          <w:b w:val="0"/>
-          <w:i w:val="0"/>
-        </w:rPr>
-        <w:t xml:space="preserve">Severe with symptoms: low salt, diuretics, aldosterone antagonist; bioprosthetic valve replacement preferred; balloon valvotomy and repair reserved for hepatic congestion that may lead to cirrhosis or severe systemic venous congestion. Refer if seen on echo or HF symptoms </w:t>
-      </w:r>
-      <w:r>
-        <w:rPr>
-          <w:b w:val="0"/>
-          <w:i w:val="0"/>
-        </w:rPr>
-        <w:t>Slide 69</w:t>
-      </w:r>
-      <w:r>
-        <w:rPr>
-          <w:b w:val="0"/>
-          <w:i w:val="0"/>
-        </w:rPr>
-        <w:t>Mortality ★</w:t>
-      </w:r>
-      <w:r>
-        <w:rPr>
-          <w:b w:val="0"/>
-          <w:i w:val="0"/>
-        </w:rPr>
-        <w:t>Not covered in the lecture</w:t>
+        <w:t>★ Left atrial enlargement → atrial fibrillation (most patients with an affected left atrium); rheumatic heart disease most common cause</w:t>
       </w:r>
     </w:p>
     <w:p>
@@ -11309,23 +10088,6 @@
           <w:b w:val="0"/>
           <w:i w:val="0"/>
         </w:rPr>
-        <w:t>Tricuspid regurgitation</w:t>
-      </w:r>
-      <w:r>
-        <w:rPr>
-          <w:b w:val="0"/>
-          <w:i w:val="0"/>
-        </w:rPr>
-        <w:t>2 not covered</w:t>
-      </w:r>
-      <w:r>
-        <w:br/>
-      </w:r>
-      <w:r>
-        <w:rPr>
-          <w:b w:val="0"/>
-          <w:i w:val="0"/>
-        </w:rPr>
         <w:t>Name of Condition</w:t>
       </w:r>
       <w:r>
@@ -11333,14 +10095,14 @@
           <w:b w:val="0"/>
           <w:i w:val="0"/>
         </w:rPr>
-        <w:t xml:space="preserve">Tricuspid regurgitation / insufficiency (TR) </w:t>
-      </w:r>
-      <w:r>
-        <w:rPr>
-          <w:b w:val="0"/>
-          <w:i w:val="0"/>
-        </w:rPr>
-        <w:t>Slide 70</w:t>
+        <w:t xml:space="preserve">Mitral stenosis (MS) </w:t>
+      </w:r>
+      <w:r>
+        <w:rPr>
+          <w:b w:val="0"/>
+          <w:i w:val="0"/>
+        </w:rPr>
+        <w:t>Slide 33</w:t>
       </w:r>
       <w:r>
         <w:rPr>
@@ -11354,14 +10116,14 @@
           <w:b w:val="0"/>
           <w:i w:val="0"/>
         </w:rPr>
-        <w:t xml:space="preserve">Incomplete closure causing blood to flow from the RV (right ventricle) back into the RA (right atrium) </w:t>
-      </w:r>
-      <w:r>
-        <w:rPr>
-          <w:b w:val="0"/>
-          <w:i w:val="0"/>
-        </w:rPr>
-        <w:t>Slide 70</w:t>
+        <w:t xml:space="preserve">Obstruction of left atrial outflow across the mitral valve </w:t>
+      </w:r>
+      <w:r>
+        <w:rPr>
+          <w:b w:val="0"/>
+          <w:i w:val="0"/>
+        </w:rPr>
+        <w:t>Slide 33</w:t>
       </w:r>
       <w:r>
         <w:rPr>
@@ -11375,14 +10137,14 @@
           <w:b w:val="0"/>
           <w:i w:val="0"/>
         </w:rPr>
-        <w:t xml:space="preserve">Most commonly tricuspid annulus dilation from RV dilation in pulmonary hypertension; primary: infective endocarditis in IV (intravenous) drug users </w:t>
-      </w:r>
-      <w:r>
-        <w:rPr>
-          <w:b w:val="0"/>
-          <w:i w:val="0"/>
-        </w:rPr>
-        <w:t>Slide 70</w:t>
+        <w:t xml:space="preserve">Rheumatic heart disease: most common cause </w:t>
+      </w:r>
+      <w:r>
+        <w:rPr>
+          <w:b w:val="0"/>
+          <w:i w:val="0"/>
+        </w:rPr>
+        <w:t>Slide 34</w:t>
       </w:r>
       <w:r>
         <w:rPr>
@@ -11396,14 +10158,14 @@
           <w:b w:val="0"/>
           <w:i w:val="0"/>
         </w:rPr>
-        <w:t xml:space="preserve">IV drug users (primary TR from endocarditis) </w:t>
-      </w:r>
-      <w:r>
-        <w:rPr>
-          <w:b w:val="0"/>
-          <w:i w:val="0"/>
-        </w:rPr>
-        <w:t>Slide 70</w:t>
+        <w:t xml:space="preserve">80% of MS due to rheumatic fever are women; usually diagnosed ~20 years after rheumatic fever; rare in developed countries (less rheumatic fever) </w:t>
+      </w:r>
+      <w:r>
+        <w:rPr>
+          <w:b w:val="0"/>
+          <w:i w:val="0"/>
+        </w:rPr>
+        <w:t>Slide 34</w:t>
       </w:r>
       <w:r>
         <w:rPr>
@@ -11417,14 +10179,14 @@
           <w:b w:val="0"/>
           <w:i w:val="0"/>
         </w:rPr>
-        <w:t xml:space="preserve">Pulmonary hypertension; IV drug use </w:t>
-      </w:r>
-      <w:r>
-        <w:rPr>
-          <w:b w:val="0"/>
-          <w:i w:val="0"/>
-        </w:rPr>
-        <w:t>Slide 70</w:t>
+        <w:t xml:space="preserve">Rheumatic fever </w:t>
+      </w:r>
+      <w:r>
+        <w:rPr>
+          <w:b w:val="0"/>
+          <w:i w:val="0"/>
+        </w:rPr>
+        <w:t>Slide 34</w:t>
       </w:r>
       <w:r>
         <w:rPr>
@@ -11438,7 +10200,14 @@
           <w:b w:val="0"/>
           <w:i w:val="0"/>
         </w:rPr>
-        <w:t>Not covered in the lecture</w:t>
+        <w:t xml:space="preserve">Thickened, immobile leaflets narrow the orifice → raised LA (left atrial) size/pressure → AF (atrial fibrillation; thromboembolism risk) → pulmonary vasoconstriction, raised pulmonary artery pressure, RV (right ventricular) pressure overload → right HF (heart failure); HF with preserved ejection fraction </w:t>
+      </w:r>
+      <w:r>
+        <w:rPr>
+          <w:b w:val="0"/>
+          <w:i w:val="0"/>
+        </w:rPr>
+        <w:t>Slides 35, 36</w:t>
       </w:r>
       <w:r>
         <w:rPr>
@@ -11452,14 +10221,14 @@
           <w:b w:val="0"/>
           <w:i w:val="0"/>
         </w:rPr>
-        <w:t xml:space="preserve">Mild–moderate usually asymptomatic; severe: pedal edema, ascites. Holosystolic murmur at left mid/lower sternal border near the epigastrium; increases with inspiration (Carvallo sign: inspiratory increase in a right-sided murmur), which distinguishes it from MR (mitral regurgitation); elevated JVP (jugular venous pressure) with neck pulsations; venous thrill on the right jugular vein </w:t>
-      </w:r>
-      <w:r>
-        <w:rPr>
-          <w:b w:val="0"/>
-          <w:i w:val="0"/>
-        </w:rPr>
-        <w:t>Slides 71, 9</w:t>
+        <w:t xml:space="preserve">Symptoms rare until orifice ~1/3 normal; left-sided HF symptoms (dyspnea on exertion, cough, orthopnea, paroxysmal nocturnal dyspnea, fatigue); hemoptysis (high LA pressure ruptures bronchial vein anastomoses); hoarseness, Ortner syndrome (enlarged LA compressing the left recurrent laryngeal nerve); dysphagia (LA on esophagus). Low-pitched decrescendo-crescendo rumbling diastolic murmur at apex, starting with an opening snap (sound after S2 as the stiff valve opens); bell, left lateral decubitus; maneuver effects not keyed (slide 38's Valsalva line is contested and was not addressed in the lecture) </w:t>
+      </w:r>
+      <w:r>
+        <w:rPr>
+          <w:b w:val="0"/>
+          <w:i w:val="0"/>
+        </w:rPr>
+        <w:t>Slides 37, 38</w:t>
       </w:r>
       <w:r>
         <w:rPr>
@@ -11473,14 +10242,14 @@
           <w:b w:val="0"/>
           <w:i w:val="0"/>
         </w:rPr>
-        <w:t xml:space="preserve">Echocardiogram Doppler: regurgitation; prolapsed, scarred or displaced leaflets </w:t>
-      </w:r>
-      <w:r>
-        <w:rPr>
-          <w:b w:val="0"/>
-          <w:i w:val="0"/>
-        </w:rPr>
-        <w:t>Slide 72</w:t>
+        <w:t xml:space="preserve">ECG (electrocardiogram): LA abnormality, AF common in severe MS, RVH (right ventricular hypertrophy) with pulmonary hypertension; TTE (transthoracic echocardiogram): large LA, stenotic mitral valve; catheterization not necessary. Severe: area &lt;1.0 cm², mean gradient &gt;10 mmHg, peak velocity &gt;3.0 m/s, proximal flow always present (the slide's mild and moderate bands overlap at 1.5 and are not keyed). Dyspnea on exertion or orthopnea → echo </w:t>
+      </w:r>
+      <w:r>
+        <w:rPr>
+          <w:b w:val="0"/>
+          <w:i w:val="0"/>
+        </w:rPr>
+        <w:t>Slides 39, 40, 43</w:t>
       </w:r>
       <w:r>
         <w:rPr>
@@ -11494,14 +10263,14 @@
           <w:b w:val="0"/>
           <w:i w:val="0"/>
         </w:rPr>
-        <w:t xml:space="preserve">Treat the underlying condition; annuloplasty if due to annular dilation; valve repair or replacement if primary cause. Refer when identified on echo or with right heart failure symptoms </w:t>
-      </w:r>
-      <w:r>
-        <w:rPr>
-          <w:b w:val="0"/>
-          <w:i w:val="0"/>
-        </w:rPr>
-        <w:t>Slide 72</w:t>
+        <w:t xml:space="preserve">Asymptomatic in sinus rhythm: no therapy; dyspnea/orthopnea: loop diuretics (furosemide, bumetanide). Surgery if severe MS AND symptomatic dyspnea or pulmonary hypertension: percutaneous balloon valvotomy; valve replacement (moderate symptoms or pulmonary hypertension). Refer everyone with MS on echo </w:t>
+      </w:r>
+      <w:r>
+        <w:rPr>
+          <w:b w:val="0"/>
+          <w:i w:val="0"/>
+        </w:rPr>
+        <w:t>Slides 41, 42, 43</w:t>
       </w:r>
       <w:r>
         <w:rPr>
@@ -11527,6 +10296,1342 @@
           <w:b w:val="0"/>
           <w:i w:val="0"/>
         </w:rPr>
+        <w:t>Mitral regurgitation</w:t>
+      </w:r>
+      <w:r>
+        <w:rPr>
+          <w:b w:val="0"/>
+          <w:i w:val="0"/>
+        </w:rPr>
+        <w:t>3 not covered</w:t>
+      </w:r>
+      <w:r>
+        <w:br/>
+      </w:r>
+      <w:r>
+        <w:rPr>
+          <w:b w:val="0"/>
+          <w:i w:val="0"/>
+        </w:rPr>
+        <w:t>Name of Condition</w:t>
+      </w:r>
+      <w:r>
+        <w:rPr>
+          <w:b w:val="0"/>
+          <w:i w:val="0"/>
+        </w:rPr>
+        <w:t xml:space="preserve">Mitral regurgitation / insufficiency (MR) </w:t>
+      </w:r>
+      <w:r>
+        <w:rPr>
+          <w:b w:val="0"/>
+          <w:i w:val="0"/>
+        </w:rPr>
+        <w:t>Slide 44</w:t>
+      </w:r>
+      <w:r>
+        <w:rPr>
+          <w:b w:val="0"/>
+          <w:i w:val="0"/>
+        </w:rPr>
+        <w:t>Definition</w:t>
+      </w:r>
+      <w:r>
+        <w:rPr>
+          <w:b w:val="0"/>
+          <w:i w:val="0"/>
+        </w:rPr>
+        <w:t xml:space="preserve">Incomplete mitral valve closure causing blood to flow back into the LA (left atrium) during systole (slide 44 mislabels this line "Mitral Stenosis") </w:t>
+      </w:r>
+      <w:r>
+        <w:rPr>
+          <w:b w:val="0"/>
+          <w:i w:val="0"/>
+        </w:rPr>
+        <w:t>Slide 44</w:t>
+      </w:r>
+      <w:r>
+        <w:rPr>
+          <w:b w:val="0"/>
+          <w:i w:val="0"/>
+        </w:rPr>
+        <w:t>Etiology (cause)</w:t>
+      </w:r>
+      <w:r>
+        <w:rPr>
+          <w:b w:val="0"/>
+          <w:i w:val="0"/>
+        </w:rPr>
+        <w:t xml:space="preserve">Acute: MI (myocardial infarction) with papillary muscle rupture, infective endocarditis, rheumatic fever, chordae tendineae rupture, acute LV dilation (myocarditis/ischemia), prosthetic mitral valve failure. Chronic: MVP (mitral valve prolapse), infective endocarditis, rheumatic fever, HOCM (hypertrophic obstructive cardiomyopathy), dilated cardiomyopathy </w:t>
+      </w:r>
+      <w:r>
+        <w:rPr>
+          <w:b w:val="0"/>
+          <w:i w:val="0"/>
+        </w:rPr>
+        <w:t>Slide 45</w:t>
+      </w:r>
+      <w:r>
+        <w:rPr>
+          <w:b w:val="0"/>
+          <w:i w:val="0"/>
+        </w:rPr>
+        <w:t>Epidemiology (who)</w:t>
+      </w:r>
+      <w:r>
+        <w:rPr>
+          <w:b w:val="0"/>
+          <w:i w:val="0"/>
+        </w:rPr>
+        <w:t>Not covered in the lecture</w:t>
+      </w:r>
+      <w:r>
+        <w:rPr>
+          <w:b w:val="0"/>
+          <w:i w:val="0"/>
+        </w:rPr>
+        <w:t>Risk Factors</w:t>
+      </w:r>
+      <w:r>
+        <w:rPr>
+          <w:b w:val="0"/>
+          <w:i w:val="0"/>
+        </w:rPr>
+        <w:t>Not covered in the lecture</w:t>
+      </w:r>
+      <w:r>
+        <w:rPr>
+          <w:b w:val="0"/>
+          <w:i w:val="0"/>
+        </w:rPr>
+        <w:t>Pathology</w:t>
+      </w:r>
+      <w:r>
+        <w:rPr>
+          <w:b w:val="0"/>
+          <w:i w:val="0"/>
+        </w:rPr>
+        <w:t xml:space="preserve">Systolic backflow into LA → LA dilation with pressure/volume overload → LV dilation with eccentric hypertrophy (systolic HF (heart failure)). Acute MR: reduced LA/LV pressures avoid right HF; chronic → right HF → HF with reduced ejection fraction → combined right and left HF </w:t>
+      </w:r>
+      <w:r>
+        <w:rPr>
+          <w:b w:val="0"/>
+          <w:i w:val="0"/>
+        </w:rPr>
+        <w:t>Slides 46, 47</w:t>
+      </w:r>
+      <w:r>
+        <w:rPr>
+          <w:b w:val="0"/>
+          <w:i w:val="0"/>
+        </w:rPr>
+        <w:t>Clinical Manifestation</w:t>
+      </w:r>
+      <w:r>
+        <w:rPr>
+          <w:b w:val="0"/>
+          <w:i w:val="0"/>
+        </w:rPr>
+        <w:t xml:space="preserve">Mild–moderate isolated MR usually asymptomatic; palpitations; acute: left-HF symptoms (dyspnea, fatigue, orthopnea, paroxysmal nocturnal dyspnea, rales, elevated JVP (jugular venous pressure), leg edema); chronic → left HF → pulmonary hypertension → combined HF. Holosystolic blowing murmur at apex, best in left lateral decubitus, radiates to axilla, ± S3, ± thrill; increased by squatting, handgrip; decreased by standing, Valsalva </w:t>
+      </w:r>
+      <w:r>
+        <w:rPr>
+          <w:b w:val="0"/>
+          <w:i w:val="0"/>
+        </w:rPr>
+        <w:t>Slides 47, 48</w:t>
+      </w:r>
+      <w:r>
+        <w:rPr>
+          <w:b w:val="0"/>
+          <w:i w:val="0"/>
+        </w:rPr>
+        <w:t>Diagnosis</w:t>
+      </w:r>
+      <w:r>
+        <w:rPr>
+          <w:b w:val="0"/>
+          <w:i w:val="0"/>
+        </w:rPr>
+        <w:t xml:space="preserve">ECG (electrocardiogram): LA enlargement, LVH (left ventricular hypertrophy) in severe MR (low sensitivity); TTE (transthoracic echocardiogram): regurgitant flow, LVH, LA enlargement; left heart catheterization not required. Severity: severe = regurgitant fraction 50% or more (moderate 30–49%, mild &lt;30%) </w:t>
+      </w:r>
+      <w:r>
+        <w:rPr>
+          <w:b w:val="0"/>
+          <w:i w:val="0"/>
+        </w:rPr>
+        <w:t>Slides 49, 50</w:t>
+      </w:r>
+      <w:r>
+        <w:rPr>
+          <w:b w:val="0"/>
+          <w:i w:val="0"/>
+        </w:rPr>
+        <w:t>Treatment/Therapy</w:t>
+      </w:r>
+      <w:r>
+        <w:rPr>
+          <w:b w:val="0"/>
+          <w:i w:val="0"/>
+        </w:rPr>
+        <w:t xml:space="preserve">Medical: increase forward cardiac output while reducing regurgitant volume; treat comorbid AF (atrial fibrillation) and pulmonary hypertension. Surgery for severe MR, symptomatic LV systolic dysfunction, ejection fraction &lt;60%, LV end-systolic dimension &gt;40 mm: mitral valve clip, TMVR (transcatheter mitral valve replacement), mechanical valve (lifelong anticoagulation) vs biological (none) </w:t>
+      </w:r>
+      <w:r>
+        <w:rPr>
+          <w:b w:val="0"/>
+          <w:i w:val="0"/>
+        </w:rPr>
+        <w:t>Slides 51, 52</w:t>
+      </w:r>
+      <w:r>
+        <w:rPr>
+          <w:b w:val="0"/>
+          <w:i w:val="0"/>
+        </w:rPr>
+        <w:t>Mortality ★</w:t>
+      </w:r>
+      <w:r>
+        <w:rPr>
+          <w:b w:val="0"/>
+          <w:i w:val="0"/>
+        </w:rPr>
+        <w:t>Not covered in the lecture</w:t>
+      </w:r>
+    </w:p>
+    <w:p>
+      <w:pPr>
+        <w:spacing w:after="120"/>
+      </w:pPr>
+      <w:r>
+        <w:rPr>
+          <w:b w:val="0"/>
+          <w:i w:val="0"/>
+        </w:rPr>
+        <w:t>Mitral valve prolapse</w:t>
+      </w:r>
+      <w:r>
+        <w:rPr>
+          <w:b w:val="0"/>
+          <w:i w:val="0"/>
+        </w:rPr>
+        <w:t>2 not covered</w:t>
+      </w:r>
+      <w:r>
+        <w:br/>
+      </w:r>
+      <w:r>
+        <w:rPr>
+          <w:b w:val="0"/>
+          <w:i w:val="0"/>
+        </w:rPr>
+        <w:t>Name of Condition</w:t>
+      </w:r>
+      <w:r>
+        <w:rPr>
+          <w:b w:val="0"/>
+          <w:i w:val="0"/>
+        </w:rPr>
+        <w:t xml:space="preserve">Mitral valve prolapse (MVP) </w:t>
+      </w:r>
+      <w:r>
+        <w:rPr>
+          <w:b w:val="0"/>
+          <w:i w:val="0"/>
+        </w:rPr>
+        <w:t>Slide 54</w:t>
+      </w:r>
+      <w:r>
+        <w:rPr>
+          <w:b w:val="0"/>
+          <w:i w:val="0"/>
+        </w:rPr>
+        <w:t>Definition</w:t>
+      </w:r>
+      <w:r>
+        <w:rPr>
+          <w:b w:val="0"/>
+          <w:i w:val="0"/>
+        </w:rPr>
+        <w:t xml:space="preserve">Flaring of the mitral valve leaflets into the left atrium during systole </w:t>
+      </w:r>
+      <w:r>
+        <w:rPr>
+          <w:b w:val="0"/>
+          <w:i w:val="0"/>
+        </w:rPr>
+        <w:t>Slide 54</w:t>
+      </w:r>
+      <w:r>
+        <w:rPr>
+          <w:b w:val="0"/>
+          <w:i w:val="0"/>
+        </w:rPr>
+        <w:t>Etiology (cause)</w:t>
+      </w:r>
+      <w:r>
+        <w:rPr>
+          <w:b w:val="0"/>
+          <w:i w:val="0"/>
+        </w:rPr>
+        <w:t xml:space="preserve">Myxomatous degeneration of the mitral valve </w:t>
+      </w:r>
+      <w:r>
+        <w:rPr>
+          <w:b w:val="0"/>
+          <w:i w:val="0"/>
+        </w:rPr>
+        <w:t>Slide 54</w:t>
+      </w:r>
+      <w:r>
+        <w:rPr>
+          <w:b w:val="0"/>
+          <w:i w:val="0"/>
+        </w:rPr>
+        <w:t>Epidemiology (who)</w:t>
+      </w:r>
+      <w:r>
+        <w:rPr>
+          <w:b w:val="0"/>
+          <w:i w:val="0"/>
+        </w:rPr>
+        <w:t xml:space="preserve">Usually healthy women 15–30 years old </w:t>
+      </w:r>
+      <w:r>
+        <w:rPr>
+          <w:b w:val="0"/>
+          <w:i w:val="0"/>
+        </w:rPr>
+        <w:t>Slide 54</w:t>
+      </w:r>
+      <w:r>
+        <w:rPr>
+          <w:b w:val="0"/>
+          <w:i w:val="0"/>
+        </w:rPr>
+        <w:t>Risk Factors</w:t>
+      </w:r>
+      <w:r>
+        <w:rPr>
+          <w:b w:val="0"/>
+          <w:i w:val="0"/>
+        </w:rPr>
+        <w:t>Not covered in the lecture</w:t>
+      </w:r>
+      <w:r>
+        <w:rPr>
+          <w:b w:val="0"/>
+          <w:i w:val="0"/>
+        </w:rPr>
+        <w:t>Pathology</w:t>
+      </w:r>
+      <w:r>
+        <w:rPr>
+          <w:b w:val="0"/>
+          <w:i w:val="0"/>
+        </w:rPr>
+        <w:t xml:space="preserve">Congenital condition (slide 54; endorsed in the lecture: "because you were born that way") </w:t>
+      </w:r>
+      <w:r>
+        <w:rPr>
+          <w:b w:val="0"/>
+          <w:i w:val="0"/>
+        </w:rPr>
+        <w:t>Slide 54</w:t>
+      </w:r>
+      <w:r>
+        <w:rPr>
+          <w:b w:val="0"/>
+          <w:i w:val="0"/>
+        </w:rPr>
+        <w:t>Clinical Manifestation</w:t>
+      </w:r>
+      <w:r>
+        <w:rPr>
+          <w:b w:val="0"/>
+          <w:i w:val="0"/>
+        </w:rPr>
+        <w:t xml:space="preserve">Usually benign and asymptomatic; mid-systolic click at the apex; may develop MR (mitral regurgitation) symptoms and signs </w:t>
+      </w:r>
+      <w:r>
+        <w:rPr>
+          <w:b w:val="0"/>
+          <w:i w:val="0"/>
+        </w:rPr>
+        <w:t>Slide 54</w:t>
+      </w:r>
+      <w:r>
+        <w:rPr>
+          <w:b w:val="0"/>
+          <w:i w:val="0"/>
+        </w:rPr>
+        <w:t>Diagnosis</w:t>
+      </w:r>
+      <w:r>
+        <w:rPr>
+          <w:b w:val="0"/>
+          <w:i w:val="0"/>
+        </w:rPr>
+        <w:t xml:space="preserve">Echocardiogram: thickened, redundant mitral leaflets (&gt;5 mm) </w:t>
+      </w:r>
+      <w:r>
+        <w:rPr>
+          <w:b w:val="0"/>
+          <w:i w:val="0"/>
+        </w:rPr>
+        <w:t>Slide 54</w:t>
+      </w:r>
+      <w:r>
+        <w:rPr>
+          <w:b w:val="0"/>
+          <w:i w:val="0"/>
+        </w:rPr>
+        <w:t>Treatment/Therapy</w:t>
+      </w:r>
+      <w:r>
+        <w:rPr>
+          <w:b w:val="0"/>
+          <w:i w:val="0"/>
+        </w:rPr>
+        <w:t xml:space="preserve">Usually none; if it progresses to MR: clip, TMVR (transcatheter mitral valve replacement), biological or mechanical replacement </w:t>
+      </w:r>
+      <w:r>
+        <w:rPr>
+          <w:b w:val="0"/>
+          <w:i w:val="0"/>
+        </w:rPr>
+        <w:t>Slide 54</w:t>
+      </w:r>
+      <w:r>
+        <w:rPr>
+          <w:b w:val="0"/>
+          <w:i w:val="0"/>
+        </w:rPr>
+        <w:t>Mortality ★</w:t>
+      </w:r>
+      <w:r>
+        <w:rPr>
+          <w:b w:val="0"/>
+          <w:i w:val="0"/>
+        </w:rPr>
+        <w:t>Not covered in the lecture</w:t>
+      </w:r>
+    </w:p>
+    <w:p>
+      <w:pPr>
+        <w:spacing w:after="120"/>
+      </w:pPr>
+      <w:r>
+        <w:rPr>
+          <w:b w:val="0"/>
+          <w:i w:val="0"/>
+        </w:rPr>
+        <w:t>Pulmonic stenosis</w:t>
+      </w:r>
+      <w:r>
+        <w:rPr>
+          <w:b w:val="0"/>
+          <w:i w:val="0"/>
+        </w:rPr>
+        <w:t>2 not covered</w:t>
+      </w:r>
+      <w:r>
+        <w:br/>
+      </w:r>
+      <w:r>
+        <w:rPr>
+          <w:b w:val="0"/>
+          <w:i w:val="0"/>
+        </w:rPr>
+        <w:t>Name of Condition</w:t>
+      </w:r>
+      <w:r>
+        <w:rPr>
+          <w:b w:val="0"/>
+          <w:i w:val="0"/>
+        </w:rPr>
+        <w:t xml:space="preserve">Pulmonic stenosis (PS) </w:t>
+      </w:r>
+      <w:r>
+        <w:rPr>
+          <w:b w:val="0"/>
+          <w:i w:val="0"/>
+        </w:rPr>
+        <w:t>Slide 55</w:t>
+      </w:r>
+      <w:r>
+        <w:rPr>
+          <w:b w:val="0"/>
+          <w:i w:val="0"/>
+        </w:rPr>
+        <w:t>Definition</w:t>
+      </w:r>
+      <w:r>
+        <w:rPr>
+          <w:b w:val="0"/>
+          <w:i w:val="0"/>
+        </w:rPr>
+        <w:t xml:space="preserve">Right ventricular outflow obstruction of blood to the lungs </w:t>
+      </w:r>
+      <w:r>
+        <w:rPr>
+          <w:b w:val="0"/>
+          <w:i w:val="0"/>
+        </w:rPr>
+        <w:t>Slide 55</w:t>
+      </w:r>
+      <w:r>
+        <w:rPr>
+          <w:b w:val="0"/>
+          <w:i w:val="0"/>
+        </w:rPr>
+        <w:t>Etiology (cause)</w:t>
+      </w:r>
+      <w:r>
+        <w:rPr>
+          <w:b w:val="0"/>
+          <w:i w:val="0"/>
+        </w:rPr>
+        <w:t xml:space="preserve">Almost always congenital; carcinoid disease; commonly part of tetralogy of Fallot </w:t>
+      </w:r>
+      <w:r>
+        <w:rPr>
+          <w:b w:val="0"/>
+          <w:i w:val="0"/>
+        </w:rPr>
+        <w:t>Slide 55</w:t>
+      </w:r>
+      <w:r>
+        <w:rPr>
+          <w:b w:val="0"/>
+          <w:i w:val="0"/>
+        </w:rPr>
+        <w:t>Epidemiology (who)</w:t>
+      </w:r>
+      <w:r>
+        <w:rPr>
+          <w:b w:val="0"/>
+          <w:i w:val="0"/>
+        </w:rPr>
+        <w:t>Not covered in the lecture</w:t>
+      </w:r>
+      <w:r>
+        <w:rPr>
+          <w:b w:val="0"/>
+          <w:i w:val="0"/>
+        </w:rPr>
+        <w:t>Risk Factors</w:t>
+      </w:r>
+      <w:r>
+        <w:rPr>
+          <w:b w:val="0"/>
+          <w:i w:val="0"/>
+        </w:rPr>
+        <w:t>Not covered in the lecture</w:t>
+      </w:r>
+      <w:r>
+        <w:rPr>
+          <w:b w:val="0"/>
+          <w:i w:val="0"/>
+        </w:rPr>
+        <w:t>Pathology</w:t>
+      </w:r>
+      <w:r>
+        <w:rPr>
+          <w:b w:val="0"/>
+          <w:i w:val="0"/>
+        </w:rPr>
+        <w:t xml:space="preserve">Increased RV (right ventricular) pressure → RV pressure overload → RVH (right ventricular hypertrophy; diastolic failure); RV volume overload → dilated right HF (heart failure; systolic failure) </w:t>
+      </w:r>
+      <w:r>
+        <w:rPr>
+          <w:b w:val="0"/>
+          <w:i w:val="0"/>
+        </w:rPr>
+        <w:t>Slide 56</w:t>
+      </w:r>
+      <w:r>
+        <w:rPr>
+          <w:b w:val="0"/>
+          <w:i w:val="0"/>
+        </w:rPr>
+        <w:t>Clinical Manifestation</w:t>
+      </w:r>
+      <w:r>
+        <w:rPr>
+          <w:b w:val="0"/>
+          <w:i w:val="0"/>
+        </w:rPr>
+        <w:t xml:space="preserve">Mild–moderate usually asymptomatic; severe: right-HF symptoms (exertional dyspnea, fatigue, angina, syncope). Harsh high-pitched crescendo-decrescendo mid-systolic ejection murmur at left 2nd–4th ICS (intercostal space)/LUSB (left upper sternal border), increases with inspiration; split S2. Late: right HF, hepatomegaly, ascites, edema </w:t>
+      </w:r>
+      <w:r>
+        <w:rPr>
+          <w:b w:val="0"/>
+          <w:i w:val="0"/>
+        </w:rPr>
+        <w:t>Slide 57</w:t>
+      </w:r>
+      <w:r>
+        <w:rPr>
+          <w:b w:val="0"/>
+          <w:i w:val="0"/>
+        </w:rPr>
+        <w:t>Diagnosis</w:t>
+      </w:r>
+      <w:r>
+        <w:rPr>
+          <w:b w:val="0"/>
+          <w:i w:val="0"/>
+        </w:rPr>
+        <w:t xml:space="preserve">ECG (electrocardiogram): right axis deviation, RVH (right ventricular hypertrophy); echo: abnormal valve motion, increased peak jet on Doppler (the grading table is not tested: "not the lesser valves") </w:t>
+      </w:r>
+      <w:r>
+        <w:rPr>
+          <w:b w:val="0"/>
+          <w:i w:val="0"/>
+        </w:rPr>
+        <w:t>Slide 58</w:t>
+      </w:r>
+      <w:r>
+        <w:rPr>
+          <w:b w:val="0"/>
+          <w:i w:val="0"/>
+        </w:rPr>
+        <w:t>Treatment/Therapy</w:t>
+      </w:r>
+      <w:r>
+        <w:rPr>
+          <w:b w:val="0"/>
+          <w:i w:val="0"/>
+        </w:rPr>
+        <w:t xml:space="preserve">Mild–moderate: none. Severe with symptoms: diuretics for right-HF symptoms, pulmonic balloon valvuloplasty; severe congenital may need replacement. Refer to cardiology if seen on echo </w:t>
+      </w:r>
+      <w:r>
+        <w:rPr>
+          <w:b w:val="0"/>
+          <w:i w:val="0"/>
+        </w:rPr>
+        <w:t>Slide 59</w:t>
+      </w:r>
+      <w:r>
+        <w:rPr>
+          <w:b w:val="0"/>
+          <w:i w:val="0"/>
+        </w:rPr>
+        <w:t>Mortality ★</w:t>
+      </w:r>
+      <w:r>
+        <w:rPr>
+          <w:b w:val="0"/>
+          <w:i w:val="0"/>
+        </w:rPr>
+        <w:t xml:space="preserve">Mild–moderate: 94% 20-year survival </w:t>
+      </w:r>
+      <w:r>
+        <w:rPr>
+          <w:b w:val="0"/>
+          <w:i w:val="0"/>
+        </w:rPr>
+        <w:t>Slide 59</w:t>
+      </w:r>
+    </w:p>
+    <w:p>
+      <w:pPr>
+        <w:spacing w:after="120"/>
+      </w:pPr>
+      <w:r>
+        <w:rPr>
+          <w:b w:val="0"/>
+          <w:i w:val="0"/>
+        </w:rPr>
+        <w:t>Pulmonic regurgitation</w:t>
+      </w:r>
+      <w:r>
+        <w:rPr>
+          <w:b w:val="0"/>
+          <w:i w:val="0"/>
+        </w:rPr>
+        <w:t>★ Professor emphasized</w:t>
+      </w:r>
+      <w:r>
+        <w:rPr>
+          <w:b w:val="0"/>
+          <w:i w:val="0"/>
+        </w:rPr>
+        <w:t>3 not covered</w:t>
+      </w:r>
+    </w:p>
+    <w:p>
+      <w:pPr>
+        <w:spacing w:after="120"/>
+      </w:pPr>
+      <w:r>
+        <w:rPr>
+          <w:b w:val="0"/>
+          <w:i w:val="0"/>
+        </w:rPr>
+        <w:t>★ Iatrogenic is the most common cause overall (said three times)</w:t>
+      </w:r>
+    </w:p>
+    <w:p>
+      <w:pPr>
+        <w:spacing w:after="120"/>
+      </w:pPr>
+      <w:r>
+        <w:rPr>
+          <w:b w:val="0"/>
+          <w:i w:val="0"/>
+        </w:rPr>
+        <w:t>Name of Condition</w:t>
+      </w:r>
+      <w:r>
+        <w:rPr>
+          <w:b w:val="0"/>
+          <w:i w:val="0"/>
+        </w:rPr>
+        <w:t xml:space="preserve">Pulmonic regurgitation / insufficiency (PR) </w:t>
+      </w:r>
+      <w:r>
+        <w:rPr>
+          <w:b w:val="0"/>
+          <w:i w:val="0"/>
+        </w:rPr>
+        <w:t>Slide 60</w:t>
+      </w:r>
+      <w:r>
+        <w:rPr>
+          <w:b w:val="0"/>
+          <w:i w:val="0"/>
+        </w:rPr>
+        <w:t>Definition</w:t>
+      </w:r>
+      <w:r>
+        <w:rPr>
+          <w:b w:val="0"/>
+          <w:i w:val="0"/>
+        </w:rPr>
+        <w:t xml:space="preserve">Incomplete pulmonic valve closure causing blood to flow back into the RV (right ventricle) </w:t>
+      </w:r>
+      <w:r>
+        <w:rPr>
+          <w:b w:val="0"/>
+          <w:i w:val="0"/>
+        </w:rPr>
+        <w:t>Slide 60</w:t>
+      </w:r>
+      <w:r>
+        <w:rPr>
+          <w:b w:val="0"/>
+          <w:i w:val="0"/>
+        </w:rPr>
+        <w:t>Etiology (cause)</w:t>
+      </w:r>
+      <w:r>
+        <w:rPr>
+          <w:b w:val="0"/>
+          <w:i w:val="0"/>
+        </w:rPr>
+        <w:t xml:space="preserve">High-pressure cause: pulmonary hypertension. Low-pressure causes: congenital (bicuspid); carcinoid disease; iatrogenic (after surgical valvotomy/valvectomy/valvuloplasty for RV (right ventricular) outflow obstruction) = MOST COMMON cause (slide 61, confirmed in the lecture) </w:t>
+      </w:r>
+      <w:r>
+        <w:rPr>
+          <w:b w:val="0"/>
+          <w:i w:val="0"/>
+        </w:rPr>
+        <w:t>Slide 61</w:t>
+      </w:r>
+      <w:r>
+        <w:rPr>
+          <w:b w:val="0"/>
+          <w:i w:val="0"/>
+        </w:rPr>
+        <w:t>Epidemiology (who)</w:t>
+      </w:r>
+      <w:r>
+        <w:rPr>
+          <w:b w:val="0"/>
+          <w:i w:val="0"/>
+        </w:rPr>
+        <w:t>Not covered in the lecture</w:t>
+      </w:r>
+      <w:r>
+        <w:rPr>
+          <w:b w:val="0"/>
+          <w:i w:val="0"/>
+        </w:rPr>
+        <w:t>Risk Factors</w:t>
+      </w:r>
+      <w:r>
+        <w:rPr>
+          <w:b w:val="0"/>
+          <w:i w:val="0"/>
+        </w:rPr>
+        <w:t>Not covered in the lecture</w:t>
+      </w:r>
+      <w:r>
+        <w:rPr>
+          <w:b w:val="0"/>
+          <w:i w:val="0"/>
+        </w:rPr>
+        <w:t>Pathology</w:t>
+      </w:r>
+      <w:r>
+        <w:rPr>
+          <w:b w:val="0"/>
+          <w:i w:val="0"/>
+        </w:rPr>
+        <w:t xml:space="preserve">Retrograde flow from the pulmonary artery → RV overload </w:t>
+      </w:r>
+      <w:r>
+        <w:rPr>
+          <w:b w:val="0"/>
+          <w:i w:val="0"/>
+        </w:rPr>
+        <w:t>Slide 62</w:t>
+      </w:r>
+      <w:r>
+        <w:rPr>
+          <w:b w:val="0"/>
+          <w:i w:val="0"/>
+        </w:rPr>
+        <w:t>Clinical Manifestation</w:t>
+      </w:r>
+      <w:r>
+        <w:rPr>
+          <w:b w:val="0"/>
+          <w:i w:val="0"/>
+        </w:rPr>
+        <w:t xml:space="preserve">Right-sided HF (heart failure): fatigue, peripheral edema, JVD (jugular venous distension), ascites. Brief high-pitched decrescendo early diastolic murmur at 2nd left ICS (intercostal space), radiating to mid right sternal border with full inspiration (Graham Steell murmur); louder with more venous return (inspiration, squatting, supine), softer with less (expiration, standing) </w:t>
+      </w:r>
+      <w:r>
+        <w:rPr>
+          <w:b w:val="0"/>
+          <w:i w:val="0"/>
+        </w:rPr>
+        <w:t>Slides 62, 63</w:t>
+      </w:r>
+      <w:r>
+        <w:rPr>
+          <w:b w:val="0"/>
+          <w:i w:val="0"/>
+        </w:rPr>
+        <w:t>Diagnosis</w:t>
+      </w:r>
+      <w:r>
+        <w:rPr>
+          <w:b w:val="0"/>
+          <w:i w:val="0"/>
+        </w:rPr>
+        <w:t xml:space="preserve">Usually an incidental finding on echocardiogram or physical exam </w:t>
+      </w:r>
+      <w:r>
+        <w:rPr>
+          <w:b w:val="0"/>
+          <w:i w:val="0"/>
+        </w:rPr>
+        <w:t>Slide 64</w:t>
+      </w:r>
+      <w:r>
+        <w:rPr>
+          <w:b w:val="0"/>
+          <w:i w:val="0"/>
+        </w:rPr>
+        <w:t>Treatment/Therapy</w:t>
+      </w:r>
+      <w:r>
+        <w:rPr>
+          <w:b w:val="0"/>
+          <w:i w:val="0"/>
+        </w:rPr>
+        <w:t xml:space="preserve">Treat the underlying condition; refer when seen on echo or with right-HF symptoms/signs (slide 64's "almost always congenital, no treatment required" conflicts with slide 61 and is not keyed) </w:t>
+      </w:r>
+      <w:r>
+        <w:rPr>
+          <w:b w:val="0"/>
+          <w:i w:val="0"/>
+        </w:rPr>
+        <w:t>Slide 64</w:t>
+      </w:r>
+      <w:r>
+        <w:rPr>
+          <w:b w:val="0"/>
+          <w:i w:val="0"/>
+        </w:rPr>
+        <w:t>Mortality ★</w:t>
+      </w:r>
+      <w:r>
+        <w:rPr>
+          <w:b w:val="0"/>
+          <w:i w:val="0"/>
+        </w:rPr>
+        <w:t>Not covered in the lecture</w:t>
+      </w:r>
+    </w:p>
+    <w:p>
+      <w:pPr>
+        <w:spacing w:after="120"/>
+      </w:pPr>
+      <w:r>
+        <w:rPr>
+          <w:b w:val="0"/>
+          <w:i w:val="0"/>
+        </w:rPr>
+        <w:t>Tricuspid stenosis</w:t>
+      </w:r>
+      <w:r>
+        <w:rPr>
+          <w:b w:val="0"/>
+          <w:i w:val="0"/>
+        </w:rPr>
+        <w:t>2 not covered</w:t>
+      </w:r>
+      <w:r>
+        <w:br/>
+      </w:r>
+      <w:r>
+        <w:rPr>
+          <w:b w:val="0"/>
+          <w:i w:val="0"/>
+        </w:rPr>
+        <w:t>Name of Condition</w:t>
+      </w:r>
+      <w:r>
+        <w:rPr>
+          <w:b w:val="0"/>
+          <w:i w:val="0"/>
+        </w:rPr>
+        <w:t xml:space="preserve">Tricuspid stenosis (TS) </w:t>
+      </w:r>
+      <w:r>
+        <w:rPr>
+          <w:b w:val="0"/>
+          <w:i w:val="0"/>
+        </w:rPr>
+        <w:t>Slide 65</w:t>
+      </w:r>
+      <w:r>
+        <w:rPr>
+          <w:b w:val="0"/>
+          <w:i w:val="0"/>
+        </w:rPr>
+        <w:t>Definition</w:t>
+      </w:r>
+      <w:r>
+        <w:rPr>
+          <w:b w:val="0"/>
+          <w:i w:val="0"/>
+        </w:rPr>
+        <w:t xml:space="preserve">Obstruction of inflow from the RA (right atrium) to the RV (right ventricle) across a narrowed tricuspid valve (slide 66; slide 65's "from the LA" is a deck error) </w:t>
+      </w:r>
+      <w:r>
+        <w:rPr>
+          <w:b w:val="0"/>
+          <w:i w:val="0"/>
+        </w:rPr>
+        <w:t>Slides 65, 66</w:t>
+      </w:r>
+      <w:r>
+        <w:rPr>
+          <w:b w:val="0"/>
+          <w:i w:val="0"/>
+        </w:rPr>
+        <w:t>Etiology (cause)</w:t>
+      </w:r>
+      <w:r>
+        <w:rPr>
+          <w:b w:val="0"/>
+          <w:i w:val="0"/>
+        </w:rPr>
+        <w:t xml:space="preserve">Most commonly rheumatic fever worldwide; in the US almost always congenital; carcinoid disease </w:t>
+      </w:r>
+      <w:r>
+        <w:rPr>
+          <w:b w:val="0"/>
+          <w:i w:val="0"/>
+        </w:rPr>
+        <w:t>Slide 65</w:t>
+      </w:r>
+      <w:r>
+        <w:rPr>
+          <w:b w:val="0"/>
+          <w:i w:val="0"/>
+        </w:rPr>
+        <w:t>Epidemiology (who)</w:t>
+      </w:r>
+      <w:r>
+        <w:rPr>
+          <w:b w:val="0"/>
+          <w:i w:val="0"/>
+        </w:rPr>
+        <w:t xml:space="preserve">Most common in women </w:t>
+      </w:r>
+      <w:r>
+        <w:rPr>
+          <w:b w:val="0"/>
+          <w:i w:val="0"/>
+        </w:rPr>
+        <w:t>Slide 65</w:t>
+      </w:r>
+      <w:r>
+        <w:rPr>
+          <w:b w:val="0"/>
+          <w:i w:val="0"/>
+        </w:rPr>
+        <w:t>Risk Factors</w:t>
+      </w:r>
+      <w:r>
+        <w:rPr>
+          <w:b w:val="0"/>
+          <w:i w:val="0"/>
+        </w:rPr>
+        <w:t>Not covered in the lecture</w:t>
+      </w:r>
+      <w:r>
+        <w:rPr>
+          <w:b w:val="0"/>
+          <w:i w:val="0"/>
+        </w:rPr>
+        <w:t>Pathology</w:t>
+      </w:r>
+      <w:r>
+        <w:rPr>
+          <w:b w:val="0"/>
+          <w:i w:val="0"/>
+        </w:rPr>
+        <w:t xml:space="preserve">Narrowed tricuspid valve → obstructed RA-to-RV inflow → RA dilation and hypertrophy, low cardiac output, portal congestion → right HF (heart failure) without RV dysfunction </w:t>
+      </w:r>
+      <w:r>
+        <w:rPr>
+          <w:b w:val="0"/>
+          <w:i w:val="0"/>
+        </w:rPr>
+        <w:t>Slide 66</w:t>
+      </w:r>
+      <w:r>
+        <w:rPr>
+          <w:b w:val="0"/>
+          <w:i w:val="0"/>
+        </w:rPr>
+        <w:t>Clinical Manifestation</w:t>
+      </w:r>
+      <w:r>
+        <w:rPr>
+          <w:b w:val="0"/>
+          <w:i w:val="0"/>
+        </w:rPr>
+        <w:t xml:space="preserve">Mild–moderate usually asymptomatic; severe: fluttering discomfort in the neck, cold skin (low cardiac output), RUQ (right upper quadrant) pain (enlarged liver). Soft opening snap and mid-diastolic rumble at left lower sternal border near the xiphoid, increases with inspiration; JVD (jugular venous distension); suffusion sign (dusky face with dilated scalp veins when supine; not tested, per the lecture) </w:t>
+      </w:r>
+      <w:r>
+        <w:rPr>
+          <w:b w:val="0"/>
+          <w:i w:val="0"/>
+        </w:rPr>
+        <w:t>Slide 67</w:t>
+      </w:r>
+      <w:r>
+        <w:rPr>
+          <w:b w:val="0"/>
+          <w:i w:val="0"/>
+        </w:rPr>
+        <w:t>Diagnosis</w:t>
+      </w:r>
+      <w:r>
+        <w:rPr>
+          <w:b w:val="0"/>
+          <w:i w:val="0"/>
+        </w:rPr>
+        <w:t xml:space="preserve">ECG (electrocardiogram): RA enlargement out of proportion to RVH (right ventricular hypertrophy); echo: abnormal valve motion, increased peak jet (the grading table is not tested: "not the lesser valves") </w:t>
+      </w:r>
+      <w:r>
+        <w:rPr>
+          <w:b w:val="0"/>
+          <w:i w:val="0"/>
+        </w:rPr>
+        <w:t>Slide 68</w:t>
+      </w:r>
+      <w:r>
+        <w:rPr>
+          <w:b w:val="0"/>
+          <w:i w:val="0"/>
+        </w:rPr>
+        <w:t>Treatment/Therapy</w:t>
+      </w:r>
+      <w:r>
+        <w:rPr>
+          <w:b w:val="0"/>
+          <w:i w:val="0"/>
+        </w:rPr>
+        <w:t xml:space="preserve">Severe with symptoms: low salt, diuretics, aldosterone antagonist; bioprosthetic valve replacement preferred; balloon valvotomy and repair reserved for hepatic congestion that may lead to cirrhosis or severe systemic venous congestion. Refer if seen on echo or HF symptoms </w:t>
+      </w:r>
+      <w:r>
+        <w:rPr>
+          <w:b w:val="0"/>
+          <w:i w:val="0"/>
+        </w:rPr>
+        <w:t>Slide 69</w:t>
+      </w:r>
+      <w:r>
+        <w:rPr>
+          <w:b w:val="0"/>
+          <w:i w:val="0"/>
+        </w:rPr>
+        <w:t>Mortality ★</w:t>
+      </w:r>
+      <w:r>
+        <w:rPr>
+          <w:b w:val="0"/>
+          <w:i w:val="0"/>
+        </w:rPr>
+        <w:t>Not covered in the lecture</w:t>
+      </w:r>
+    </w:p>
+    <w:p>
+      <w:pPr>
+        <w:spacing w:after="120"/>
+      </w:pPr>
+      <w:r>
+        <w:rPr>
+          <w:b w:val="0"/>
+          <w:i w:val="0"/>
+        </w:rPr>
+        <w:t>Tricuspid regurgitation</w:t>
+      </w:r>
+      <w:r>
+        <w:rPr>
+          <w:b w:val="0"/>
+          <w:i w:val="0"/>
+        </w:rPr>
+        <w:t>★ Professor emphasized</w:t>
+      </w:r>
+      <w:r>
+        <w:rPr>
+          <w:b w:val="0"/>
+          <w:i w:val="0"/>
+        </w:rPr>
+        <w:t>2 not covered</w:t>
+      </w:r>
+    </w:p>
+    <w:p>
+      <w:pPr>
+        <w:spacing w:after="120"/>
+      </w:pPr>
+      <w:r>
+        <w:rPr>
+          <w:b w:val="0"/>
+          <w:i w:val="0"/>
+        </w:rPr>
+        <w:t>★ Tricuspid endocarditis is usually intravenous drug use; Carvallo sign separates it from mitral regurgitation</w:t>
+      </w:r>
+    </w:p>
+    <w:p>
+      <w:pPr>
+        <w:spacing w:after="120"/>
+      </w:pPr>
+      <w:r>
+        <w:rPr>
+          <w:b w:val="0"/>
+          <w:i w:val="0"/>
+        </w:rPr>
+        <w:t>Name of Condition</w:t>
+      </w:r>
+      <w:r>
+        <w:rPr>
+          <w:b w:val="0"/>
+          <w:i w:val="0"/>
+        </w:rPr>
+        <w:t xml:space="preserve">Tricuspid regurgitation / insufficiency (TR) </w:t>
+      </w:r>
+      <w:r>
+        <w:rPr>
+          <w:b w:val="0"/>
+          <w:i w:val="0"/>
+        </w:rPr>
+        <w:t>Slide 70</w:t>
+      </w:r>
+      <w:r>
+        <w:rPr>
+          <w:b w:val="0"/>
+          <w:i w:val="0"/>
+        </w:rPr>
+        <w:t>Definition</w:t>
+      </w:r>
+      <w:r>
+        <w:rPr>
+          <w:b w:val="0"/>
+          <w:i w:val="0"/>
+        </w:rPr>
+        <w:t xml:space="preserve">Incomplete closure causing blood to flow from the RV (right ventricle) back into the RA (right atrium) </w:t>
+      </w:r>
+      <w:r>
+        <w:rPr>
+          <w:b w:val="0"/>
+          <w:i w:val="0"/>
+        </w:rPr>
+        <w:t>Slide 70</w:t>
+      </w:r>
+      <w:r>
+        <w:rPr>
+          <w:b w:val="0"/>
+          <w:i w:val="0"/>
+        </w:rPr>
+        <w:t>Etiology (cause)</w:t>
+      </w:r>
+      <w:r>
+        <w:rPr>
+          <w:b w:val="0"/>
+          <w:i w:val="0"/>
+        </w:rPr>
+        <w:t xml:space="preserve">Most commonly tricuspid annulus dilation from RV dilation in pulmonary hypertension; primary: infective endocarditis in IV (intravenous) drug users </w:t>
+      </w:r>
+      <w:r>
+        <w:rPr>
+          <w:b w:val="0"/>
+          <w:i w:val="0"/>
+        </w:rPr>
+        <w:t>Slide 70</w:t>
+      </w:r>
+      <w:r>
+        <w:rPr>
+          <w:b w:val="0"/>
+          <w:i w:val="0"/>
+        </w:rPr>
+        <w:t>Epidemiology (who)</w:t>
+      </w:r>
+      <w:r>
+        <w:rPr>
+          <w:b w:val="0"/>
+          <w:i w:val="0"/>
+        </w:rPr>
+        <w:t xml:space="preserve">IV drug users (primary TR from endocarditis) </w:t>
+      </w:r>
+      <w:r>
+        <w:rPr>
+          <w:b w:val="0"/>
+          <w:i w:val="0"/>
+        </w:rPr>
+        <w:t>Slide 70</w:t>
+      </w:r>
+      <w:r>
+        <w:rPr>
+          <w:b w:val="0"/>
+          <w:i w:val="0"/>
+        </w:rPr>
+        <w:t>Risk Factors</w:t>
+      </w:r>
+      <w:r>
+        <w:rPr>
+          <w:b w:val="0"/>
+          <w:i w:val="0"/>
+        </w:rPr>
+        <w:t xml:space="preserve">Pulmonary hypertension; IV drug use </w:t>
+      </w:r>
+      <w:r>
+        <w:rPr>
+          <w:b w:val="0"/>
+          <w:i w:val="0"/>
+        </w:rPr>
+        <w:t>Slide 70</w:t>
+      </w:r>
+      <w:r>
+        <w:rPr>
+          <w:b w:val="0"/>
+          <w:i w:val="0"/>
+        </w:rPr>
+        <w:t>Pathology</w:t>
+      </w:r>
+      <w:r>
+        <w:rPr>
+          <w:b w:val="0"/>
+          <w:i w:val="0"/>
+        </w:rPr>
+        <w:t>Not covered in the lecture</w:t>
+      </w:r>
+      <w:r>
+        <w:rPr>
+          <w:b w:val="0"/>
+          <w:i w:val="0"/>
+        </w:rPr>
+        <w:t>Clinical Manifestation</w:t>
+      </w:r>
+      <w:r>
+        <w:rPr>
+          <w:b w:val="0"/>
+          <w:i w:val="0"/>
+        </w:rPr>
+        <w:t xml:space="preserve">Mild–moderate usually asymptomatic; severe: pedal edema, ascites. Holosystolic murmur at left mid/lower sternal border near the epigastrium; increases with inspiration (Carvallo sign: inspiratory increase in a right-sided murmur), which distinguishes it from MR (mitral regurgitation); elevated JVP (jugular venous pressure) with neck pulsations; venous thrill on the right jugular vein </w:t>
+      </w:r>
+      <w:r>
+        <w:rPr>
+          <w:b w:val="0"/>
+          <w:i w:val="0"/>
+        </w:rPr>
+        <w:t>Slides 71, 9</w:t>
+      </w:r>
+      <w:r>
+        <w:rPr>
+          <w:b w:val="0"/>
+          <w:i w:val="0"/>
+        </w:rPr>
+        <w:t>Diagnosis</w:t>
+      </w:r>
+      <w:r>
+        <w:rPr>
+          <w:b w:val="0"/>
+          <w:i w:val="0"/>
+        </w:rPr>
+        <w:t xml:space="preserve">Echocardiogram Doppler: regurgitation; prolapsed, scarred or displaced leaflets </w:t>
+      </w:r>
+      <w:r>
+        <w:rPr>
+          <w:b w:val="0"/>
+          <w:i w:val="0"/>
+        </w:rPr>
+        <w:t>Slide 72</w:t>
+      </w:r>
+      <w:r>
+        <w:rPr>
+          <w:b w:val="0"/>
+          <w:i w:val="0"/>
+        </w:rPr>
+        <w:t>Treatment/Therapy</w:t>
+      </w:r>
+      <w:r>
+        <w:rPr>
+          <w:b w:val="0"/>
+          <w:i w:val="0"/>
+        </w:rPr>
+        <w:t xml:space="preserve">Treat the underlying condition; annuloplasty if due to annular dilation; valve repair or replacement if primary cause. Refer when identified on echo or with right heart failure symptoms </w:t>
+      </w:r>
+      <w:r>
+        <w:rPr>
+          <w:b w:val="0"/>
+          <w:i w:val="0"/>
+        </w:rPr>
+        <w:t>Slide 72</w:t>
+      </w:r>
+      <w:r>
+        <w:rPr>
+          <w:b w:val="0"/>
+          <w:i w:val="0"/>
+        </w:rPr>
+        <w:t>Mortality ★</w:t>
+      </w:r>
+      <w:r>
+        <w:rPr>
+          <w:b w:val="0"/>
+          <w:i w:val="0"/>
+        </w:rPr>
+        <w:t>Not covered in the lecture</w:t>
+      </w:r>
+    </w:p>
+    <w:p>
+      <w:pPr>
+        <w:spacing w:after="120"/>
+      </w:pPr>
+      <w:r>
+        <w:rPr>
+          <w:b w:val="0"/>
+          <w:i w:val="0"/>
+        </w:rPr>
         <w:t>Prosthetic heart valves and anticoagulation</w:t>
       </w:r>
       <w:r>
@@ -11534,11 +11639,32 @@
           <w:b w:val="0"/>
           <w:i w:val="0"/>
         </w:rPr>
+        <w:t>★ Professor emphasized</w:t>
+      </w:r>
+      <w:r>
+        <w:rPr>
+          <w:b w:val="0"/>
+          <w:i w:val="0"/>
+        </w:rPr>
         <w:t>6 not covered</w:t>
       </w:r>
-      <w:r>
-        <w:br/>
-      </w:r>
+    </w:p>
+    <w:p>
+      <w:pPr>
+        <w:spacing w:after="120"/>
+      </w:pPr>
+      <w:r>
+        <w:rPr>
+          <w:b w:val="0"/>
+          <w:i w:val="0"/>
+        </w:rPr>
+        <w:t>★ Mechanical valve: vitamin K antagonist (warfarin) only; stick with the higher target when both valves are mechanical; bridge with heparin</w:t>
+      </w:r>
+    </w:p>
+    <w:p>
+      <w:pPr>
+        <w:spacing w:after="120"/>
+      </w:pPr>
       <w:r>
         <w:rPr>
           <w:b w:val="0"/>
@@ -11607,7 +11733,7 @@
           <w:b w:val="0"/>
           <w:i w:val="0"/>
         </w:rPr>
-        <w:t xml:space="preserve">As written on the slide: TAVR/TMVR (transcatheter aortic/mitral valve replacement) "used in patients &lt;55 years old, younger patients with a life expectancy of &gt;10 years"; mechanical valves used in patients &lt;70; bioprosthetic preferred if life expectancy is shorter than the valve's expected longevity or anticoagulation is contraindicated </w:t>
+        <w:t xml:space="preserve">Valve type by age (slide 74: TAVR/TMVR "&lt;55", mechanical "&lt;70") conflicts with the lecture's spoken teaching and is not keyed; bioprosthetic preferred if life expectancy is shorter than the valve's expected longevity or anticoagulation is contraindicated </w:t>
       </w:r>
       <w:r>
         <w:rPr>

</xml_diff>

<commit_message>
CMS I Exam 4 Clin Med Pro: Lecture 24 rulings and emphasis
Lecture note with the rulings (no slide erratum; slide 72a troponin numbers;
TIMI 3 or higher the only score cut-off; slide 47 over 86; slide 90 over 91;
no nitroglycerin in right ventricular infarct; unkeyed items; typos). Fields
corrected (HEART/TIMI percentages marked untested, dual antiplatelet durations,
slide 65 markers, CABG artery first, MINOCA caveat) and prof flags on ten of
the eleven conditions.

Co-Authored-By: Claude Opus 5.5 (1M context) <noreply@anthropic.com>
</commit_message>
<xml_diff>
--- a/Clinical Medicine and Surgery I Exam 4/cms-exam-4-clin-med-pro-guide.docx
+++ b/Clinical Medicine and Surgery I Exam 4/cms-exam-4-clin-med-pro-guide.docx
@@ -281,6 +281,47 @@
               <w:t xml:space="preserve"> rather than filling the gap from elsewhere (196 of 740 fields in this exam; Mortality alone: 52 of 74). Slide numbers follow each field. Cards open closed; tap one to read it.</w:t>
             </w:r>
           </w:p>
+          <w:p>
+            <w:pPr>
+              <w:spacing w:after="120"/>
+            </w:pPr>
+            <w:r>
+              <w:rPr>
+                <w:b w:val="0"/>
+                <w:i w:val="0"/>
+              </w:rPr>
+              <w:t xml:space="preserve">The ★ on </w:t>
+            </w:r>
+            <w:r>
+              <w:rPr>
+                <w:b/>
+                <w:i w:val="0"/>
+              </w:rPr>
+              <w:t>Mortality</w:t>
+            </w:r>
+            <w:r>
+              <w:rPr>
+                <w:b w:val="0"/>
+                <w:i w:val="0"/>
+              </w:rPr>
+              <w:t xml:space="preserve"> is on the original study-tip slide: fill it when a figure exists. A </w:t>
+            </w:r>
+            <w:r>
+              <w:rPr>
+                <w:b w:val="0"/>
+                <w:i w:val="0"/>
+                <w:highlight w:val="yellow"/>
+              </w:rPr>
+              <w:t>★ highlighted phrase</w:t>
+            </w:r>
+            <w:r>
+              <w:rPr>
+                <w:b w:val="0"/>
+                <w:i w:val="0"/>
+              </w:rPr>
+              <w:t xml:space="preserve"> inside a field is a fact the professor emphasized in the lecture recording, carried over from this exam’s study guide.</w:t>
+            </w:r>
+          </w:p>
         </w:tc>
       </w:tr>
     </w:tbl>
@@ -12048,223 +12089,17 @@
       </w:pPr>
       <w:r>
         <w:rPr>
-          <w:b w:val="0"/>
-          <w:i w:val="0"/>
-        </w:rPr>
-        <w:t>Ischemic heart disease (general CAD)</w:t>
-      </w:r>
-      <w:r>
-        <w:br/>
-      </w:r>
-      <w:r>
-        <w:rPr>
-          <w:b w:val="0"/>
-          <w:i w:val="0"/>
-        </w:rPr>
-        <w:t>Name of Condition</w:t>
-      </w:r>
-      <w:r>
-        <w:rPr>
-          <w:b w:val="0"/>
-          <w:i w:val="0"/>
-        </w:rPr>
-        <w:t xml:space="preserve">Ischemic heart disease; coronary artery disease (CAD) / ischemia; ischemic myocardium </w:t>
-      </w:r>
-      <w:r>
-        <w:rPr>
-          <w:b w:val="0"/>
-          <w:i w:val="0"/>
-        </w:rPr>
-        <w:t>Slides 1, 4, 5</w:t>
-      </w:r>
-      <w:r>
-        <w:rPr>
-          <w:b w:val="0"/>
-          <w:i w:val="0"/>
-        </w:rPr>
-        <w:t>Definition</w:t>
-      </w:r>
-      <w:r>
-        <w:rPr>
-          <w:b w:val="0"/>
-          <w:i w:val="0"/>
-        </w:rPr>
-        <w:t xml:space="preserve">Mismatch between myocardial oxygen demand and oxygen supply </w:t>
-      </w:r>
-      <w:r>
-        <w:rPr>
-          <w:b w:val="0"/>
-          <w:i w:val="0"/>
-        </w:rPr>
-        <w:t>Slide 5</w:t>
-      </w:r>
-      <w:r>
-        <w:rPr>
-          <w:b w:val="0"/>
-          <w:i w:val="0"/>
-        </w:rPr>
-        <w:t>Etiology (cause)</w:t>
-      </w:r>
-      <w:r>
-        <w:rPr>
-          <w:b w:val="0"/>
-          <w:i w:val="0"/>
-        </w:rPr>
-        <w:t xml:space="preserve">↓ oxygen supply: atherosclerosis, thrombus/embolus, anemia, spasm, dissection, carboxyhemoglobin, hypoxia; ↑ oxygen demand: exercise, emotional stress, LVH (left ventricular hypertrophy)/cardiomyopathy, hyperthyroidism, hyperthermia, cocaine </w:t>
-      </w:r>
-      <w:r>
-        <w:rPr>
-          <w:b w:val="0"/>
-          <w:i w:val="0"/>
-        </w:rPr>
-        <w:t>Slide 6</w:t>
-      </w:r>
-      <w:r>
-        <w:rPr>
-          <w:b w:val="0"/>
-          <w:i w:val="0"/>
-        </w:rPr>
-        <w:t>Epidemiology (who)</w:t>
-      </w:r>
-      <w:r>
-        <w:rPr>
-          <w:b w:val="0"/>
-          <w:i w:val="0"/>
-        </w:rPr>
-        <w:t xml:space="preserve">Culprit vessel in acute MI (myocardial infarction): LAD (left anterior descending, anterior interventricular) 40–50%; RCA (right coronary artery) 30–40%; left circumflex 15–20% </w:t>
-      </w:r>
-      <w:r>
-        <w:rPr>
-          <w:b w:val="0"/>
-          <w:i w:val="0"/>
-        </w:rPr>
-        <w:t>Slide 14</w:t>
-      </w:r>
-      <w:r>
-        <w:rPr>
-          <w:b w:val="0"/>
-          <w:i w:val="0"/>
-        </w:rPr>
-        <w:t>Risk Factors</w:t>
-      </w:r>
-      <w:r>
-        <w:rPr>
-          <w:b w:val="0"/>
-          <w:i w:val="0"/>
-        </w:rPr>
-        <w:t xml:space="preserve">Nonmodifiable: age ≥45 men / ≥55 women; male &gt; premenopausal female (gap narrows by ~80); sudden death/MI in male first-degree relative &lt;55 or female &lt;65. Modifiable: obesity, dyslipidemia, diabetes, smoking (strong predictor, especially women &lt;45), hypertension, excessive alcohol, sedentary lifestyle, poor stress management </w:t>
-      </w:r>
-      <w:r>
-        <w:rPr>
-          <w:b w:val="0"/>
-          <w:i w:val="0"/>
-        </w:rPr>
-        <w:t>Slides 21–23</w:t>
-      </w:r>
-      <w:r>
-        <w:rPr>
-          <w:b w:val="0"/>
-          <w:i w:val="0"/>
-        </w:rPr>
-        <w:t>Pathology</w:t>
-      </w:r>
-      <w:r>
-        <w:rPr>
-          <w:b w:val="0"/>
-          <w:i w:val="0"/>
-        </w:rPr>
-        <w:t xml:space="preserve">Heart is 0.3% of body weight but uses 7% of oxygen; irreversible injury in 40–60 min; anaerobic shift ↑ lactic acid; injury from free radicals, lactic acid, ↑ extracellular calcium; wall hypokinesia/akinesia/dyskinesia. Atherosclerosis (fat, smooth muscle, fibroblasts, matrix): thick-cap atheroma vs thin-cap fibroatheroma; plaque rupture → platelet activation + tissue factor → clotting cascade → fibrin </w:t>
-      </w:r>
-      <w:r>
-        <w:rPr>
-          <w:b w:val="0"/>
-          <w:i w:val="0"/>
-        </w:rPr>
-        <w:t>Slides 7–9, 17–20</w:t>
-      </w:r>
-      <w:r>
-        <w:rPr>
-          <w:b w:val="0"/>
-          <w:i w:val="0"/>
-        </w:rPr>
-        <w:t>Clinical Manifestation</w:t>
-      </w:r>
-      <w:r>
-        <w:rPr>
-          <w:b w:val="0"/>
-          <w:i w:val="0"/>
-        </w:rPr>
-        <w:t xml:space="preserve">Typical pain: substernal pressure, worse with exertion, radiates to neck/shoulder, shortness of breath, diaphoresis, relieved by nitroglycerin; ischemia may be silent </w:t>
-      </w:r>
-      <w:r>
-        <w:rPr>
-          <w:b w:val="0"/>
-          <w:i w:val="0"/>
-        </w:rPr>
-        <w:t>Slides 25, 29–30</w:t>
-      </w:r>
-      <w:r>
-        <w:rPr>
-          <w:b w:val="0"/>
-          <w:i w:val="0"/>
-        </w:rPr>
-        <w:t>Diagnosis</w:t>
-      </w:r>
-      <w:r>
-        <w:rPr>
-          <w:b w:val="0"/>
-          <w:i w:val="0"/>
-        </w:rPr>
-        <w:t xml:space="preserve">All chest pain: chest X-ray + STAT ECG (electrocardiogram); CBC (complete blood count), metabolic panel, PT/PTT (prothrombin/partial thromboplastin time), troponin, lipids; maybe drug screen, D-dimer, lipase, pro-BNP (pro-B-type natriuretic peptide). Risk scores: GRACE, TIMI (Thrombolysis in Myocardial Infarction), PURSUIT, HEART. Cardiac CT (computed tomography) calcium score (risk stratification, not ACS (acute coronary syndrome)); treadmill ECG; nuclear stress (abnormal → cardiac catheterization; sensitivity 90%, specificity 77%); echo; coronary CT angiography </w:t>
-      </w:r>
-      <w:r>
-        <w:rPr>
-          <w:b w:val="0"/>
-          <w:i w:val="0"/>
-        </w:rPr>
-        <w:t>Slides 32–35</w:t>
-      </w:r>
-      <w:r>
-        <w:rPr>
-          <w:b w:val="0"/>
-          <w:i w:val="0"/>
-        </w:rPr>
-        <w:t>Treatment/Therapy</w:t>
-      </w:r>
-      <w:r>
-        <w:rPr>
-          <w:b w:val="0"/>
-          <w:i w:val="0"/>
-        </w:rPr>
-        <w:t xml:space="preserve">Per syndrome (see cards below); risk-factor control: blood pressure, lipids, glucose, weight loss, alcohol restriction, exercise, smoking cessation, stress </w:t>
-      </w:r>
-      <w:r>
-        <w:rPr>
-          <w:b w:val="0"/>
-          <w:i w:val="0"/>
-        </w:rPr>
-        <w:t>Slide 79</w:t>
-      </w:r>
-      <w:r>
-        <w:rPr>
-          <w:b w:val="0"/>
-          <w:i w:val="0"/>
-        </w:rPr>
-        <w:t>Mortality ★</w:t>
-      </w:r>
-      <w:r>
-        <w:rPr>
-          <w:b w:val="0"/>
-          <w:i w:val="0"/>
-        </w:rPr>
-        <w:t xml:space="preserve">LV (left ventricular) involvement carries higher mortality; sudden cardiac death is the first manifestation of CAD in &gt;20% </w:t>
-      </w:r>
-      <w:r>
-        <w:rPr>
-          <w:b w:val="0"/>
-          <w:i w:val="0"/>
-        </w:rPr>
-        <w:t>Slides 12, 85</w:t>
+          <w:b/>
+          <w:i w:val="0"/>
+        </w:rPr>
+        <w:t>Note:</w:t>
+      </w:r>
+      <w:r>
+        <w:rPr>
+          <w:b w:val="0"/>
+          <w:i w:val="0"/>
+        </w:rPr>
+        <w:t xml:space="preserve"> Rulings from the lecture (25 September): Dr. Carter struck no slide this time (his one "that's wrong" withdrew his own remark that V4 is a lateral lead, so slide 61 stands). The troponin numbers come from a slide he showed in class that is not in the posted deck (photographed, cited as SUPPLEMENT slide 72a): standard troponin I is abnormal above 0.04 ng/mL, high-sensitivity troponin I at 12 ng/L in women and 20 ng/L in men; troponin rules out and is repeated. Only one risk-score cut-off is tested: TIMI 3 or higher justifies an early invasive approach (HEART bands and percentages and the TIMI percentage table are not). Slide 47's non-ST-elevation wording (ST depression and/or T-wave inversion) is used, never slide 86's "ST inversion". Vasospastic angina follows slide 90 (transient ST elevation); slide 91's "T-wave inversion; maybe ST depression" is not keyed. Right ventricular infarct: do not give nitroglycerin (slide 63, said three times); slide 73's "caution" is not keyed, and the rule is for right ventricular involvement, not every inferior infarct. Not keyed: slide 65's "elevated cardiac markers must be present" for STEMI (he said troponin is not required), the dual antiplatelet durations (slides 52 and 83 disagree), coronary dominance percentages, and whether MINOCA and microvascular angina differ (the deck equates them; standard usage does not). Deck typos corrected: fosinopril ("Forsinopril"), anistreplase ("Antistreplase"), drug-eluting ("Eluding"), supplied ("suppled"), PTCA ("PCTA"). Spoken slips where the slide wins: smoking risk in women under 45, vasospastic angina under 50, the 99th percentile, nitroglycerin is not a phosphodiesterase inhibitor, bypass uses an artery first.</w:t>
       </w:r>
     </w:p>
     <w:p>
@@ -12276,213 +12111,14 @@
           <w:b w:val="0"/>
           <w:i w:val="0"/>
         </w:rPr>
-        <w:t>Angina pectoris</w:t>
-      </w:r>
-      <w:r>
-        <w:rPr>
-          <w:b w:val="0"/>
-          <w:i w:val="0"/>
-        </w:rPr>
-        <w:t>2 not covered</w:t>
-      </w:r>
-      <w:r>
-        <w:br/>
-      </w:r>
-      <w:r>
-        <w:rPr>
-          <w:b w:val="0"/>
-          <w:i w:val="0"/>
-        </w:rPr>
-        <w:t>Name of Condition</w:t>
-      </w:r>
-      <w:r>
-        <w:rPr>
-          <w:b w:val="0"/>
-          <w:i w:val="0"/>
-        </w:rPr>
-        <w:t xml:space="preserve">Angina pectoris </w:t>
-      </w:r>
-      <w:r>
-        <w:rPr>
-          <w:b w:val="0"/>
-          <w:i w:val="0"/>
-        </w:rPr>
-        <w:t>Slides 24, 27</w:t>
-      </w:r>
-      <w:r>
-        <w:rPr>
-          <w:b w:val="0"/>
-          <w:i w:val="0"/>
-        </w:rPr>
-        <w:t>Definition</w:t>
-      </w:r>
-      <w:r>
-        <w:rPr>
-          <w:b w:val="0"/>
-          <w:i w:val="0"/>
-        </w:rPr>
-        <w:t xml:space="preserve">Transient myocardial ischemia not long or severe enough to cause MI (myocardial infarction); symptoms recur </w:t>
-      </w:r>
-      <w:r>
-        <w:rPr>
-          <w:b w:val="0"/>
-          <w:i w:val="0"/>
-        </w:rPr>
-        <w:t>Slide 27</w:t>
-      </w:r>
-      <w:r>
-        <w:rPr>
-          <w:b w:val="0"/>
-          <w:i w:val="0"/>
-        </w:rPr>
-        <w:t>Etiology (cause)</w:t>
-      </w:r>
-      <w:r>
-        <w:rPr>
-          <w:b w:val="0"/>
-          <w:i w:val="0"/>
-        </w:rPr>
-        <w:t xml:space="preserve">Oxygen supply/demand mismatch </w:t>
-      </w:r>
-      <w:r>
-        <w:rPr>
-          <w:b w:val="0"/>
-          <w:i w:val="0"/>
-        </w:rPr>
-        <w:t>Slides 5–6</w:t>
-      </w:r>
-      <w:r>
-        <w:rPr>
-          <w:b w:val="0"/>
-          <w:i w:val="0"/>
-        </w:rPr>
-        <w:t>Epidemiology (who)</w:t>
-      </w:r>
-      <w:r>
-        <w:rPr>
-          <w:b w:val="0"/>
-          <w:i w:val="0"/>
-        </w:rPr>
-        <w:t>Not covered in the lecture</w:t>
-      </w:r>
-      <w:r>
-        <w:rPr>
-          <w:b w:val="0"/>
-          <w:i w:val="0"/>
-        </w:rPr>
-        <w:t>Risk Factors</w:t>
-      </w:r>
-      <w:r>
-        <w:rPr>
-          <w:b w:val="0"/>
-          <w:i w:val="0"/>
-        </w:rPr>
-        <w:t xml:space="preserve">Coronary artery disease risk factors </w:t>
-      </w:r>
-      <w:r>
-        <w:rPr>
-          <w:b w:val="0"/>
-          <w:i w:val="0"/>
-        </w:rPr>
-        <w:t>Slides 22–23</w:t>
-      </w:r>
-      <w:r>
-        <w:rPr>
-          <w:b w:val="0"/>
-          <w:i w:val="0"/>
-        </w:rPr>
-        <w:t>Pathology</w:t>
-      </w:r>
-      <w:r>
-        <w:rPr>
-          <w:b w:val="0"/>
-          <w:i w:val="0"/>
-        </w:rPr>
-        <w:t xml:space="preserve">Intermittent ischemia short of infarction </w:t>
-      </w:r>
-      <w:r>
-        <w:rPr>
-          <w:b w:val="0"/>
-          <w:i w:val="0"/>
-        </w:rPr>
-        <w:t>Slide 27</w:t>
-      </w:r>
-      <w:r>
-        <w:rPr>
-          <w:b w:val="0"/>
-          <w:i w:val="0"/>
-        </w:rPr>
-        <w:t>Clinical Manifestation</w:t>
-      </w:r>
-      <w:r>
-        <w:rPr>
-          <w:b w:val="0"/>
-          <w:i w:val="0"/>
-        </w:rPr>
-        <w:t xml:space="preserve">Substernal pressure/squeezing/tightness/burning/band-like, worse with exertion, radiates to neck/shoulder, shortness of breath, diaphoresis, relieved by nitroglycerin, not positional; Levine sign (clenched fist held over the sternum). Silent ischemia (diabetes, neuropathy, transplanted heart) → dyspnea, cough, nausea/vomiting, abdominal pain, diaphoresis, dizziness, fatigue. Referred: jaw, tooth, arm, back, scapula, epigastric/left upper quadrant </w:t>
-      </w:r>
-      <w:r>
-        <w:rPr>
-          <w:b w:val="0"/>
-          <w:i w:val="0"/>
-        </w:rPr>
-        <w:t>Slides 25–31</w:t>
-      </w:r>
-      <w:r>
-        <w:rPr>
-          <w:b w:val="0"/>
-          <w:i w:val="0"/>
-        </w:rPr>
-        <w:t>Diagnosis</w:t>
-      </w:r>
-      <w:r>
-        <w:rPr>
-          <w:b w:val="0"/>
-          <w:i w:val="0"/>
-        </w:rPr>
-        <w:t xml:space="preserve">Chest-pain workup; stress testing; echo; coronary CT (computed tomography) angiography </w:t>
-      </w:r>
-      <w:r>
-        <w:rPr>
-          <w:b w:val="0"/>
-          <w:i w:val="0"/>
-        </w:rPr>
-        <w:t>Slides 32, 35</w:t>
-      </w:r>
-      <w:r>
-        <w:rPr>
-          <w:b w:val="0"/>
-          <w:i w:val="0"/>
-        </w:rPr>
-        <w:t>Treatment/Therapy</w:t>
-      </w:r>
-      <w:r>
-        <w:rPr>
-          <w:b w:val="0"/>
-          <w:i w:val="0"/>
-        </w:rPr>
-        <w:t xml:space="preserve">See stable angina: sublingual nitroglycerin is the cornerstone </w:t>
-      </w:r>
-      <w:r>
-        <w:rPr>
-          <w:b w:val="0"/>
-          <w:i w:val="0"/>
-        </w:rPr>
-        <w:t>Slides 39–41</w:t>
-      </w:r>
-      <w:r>
-        <w:rPr>
-          <w:b w:val="0"/>
-          <w:i w:val="0"/>
-        </w:rPr>
-        <w:t>Mortality ★</w:t>
-      </w:r>
-      <w:r>
-        <w:rPr>
-          <w:b w:val="0"/>
-          <w:i w:val="0"/>
-        </w:rPr>
-        <w:t>Not covered in the lecture</w:t>
+        <w:t>Ischemic heart disease (general CAD)</w:t>
+      </w:r>
+      <w:r>
+        <w:rPr>
+          <w:b w:val="0"/>
+          <w:i w:val="0"/>
+        </w:rPr>
+        <w:t>★ Professor emphasized</w:t>
       </w:r>
     </w:p>
     <w:p>
@@ -12494,213 +12130,7 @@
           <w:b w:val="0"/>
           <w:i w:val="0"/>
         </w:rPr>
-        <w:t>Stable angina (SIHD)</w:t>
-      </w:r>
-      <w:r>
-        <w:rPr>
-          <w:b w:val="0"/>
-          <w:i w:val="0"/>
-        </w:rPr>
-        <w:t>2 not covered</w:t>
-      </w:r>
-      <w:r>
-        <w:br/>
-      </w:r>
-      <w:r>
-        <w:rPr>
-          <w:b w:val="0"/>
-          <w:i w:val="0"/>
-        </w:rPr>
-        <w:t>Name of Condition</w:t>
-      </w:r>
-      <w:r>
-        <w:rPr>
-          <w:b w:val="0"/>
-          <w:i w:val="0"/>
-        </w:rPr>
-        <w:t xml:space="preserve">Stable angina; SIHD (stable ischemic heart disease) </w:t>
-      </w:r>
-      <w:r>
-        <w:rPr>
-          <w:b w:val="0"/>
-          <w:i w:val="0"/>
-        </w:rPr>
-        <w:t>Slides 36–37</w:t>
-      </w:r>
-      <w:r>
-        <w:rPr>
-          <w:b w:val="0"/>
-          <w:i w:val="0"/>
-        </w:rPr>
-        <w:t>Definition</w:t>
-      </w:r>
-      <w:r>
-        <w:rPr>
-          <w:b w:val="0"/>
-          <w:i w:val="0"/>
-        </w:rPr>
-        <w:t xml:space="preserve">Angina usually brought on by activity and relieved by rest and nitroglycerin (unstable angina occurs at rest) </w:t>
-      </w:r>
-      <w:r>
-        <w:rPr>
-          <w:b w:val="0"/>
-          <w:i w:val="0"/>
-        </w:rPr>
-        <w:t>Slides 37, 86</w:t>
-      </w:r>
-      <w:r>
-        <w:rPr>
-          <w:b w:val="0"/>
-          <w:i w:val="0"/>
-        </w:rPr>
-        <w:t>Etiology (cause)</w:t>
-      </w:r>
-      <w:r>
-        <w:rPr>
-          <w:b w:val="0"/>
-          <w:i w:val="0"/>
-        </w:rPr>
-        <w:t xml:space="preserve">Exertion raises myocardial oxygen demand </w:t>
-      </w:r>
-      <w:r>
-        <w:rPr>
-          <w:b w:val="0"/>
-          <w:i w:val="0"/>
-        </w:rPr>
-        <w:t>Slides 6, 37</w:t>
-      </w:r>
-      <w:r>
-        <w:rPr>
-          <w:b w:val="0"/>
-          <w:i w:val="0"/>
-        </w:rPr>
-        <w:t>Epidemiology (who)</w:t>
-      </w:r>
-      <w:r>
-        <w:rPr>
-          <w:b w:val="0"/>
-          <w:i w:val="0"/>
-        </w:rPr>
-        <w:t xml:space="preserve">Most common form of angina pectoris </w:t>
-      </w:r>
-      <w:r>
-        <w:rPr>
-          <w:b w:val="0"/>
-          <w:i w:val="0"/>
-        </w:rPr>
-        <w:t>Slide 37</w:t>
-      </w:r>
-      <w:r>
-        <w:rPr>
-          <w:b w:val="0"/>
-          <w:i w:val="0"/>
-        </w:rPr>
-        <w:t>Risk Factors</w:t>
-      </w:r>
-      <w:r>
-        <w:rPr>
-          <w:b w:val="0"/>
-          <w:i w:val="0"/>
-        </w:rPr>
-        <w:t xml:space="preserve">Coronary artery disease risk factors </w:t>
-      </w:r>
-      <w:r>
-        <w:rPr>
-          <w:b w:val="0"/>
-          <w:i w:val="0"/>
-        </w:rPr>
-        <w:t>Slides 22–23</w:t>
-      </w:r>
-      <w:r>
-        <w:rPr>
-          <w:b w:val="0"/>
-          <w:i w:val="0"/>
-        </w:rPr>
-        <w:t>Pathology</w:t>
-      </w:r>
-      <w:r>
-        <w:rPr>
-          <w:b w:val="0"/>
-          <w:i w:val="0"/>
-        </w:rPr>
-        <w:t>Not covered in the lecture</w:t>
-      </w:r>
-      <w:r>
-        <w:rPr>
-          <w:b w:val="0"/>
-          <w:i w:val="0"/>
-        </w:rPr>
-        <w:t>Clinical Manifestation</w:t>
-      </w:r>
-      <w:r>
-        <w:rPr>
-          <w:b w:val="0"/>
-          <w:i w:val="0"/>
-        </w:rPr>
-        <w:t xml:space="preserve">Pain with exertion; improves with nitroglycerin; resolves with rest </w:t>
-      </w:r>
-      <w:r>
-        <w:rPr>
-          <w:b w:val="0"/>
-          <w:i w:val="0"/>
-        </w:rPr>
-        <w:t>Slides 37, 86</w:t>
-      </w:r>
-      <w:r>
-        <w:rPr>
-          <w:b w:val="0"/>
-          <w:i w:val="0"/>
-        </w:rPr>
-        <w:t>Diagnosis</w:t>
-      </w:r>
-      <w:r>
-        <w:rPr>
-          <w:b w:val="0"/>
-          <w:i w:val="0"/>
-        </w:rPr>
-        <w:t xml:space="preserve">Stress-test ECG (electrocardiogram) changes, usually T-wave inversion: exercise treadmill, nuclear stress, cardiac CT (computed tomography); coronary angiography is the gold standard for CAD (coronary artery disease) </w:t>
-      </w:r>
-      <w:r>
-        <w:rPr>
-          <w:b w:val="0"/>
-          <w:i w:val="0"/>
-        </w:rPr>
-        <w:t>Slide 38</w:t>
-      </w:r>
-      <w:r>
-        <w:rPr>
-          <w:b w:val="0"/>
-          <w:i w:val="0"/>
-        </w:rPr>
-        <w:t>Treatment/Therapy</w:t>
-      </w:r>
-      <w:r>
-        <w:rPr>
-          <w:b w:val="0"/>
-          <w:i w:val="0"/>
-        </w:rPr>
-        <w:t xml:space="preserve">Sublingual nitroglycerin (venodilator: ↓ preload → ↓ wall stress → ↓ oxygen demand; also dilates arteries); call EMS (emergency medical services) if no relief 5 min after a dose or after 3 doses; lifestyle modification; beta-blocker (calcium channel blocker if contraindicated); statin; aspirin; prevention: aspirin + clopidogrel, more effective together </w:t>
-      </w:r>
-      <w:r>
-        <w:rPr>
-          <w:b w:val="0"/>
-          <w:i w:val="0"/>
-        </w:rPr>
-        <w:t>Slides 39–41</w:t>
-      </w:r>
-      <w:r>
-        <w:rPr>
-          <w:b w:val="0"/>
-          <w:i w:val="0"/>
-        </w:rPr>
-        <w:t>Mortality ★</w:t>
-      </w:r>
-      <w:r>
-        <w:rPr>
-          <w:b w:val="0"/>
-          <w:i w:val="0"/>
-        </w:rPr>
-        <w:t>Not covered in the lecture</w:t>
+        <w:t>★ The right coronary artery supplies the atrioventricular node (complete heart block); the anterior interventricular artery is the LAD, the most common culprit</w:t>
       </w:r>
     </w:p>
     <w:p>
@@ -12712,23 +12142,6 @@
           <w:b w:val="0"/>
           <w:i w:val="0"/>
         </w:rPr>
-        <w:t>Acute coronary syndrome</w:t>
-      </w:r>
-      <w:r>
-        <w:rPr>
-          <w:b w:val="0"/>
-          <w:i w:val="0"/>
-        </w:rPr>
-        <w:t>1 not covered</w:t>
-      </w:r>
-      <w:r>
-        <w:br/>
-      </w:r>
-      <w:r>
-        <w:rPr>
-          <w:b w:val="0"/>
-          <w:i w:val="0"/>
-        </w:rPr>
         <w:t>Name of Condition</w:t>
       </w:r>
       <w:r>
@@ -12736,14 +12149,14 @@
           <w:b w:val="0"/>
           <w:i w:val="0"/>
         </w:rPr>
-        <w:t xml:space="preserve">ACS (acute coronary syndromes) </w:t>
-      </w:r>
-      <w:r>
-        <w:rPr>
-          <w:b w:val="0"/>
-          <w:i w:val="0"/>
-        </w:rPr>
-        <w:t>Slides 4, 42–43</w:t>
+        <w:t xml:space="preserve">Ischemic heart disease; coronary artery disease (CAD) / ischemia; ischemic myocardium </w:t>
+      </w:r>
+      <w:r>
+        <w:rPr>
+          <w:b w:val="0"/>
+          <w:i w:val="0"/>
+        </w:rPr>
+        <w:t>Slides 1, 4, 5</w:t>
       </w:r>
       <w:r>
         <w:rPr>
@@ -12757,14 +12170,14 @@
           <w:b w:val="0"/>
           <w:i w:val="0"/>
         </w:rPr>
-        <w:t xml:space="preserve">Umbrella for unstable angina, NSTEMI (non-ST-elevation myocardial infarction) and STEMI (ST-elevation myocardial infarction) </w:t>
-      </w:r>
-      <w:r>
-        <w:rPr>
-          <w:b w:val="0"/>
-          <w:i w:val="0"/>
-        </w:rPr>
-        <w:t>Slides 42–43</w:t>
+        <w:t xml:space="preserve">Mismatch between myocardial oxygen demand and oxygen supply </w:t>
+      </w:r>
+      <w:r>
+        <w:rPr>
+          <w:b w:val="0"/>
+          <w:i w:val="0"/>
+        </w:rPr>
+        <w:t>Slide 5</w:t>
       </w:r>
       <w:r>
         <w:rPr>
@@ -12778,14 +12191,14 @@
           <w:b w:val="0"/>
           <w:i w:val="0"/>
         </w:rPr>
-        <w:t xml:space="preserve">Plaque rupture → platelet activation + tissue factor → clotting cascade → fibrin </w:t>
-      </w:r>
-      <w:r>
-        <w:rPr>
-          <w:b w:val="0"/>
-          <w:i w:val="0"/>
-        </w:rPr>
-        <w:t>Slide 20</w:t>
+        <w:t xml:space="preserve">↓ oxygen supply: atherosclerosis, thrombus/embolus, anemia, spasm, dissection, carboxyhemoglobin, hypoxia; ↑ oxygen demand: exercise, emotional stress, LVH (left ventricular hypertrophy)/cardiomyopathy, hyperthyroidism, hyperthermia, cocaine </w:t>
+      </w:r>
+      <w:r>
+        <w:rPr>
+          <w:b w:val="0"/>
+          <w:i w:val="0"/>
+        </w:rPr>
+        <w:t>Slide 6</w:t>
       </w:r>
       <w:r>
         <w:rPr>
@@ -12799,7 +12212,44 @@
           <w:b w:val="0"/>
           <w:i w:val="0"/>
         </w:rPr>
-        <w:t>Not covered in the lecture</w:t>
+        <w:t xml:space="preserve">Culprit vessel in acute MI (myocardial infarction): </w:t>
+      </w:r>
+      <w:r>
+        <w:rPr>
+          <w:b w:val="0"/>
+          <w:i w:val="0"/>
+          <w:highlight w:val="yellow"/>
+        </w:rPr>
+        <w:t>★ AIV (anterior interventricular artery) = LAD (left anterior descending)</w:t>
+      </w:r>
+      <w:r>
+        <w:rPr>
+          <w:b w:val="0"/>
+          <w:i w:val="0"/>
+        </w:rPr>
+        <w:t xml:space="preserve"> 40–50%, the most common; RCA (right coronary artery) 30–40%; left circumflex 15–20%. </w:t>
+      </w:r>
+      <w:r>
+        <w:rPr>
+          <w:b w:val="0"/>
+          <w:i w:val="0"/>
+          <w:highlight w:val="yellow"/>
+        </w:rPr>
+        <w:t>★ RCA supplies the AV (atrioventricular) node</w:t>
+      </w:r>
+      <w:r>
+        <w:rPr>
+          <w:b w:val="0"/>
+          <w:i w:val="0"/>
+        </w:rPr>
+        <w:t xml:space="preserve"> (complete heart block); SA (sinoatrial) node from the RCA in 60%, circumflex in 40% </w:t>
+      </w:r>
+      <w:r>
+        <w:rPr>
+          <w:b w:val="0"/>
+          <w:i w:val="0"/>
+        </w:rPr>
+        <w:t>Slides 11, 14</w:t>
       </w:r>
       <w:r>
         <w:rPr>
@@ -12813,14 +12263,14 @@
           <w:b w:val="0"/>
           <w:i w:val="0"/>
         </w:rPr>
-        <w:t xml:space="preserve">CAD (coronary artery disease) risk factors; HEART/TIMI (Thrombolysis in Myocardial Infarction) risk factors: diabetes, hypertension, hyperlipidemia, obesity, smoking, family history of CAD, known CAD </w:t>
-      </w:r>
-      <w:r>
-        <w:rPr>
-          <w:b w:val="0"/>
-          <w:i w:val="0"/>
-        </w:rPr>
-        <w:t>Slides 22–23, 34, 71</w:t>
+        <w:t xml:space="preserve">Nonmodifiable: age ≥45 men / ≥55 women; male &gt; premenopausal female (gap narrows by ~80); sudden death/MI in male first-degree relative &lt;55 or female &lt;65. Modifiable: obesity, dyslipidemia, diabetes, smoking (strong predictor, especially women &lt;45), hypertension, excessive alcohol, sedentary lifestyle, poor stress management </w:t>
+      </w:r>
+      <w:r>
+        <w:rPr>
+          <w:b w:val="0"/>
+          <w:i w:val="0"/>
+        </w:rPr>
+        <w:t>Slides 21–23</w:t>
       </w:r>
       <w:r>
         <w:rPr>
@@ -12834,14 +12284,14 @@
           <w:b w:val="0"/>
           <w:i w:val="0"/>
         </w:rPr>
-        <w:t xml:space="preserve">Plaque rupture with thrombus </w:t>
-      </w:r>
-      <w:r>
-        <w:rPr>
-          <w:b w:val="0"/>
-          <w:i w:val="0"/>
-        </w:rPr>
-        <w:t>Slide 20</w:t>
+        <w:t xml:space="preserve">Heart is 0.3% of body weight but uses 7% of oxygen; irreversible injury in 40–60 min; anaerobic shift ↑ lactic acid; injury from free radicals, lactic acid, ↑ extracellular calcium; wall hypokinesia/akinesia/dyskinesia. Atherosclerosis (fat, smooth muscle, fibroblasts, matrix): thick-cap atheroma vs thin-cap fibroatheroma; plaque rupture → platelet activation + tissue factor → clotting cascade → fibrin </w:t>
+      </w:r>
+      <w:r>
+        <w:rPr>
+          <w:b w:val="0"/>
+          <w:i w:val="0"/>
+        </w:rPr>
+        <w:t>Slides 7–9, 17–20</w:t>
       </w:r>
       <w:r>
         <w:rPr>
@@ -12855,14 +12305,14 @@
           <w:b w:val="0"/>
           <w:i w:val="0"/>
         </w:rPr>
-        <w:t xml:space="preserve">Referred pain most often to jaw/tooth/arm, also back, scapula, epigastric/left upper quadrant </w:t>
-      </w:r>
-      <w:r>
-        <w:rPr>
-          <w:b w:val="0"/>
-          <w:i w:val="0"/>
-        </w:rPr>
-        <w:t>Slide 31</w:t>
+        <w:t xml:space="preserve">Typical pain: substernal pressure, worse with exertion, radiates to neck/shoulder, shortness of breath, diaphoresis, relieved by nitroglycerin; ischemia may be silent </w:t>
+      </w:r>
+      <w:r>
+        <w:rPr>
+          <w:b w:val="0"/>
+          <w:i w:val="0"/>
+        </w:rPr>
+        <w:t>Slides 25, 29–30</w:t>
       </w:r>
       <w:r>
         <w:rPr>
@@ -12876,14 +12326,29 @@
           <w:b w:val="0"/>
           <w:i w:val="0"/>
         </w:rPr>
-        <w:t xml:space="preserve">Chest-pain workup; risk scores GRACE, TIMI, PURSUIT, HEART. HEART (History, ECG, Age, Risk factors, Troponin): 0–3 → 0.9–1.7% MACE (major adverse cardiac events), discharge; 4–6 → 12–16.6%, admit; ≥7 → 50–65%, likely cath lab for PCI (percutaneous coronary intervention) </w:t>
-      </w:r>
-      <w:r>
-        <w:rPr>
-          <w:b w:val="0"/>
-          <w:i w:val="0"/>
-        </w:rPr>
-        <w:t>Slides 32–34</w:t>
+        <w:t xml:space="preserve">All chest pain: chest X-ray + STAT ECG (electrocardiogram); CBC (complete blood count), metabolic panel, PT/PTT (prothrombin/partial thromboplastin time), troponin, lipids; maybe drug screen, D-dimer, lipase, pro-BNP (pro-B-type natriuretic peptide). Risk scores: GRACE, TIMI (Thrombolysis in Myocardial Infarction), PURSUIT, HEART. </w:t>
+      </w:r>
+      <w:r>
+        <w:rPr>
+          <w:b w:val="0"/>
+          <w:i w:val="0"/>
+          <w:highlight w:val="yellow"/>
+        </w:rPr>
+        <w:t>★ Cardiac CT (computed tomography) calcium score = risk stratification, not ACS (acute coronary syndrome)</w:t>
+      </w:r>
+      <w:r>
+        <w:rPr>
+          <w:b w:val="0"/>
+          <w:i w:val="0"/>
+        </w:rPr>
+        <w:t xml:space="preserve">; treadmill ECG; nuclear stress (abnormal → cardiac catheterization; the slide's sensitivity/specificity figures are not tested); echo (regional wall motion); coronary CT angiography </w:t>
+      </w:r>
+      <w:r>
+        <w:rPr>
+          <w:b w:val="0"/>
+          <w:i w:val="0"/>
+        </w:rPr>
+        <w:t>Slides 32–35</w:t>
       </w:r>
       <w:r>
         <w:rPr>
@@ -12897,14 +12362,14 @@
           <w:b w:val="0"/>
           <w:i w:val="0"/>
         </w:rPr>
-        <w:t xml:space="preserve">High-intensity statin (atorvastatin, rosuvastatin) for all ACS regardless of LDL (low-density lipoprotein), started before discharge </w:t>
-      </w:r>
-      <w:r>
-        <w:rPr>
-          <w:b w:val="0"/>
-          <w:i w:val="0"/>
-        </w:rPr>
-        <w:t>Slide 81</w:t>
+        <w:t xml:space="preserve">Per syndrome (see cards below); risk-factor control: blood pressure, lipids, glucose, weight loss, alcohol restriction, exercise, smoking cessation, stress </w:t>
+      </w:r>
+      <w:r>
+        <w:rPr>
+          <w:b w:val="0"/>
+          <w:i w:val="0"/>
+        </w:rPr>
+        <w:t>Slide 79</w:t>
       </w:r>
       <w:r>
         <w:rPr>
@@ -12918,14 +12383,14 @@
           <w:b w:val="0"/>
           <w:i w:val="0"/>
         </w:rPr>
-        <w:t xml:space="preserve">HEART ≥7: 50–65% risk of MACE (major adverse cardiac events: all-cause death, MI (myocardial infarction) or revascularization within 6 weeks) </w:t>
-      </w:r>
-      <w:r>
-        <w:rPr>
-          <w:b w:val="0"/>
-          <w:i w:val="0"/>
-        </w:rPr>
-        <w:t>Slide 34</w:t>
+        <w:t xml:space="preserve">LV (left ventricular) involvement carries higher mortality; sudden cardiac death is the first manifestation of CAD in &gt;20% </w:t>
+      </w:r>
+      <w:r>
+        <w:rPr>
+          <w:b w:val="0"/>
+          <w:i w:val="0"/>
+        </w:rPr>
+        <w:t>Slides 12, 85</w:t>
       </w:r>
     </w:p>
     <w:p>
@@ -12937,7 +12402,14 @@
           <w:b w:val="0"/>
           <w:i w:val="0"/>
         </w:rPr>
-        <w:t>Unstable angina</w:t>
+        <w:t>Angina pectoris</w:t>
+      </w:r>
+      <w:r>
+        <w:rPr>
+          <w:b w:val="0"/>
+          <w:i w:val="0"/>
+        </w:rPr>
+        <w:t>★ Professor emphasized</w:t>
       </w:r>
       <w:r>
         <w:rPr>
@@ -12945,205 +12417,6 @@
           <w:i w:val="0"/>
         </w:rPr>
         <w:t>2 not covered</w:t>
-      </w:r>
-      <w:r>
-        <w:br/>
-      </w:r>
-      <w:r>
-        <w:rPr>
-          <w:b w:val="0"/>
-          <w:i w:val="0"/>
-        </w:rPr>
-        <w:t>Name of Condition</w:t>
-      </w:r>
-      <w:r>
-        <w:rPr>
-          <w:b w:val="0"/>
-          <w:i w:val="0"/>
-        </w:rPr>
-        <w:t xml:space="preserve">Unstable angina (UA) </w:t>
-      </w:r>
-      <w:r>
-        <w:rPr>
-          <w:b w:val="0"/>
-          <w:i w:val="0"/>
-        </w:rPr>
-        <w:t>Slides 44–45</w:t>
-      </w:r>
-      <w:r>
-        <w:rPr>
-          <w:b w:val="0"/>
-          <w:i w:val="0"/>
-        </w:rPr>
-        <w:t>Definition</w:t>
-      </w:r>
-      <w:r>
-        <w:rPr>
-          <w:b w:val="0"/>
-          <w:i w:val="0"/>
-        </w:rPr>
-        <w:t xml:space="preserve">Change in a patient's stable angina, considered ACS (acute coronary syndrome): occurs at rest, new-onset and activity-limiting, or increasing (more discomfort, more often) </w:t>
-      </w:r>
-      <w:r>
-        <w:rPr>
-          <w:b w:val="0"/>
-          <w:i w:val="0"/>
-        </w:rPr>
-        <w:t>Slide 45</w:t>
-      </w:r>
-      <w:r>
-        <w:rPr>
-          <w:b w:val="0"/>
-          <w:i w:val="0"/>
-        </w:rPr>
-        <w:t>Etiology (cause)</w:t>
-      </w:r>
-      <w:r>
-        <w:rPr>
-          <w:b w:val="0"/>
-          <w:i w:val="0"/>
-        </w:rPr>
-        <w:t xml:space="preserve">Braunwald clinical situation: A secondary (extracardiac condition worsens ischemia); B primary; C post-infarction (within 2 weeks of MI (myocardial infarction)) </w:t>
-      </w:r>
-      <w:r>
-        <w:rPr>
-          <w:b w:val="0"/>
-          <w:i w:val="0"/>
-        </w:rPr>
-        <w:t>Slide 54</w:t>
-      </w:r>
-      <w:r>
-        <w:rPr>
-          <w:b w:val="0"/>
-          <w:i w:val="0"/>
-        </w:rPr>
-        <w:t>Epidemiology (who)</w:t>
-      </w:r>
-      <w:r>
-        <w:rPr>
-          <w:b w:val="0"/>
-          <w:i w:val="0"/>
-        </w:rPr>
-        <w:t>Not covered in the lecture</w:t>
-      </w:r>
-      <w:r>
-        <w:rPr>
-          <w:b w:val="0"/>
-          <w:i w:val="0"/>
-        </w:rPr>
-        <w:t>Risk Factors</w:t>
-      </w:r>
-      <w:r>
-        <w:rPr>
-          <w:b w:val="0"/>
-          <w:i w:val="0"/>
-        </w:rPr>
-        <w:t xml:space="preserve">TIMI (Thrombolysis in Myocardial Infarction) criteria: age ≥65; ≥3 CAD (coronary artery disease) risk factors; known stenosis &gt;50%; aspirin in past 7 days; ≥2 angina episodes in 24 h; ST deviation ≥0.5 mm; elevated marker </w:t>
-      </w:r>
-      <w:r>
-        <w:rPr>
-          <w:b w:val="0"/>
-          <w:i w:val="0"/>
-        </w:rPr>
-        <w:t>Slide 71</w:t>
-      </w:r>
-      <w:r>
-        <w:rPr>
-          <w:b w:val="0"/>
-          <w:i w:val="0"/>
-        </w:rPr>
-        <w:t>Pathology</w:t>
-      </w:r>
-      <w:r>
-        <w:rPr>
-          <w:b w:val="0"/>
-          <w:i w:val="0"/>
-        </w:rPr>
-        <w:t>Not covered in the lecture</w:t>
-      </w:r>
-      <w:r>
-        <w:rPr>
-          <w:b w:val="0"/>
-          <w:i w:val="0"/>
-        </w:rPr>
-        <w:t>Clinical Manifestation</w:t>
-      </w:r>
-      <w:r>
-        <w:rPr>
-          <w:b w:val="0"/>
-          <w:i w:val="0"/>
-        </w:rPr>
-        <w:t xml:space="preserve">Pain at rest; nitroglycerin usually (not always) helps </w:t>
-      </w:r>
-      <w:r>
-        <w:rPr>
-          <w:b w:val="0"/>
-          <w:i w:val="0"/>
-        </w:rPr>
-        <w:t>Slides 46, 86</w:t>
-      </w:r>
-      <w:r>
-        <w:rPr>
-          <w:b w:val="0"/>
-          <w:i w:val="0"/>
-        </w:rPr>
-        <w:t>Diagnosis</w:t>
-      </w:r>
-      <w:r>
-        <w:rPr>
-          <w:b w:val="0"/>
-          <w:i w:val="0"/>
-        </w:rPr>
-        <w:t xml:space="preserve">Nonspecific ECG (electrocardiogram) changes (usually inverted T waves) with NORMAL troponin (troponin separates UA from NSTEMI (non-ST-elevation MI)); stress-test ST depression or T inversion; nuclear stress: reversible defect = ischemia, fixed = infarction; Braunwald classification (severity I–III, situation A–C) </w:t>
-      </w:r>
-      <w:r>
-        <w:rPr>
-          <w:b w:val="0"/>
-          <w:i w:val="0"/>
-        </w:rPr>
-        <w:t>Slides 46–47, 54</w:t>
-      </w:r>
-      <w:r>
-        <w:rPr>
-          <w:b w:val="0"/>
-          <w:i w:val="0"/>
-        </w:rPr>
-        <w:t>Treatment/Therapy</w:t>
-      </w:r>
-      <w:r>
-        <w:rPr>
-          <w:b w:val="0"/>
-          <w:i w:val="0"/>
-        </w:rPr>
-        <w:t xml:space="preserve">Medical emergency, same as NSTEMI: chewable aspirin, beta-blocker, IV nitrates; DAPT (dual antiplatelet therapy: aspirin + clopidogrel) ± anticoagulation; MONA (morphine, oxygen, nitroglycerin, aspirin), oxygen only if SpO2 &lt;91%. After stabilization: left heart catheterization/angiography, balloon angioplasty, PCI (percutaneous coronary intervention) with stent. Post-PCI: DAPT (clopidogrel ≥12 mo, aspirin ≥6 mo), statin, ACE (angiotensin-converting enzyme) inhibitor, anticoagulant if indicated; exercise as tolerated, low-salt/low-fat diet, follow-up 3/6/12 mo </w:t>
-      </w:r>
-      <w:r>
-        <w:rPr>
-          <w:b w:val="0"/>
-          <w:i w:val="0"/>
-        </w:rPr>
-        <w:t>Slides 48–53</w:t>
-      </w:r>
-      <w:r>
-        <w:rPr>
-          <w:b w:val="0"/>
-          <w:i w:val="0"/>
-        </w:rPr>
-        <w:t>Mortality ★</w:t>
-      </w:r>
-      <w:r>
-        <w:rPr>
-          <w:b w:val="0"/>
-          <w:i w:val="0"/>
-        </w:rPr>
-        <w:t xml:space="preserve">TIMI score → death/MI/urgent revascularization by day 14: 0–1 5%, 2 8%, 3 13%, 4 20%, 5 26%, 6–7 41%; TIMI 3–7 needs ICU (intensive care unit) or emergent revascularization; Braunwald class IIIB: troponin status estimates prognosis </w:t>
-      </w:r>
-      <w:r>
-        <w:rPr>
-          <w:b w:val="0"/>
-          <w:i w:val="0"/>
-        </w:rPr>
-        <w:t>Slides 72, 54</w:t>
       </w:r>
     </w:p>
     <w:p>
@@ -13155,213 +12428,7 @@
           <w:b w:val="0"/>
           <w:i w:val="0"/>
         </w:rPr>
-        <w:t>NSTEMI</w:t>
-      </w:r>
-      <w:r>
-        <w:rPr>
-          <w:b w:val="0"/>
-          <w:i w:val="0"/>
-        </w:rPr>
-        <w:t>2 not covered</w:t>
-      </w:r>
-      <w:r>
-        <w:br/>
-      </w:r>
-      <w:r>
-        <w:rPr>
-          <w:b w:val="0"/>
-          <w:i w:val="0"/>
-        </w:rPr>
-        <w:t>Name of Condition</w:t>
-      </w:r>
-      <w:r>
-        <w:rPr>
-          <w:b w:val="0"/>
-          <w:i w:val="0"/>
-        </w:rPr>
-        <w:t xml:space="preserve">NSTEMI (non-ST-elevation myocardial infarction); non-ST elevation ischemia </w:t>
-      </w:r>
-      <w:r>
-        <w:rPr>
-          <w:b w:val="0"/>
-          <w:i w:val="0"/>
-        </w:rPr>
-        <w:t>Slides 4, 56, 86</w:t>
-      </w:r>
-      <w:r>
-        <w:rPr>
-          <w:b w:val="0"/>
-          <w:i w:val="0"/>
-        </w:rPr>
-        <w:t>Definition</w:t>
-      </w:r>
-      <w:r>
-        <w:rPr>
-          <w:b w:val="0"/>
-          <w:i w:val="0"/>
-        </w:rPr>
-        <w:t xml:space="preserve">MI (myocardial infarction) diagnosed by ECG (electrocardiogram) changes + ischemic symptoms + elevated troponin/high-sensitivity troponin </w:t>
-      </w:r>
-      <w:r>
-        <w:rPr>
-          <w:b w:val="0"/>
-          <w:i w:val="0"/>
-        </w:rPr>
-        <w:t>Slide 47</w:t>
-      </w:r>
-      <w:r>
-        <w:rPr>
-          <w:b w:val="0"/>
-          <w:i w:val="0"/>
-        </w:rPr>
-        <w:t>Etiology (cause)</w:t>
-      </w:r>
-      <w:r>
-        <w:rPr>
-          <w:b w:val="0"/>
-          <w:i w:val="0"/>
-        </w:rPr>
-        <w:t>Not covered in the lecture</w:t>
-      </w:r>
-      <w:r>
-        <w:rPr>
-          <w:b w:val="0"/>
-          <w:i w:val="0"/>
-        </w:rPr>
-        <w:t>Epidemiology (who)</w:t>
-      </w:r>
-      <w:r>
-        <w:rPr>
-          <w:b w:val="0"/>
-          <w:i w:val="0"/>
-        </w:rPr>
-        <w:t>Not covered in the lecture</w:t>
-      </w:r>
-      <w:r>
-        <w:rPr>
-          <w:b w:val="0"/>
-          <w:i w:val="0"/>
-        </w:rPr>
-        <w:t>Risk Factors</w:t>
-      </w:r>
-      <w:r>
-        <w:rPr>
-          <w:b w:val="0"/>
-          <w:i w:val="0"/>
-        </w:rPr>
-        <w:t xml:space="preserve">TIMI (Thrombolysis in Myocardial Infarction) criteria </w:t>
-      </w:r>
-      <w:r>
-        <w:rPr>
-          <w:b w:val="0"/>
-          <w:i w:val="0"/>
-        </w:rPr>
-        <w:t>Slide 71</w:t>
-      </w:r>
-      <w:r>
-        <w:rPr>
-          <w:b w:val="0"/>
-          <w:i w:val="0"/>
-        </w:rPr>
-        <w:t>Pathology</w:t>
-      </w:r>
-      <w:r>
-        <w:rPr>
-          <w:b w:val="0"/>
-          <w:i w:val="0"/>
-        </w:rPr>
-        <w:t xml:space="preserve">Subendocardial ischemia → ST depression </w:t>
-      </w:r>
-      <w:r>
-        <w:rPr>
-          <w:b w:val="0"/>
-          <w:i w:val="0"/>
-        </w:rPr>
-        <w:t>Slide 55</w:t>
-      </w:r>
-      <w:r>
-        <w:rPr>
-          <w:b w:val="0"/>
-          <w:i w:val="0"/>
-        </w:rPr>
-        <w:t>Clinical Manifestation</w:t>
-      </w:r>
-      <w:r>
-        <w:rPr>
-          <w:b w:val="0"/>
-          <w:i w:val="0"/>
-        </w:rPr>
-        <w:t xml:space="preserve">Signs and symptoms of ischemia; nitroglycerin may help the pain </w:t>
-      </w:r>
-      <w:r>
-        <w:rPr>
-          <w:b w:val="0"/>
-          <w:i w:val="0"/>
-        </w:rPr>
-        <w:t>Slides 47, 86</w:t>
-      </w:r>
-      <w:r>
-        <w:rPr>
-          <w:b w:val="0"/>
-          <w:i w:val="0"/>
-        </w:rPr>
-        <w:t>Diagnosis</w:t>
-      </w:r>
-      <w:r>
-        <w:rPr>
-          <w:b w:val="0"/>
-          <w:i w:val="0"/>
-        </w:rPr>
-        <w:t xml:space="preserve">Slide 47: ST depression &gt;1 mm and/or T-wave inversion in ≥2 consecutive leads; slide 86 says "ST inversion (&gt;1 mm)" in ≥2 leads; ELEVATED troponin is what separates it from unstable angina </w:t>
-      </w:r>
-      <w:r>
-        <w:rPr>
-          <w:b w:val="0"/>
-          <w:i w:val="0"/>
-        </w:rPr>
-        <w:t>Slides 47, 56, 86</w:t>
-      </w:r>
-      <w:r>
-        <w:rPr>
-          <w:b w:val="0"/>
-          <w:i w:val="0"/>
-        </w:rPr>
-        <w:t>Treatment/Therapy</w:t>
-      </w:r>
-      <w:r>
-        <w:rPr>
-          <w:b w:val="0"/>
-          <w:i w:val="0"/>
-        </w:rPr>
-        <w:t xml:space="preserve">Treated the same as unstable angina (see that card) </w:t>
-      </w:r>
-      <w:r>
-        <w:rPr>
-          <w:b w:val="0"/>
-          <w:i w:val="0"/>
-        </w:rPr>
-        <w:t>Slides 48–53</w:t>
-      </w:r>
-      <w:r>
-        <w:rPr>
-          <w:b w:val="0"/>
-          <w:i w:val="0"/>
-        </w:rPr>
-        <w:t>Mortality ★</w:t>
-      </w:r>
-      <w:r>
-        <w:rPr>
-          <w:b w:val="0"/>
-          <w:i w:val="0"/>
-        </w:rPr>
-        <w:t xml:space="preserve">TIMI score table as for unstable angina </w:t>
-      </w:r>
-      <w:r>
-        <w:rPr>
-          <w:b w:val="0"/>
-          <w:i w:val="0"/>
-        </w:rPr>
-        <w:t>Slide 72</w:t>
+        <w:t>★ Silent ischemia in diabetes, neuropathy and a transplanted heart presents as dyspnea, nausea or fatigue; angina is not positional</w:t>
       </w:r>
     </w:p>
     <w:p>
@@ -13373,23 +12440,6 @@
           <w:b w:val="0"/>
           <w:i w:val="0"/>
         </w:rPr>
-        <w:t>STEMI (transmural MI)</w:t>
-      </w:r>
-      <w:r>
-        <w:rPr>
-          <w:b w:val="0"/>
-          <w:i w:val="0"/>
-        </w:rPr>
-        <w:t>1 not covered</w:t>
-      </w:r>
-      <w:r>
-        <w:br/>
-      </w:r>
-      <w:r>
-        <w:rPr>
-          <w:b w:val="0"/>
-          <w:i w:val="0"/>
-        </w:rPr>
         <w:t>Name of Condition</w:t>
       </w:r>
       <w:r>
@@ -13397,14 +12447,14 @@
           <w:b w:val="0"/>
           <w:i w:val="0"/>
         </w:rPr>
-        <w:t xml:space="preserve">STEMI (ST-elevation myocardial infarction); transmural myocardial infarction (MI) </w:t>
-      </w:r>
-      <w:r>
-        <w:rPr>
-          <w:b w:val="0"/>
-          <w:i w:val="0"/>
-        </w:rPr>
-        <w:t>Slides 57, 65</w:t>
+        <w:t xml:space="preserve">Angina pectoris </w:t>
+      </w:r>
+      <w:r>
+        <w:rPr>
+          <w:b w:val="0"/>
+          <w:i w:val="0"/>
+        </w:rPr>
+        <w:t>Slides 24, 27</w:t>
       </w:r>
       <w:r>
         <w:rPr>
@@ -13418,14 +12468,14 @@
           <w:b w:val="0"/>
           <w:i w:val="0"/>
         </w:rPr>
-        <w:t xml:space="preserve">Myocardial necrosis with ST elevation in ≥2 leads not quickly reversed by nitroglycerin, reciprocal ST depression, new LBBB (left bundle branch block), Q waves; elevated troponin required </w:t>
-      </w:r>
-      <w:r>
-        <w:rPr>
-          <w:b w:val="0"/>
-          <w:i w:val="0"/>
-        </w:rPr>
-        <w:t>Slide 65</w:t>
+        <w:t xml:space="preserve">Transient myocardial ischemia not long or severe enough to cause MI (myocardial infarction); symptoms recur </w:t>
+      </w:r>
+      <w:r>
+        <w:rPr>
+          <w:b w:val="0"/>
+          <w:i w:val="0"/>
+        </w:rPr>
+        <w:t>Slide 27</w:t>
       </w:r>
       <w:r>
         <w:rPr>
@@ -13439,14 +12489,14 @@
           <w:b w:val="0"/>
           <w:i w:val="0"/>
         </w:rPr>
-        <w:t xml:space="preserve">Coronary occlusion; LAD (left anterior descending) most common culprit (40–50%), RCA (right coronary artery) 30–40%, left circumflex 15–20% </w:t>
-      </w:r>
-      <w:r>
-        <w:rPr>
-          <w:b w:val="0"/>
-          <w:i w:val="0"/>
-        </w:rPr>
-        <w:t>Slide 14</w:t>
+        <w:t xml:space="preserve">Oxygen supply/demand mismatch </w:t>
+      </w:r>
+      <w:r>
+        <w:rPr>
+          <w:b w:val="0"/>
+          <w:i w:val="0"/>
+        </w:rPr>
+        <w:t>Slides 5–6</w:t>
       </w:r>
       <w:r>
         <w:rPr>
@@ -13474,7 +12524,7 @@
           <w:b w:val="0"/>
           <w:i w:val="0"/>
         </w:rPr>
-        <w:t xml:space="preserve">CAD (coronary artery disease) risk factors </w:t>
+        <w:t xml:space="preserve">Coronary artery disease risk factors </w:t>
       </w:r>
       <w:r>
         <w:rPr>
@@ -13495,14 +12545,14 @@
           <w:b w:val="0"/>
           <w:i w:val="0"/>
         </w:rPr>
-        <w:t xml:space="preserve">Transmural ischemia → ST elevation; ECG (electrocardiogram) evolution: hyperacute T/ST elevation (minutes–hours) → T inversion + Q (hours–1 day) → Q + coronary T (1 week) → Q wave (months) </w:t>
-      </w:r>
-      <w:r>
-        <w:rPr>
-          <w:b w:val="0"/>
-          <w:i w:val="0"/>
-        </w:rPr>
-        <w:t>Slides 55, 64</w:t>
+        <w:t xml:space="preserve">Intermittent ischemia short of infarction </w:t>
+      </w:r>
+      <w:r>
+        <w:rPr>
+          <w:b w:val="0"/>
+          <w:i w:val="0"/>
+        </w:rPr>
+        <w:t>Slide 27</w:t>
       </w:r>
       <w:r>
         <w:rPr>
@@ -13516,14 +12566,29 @@
           <w:b w:val="0"/>
           <w:i w:val="0"/>
         </w:rPr>
-        <w:t xml:space="preserve">Typical and referred chest pain as for ACS (acute coronary syndrome) </w:t>
-      </w:r>
-      <w:r>
-        <w:rPr>
-          <w:b w:val="0"/>
-          <w:i w:val="0"/>
-        </w:rPr>
-        <w:t>Slides 25, 31</w:t>
+        <w:t xml:space="preserve">Substernal pressure/squeezing/tightness/burning/band-like, worse with exertion, radiates to neck/shoulder, shortness of breath, diaphoresis, relieved by nitroglycerin, not positional; Levine sign (clenched fist held over the sternum). </w:t>
+      </w:r>
+      <w:r>
+        <w:rPr>
+          <w:b w:val="0"/>
+          <w:i w:val="0"/>
+          <w:highlight w:val="yellow"/>
+        </w:rPr>
+        <w:t>★ Silent ischemia (diabetes, neuropathy, transplanted heart)</w:t>
+      </w:r>
+      <w:r>
+        <w:rPr>
+          <w:b w:val="0"/>
+          <w:i w:val="0"/>
+        </w:rPr>
+        <w:t xml:space="preserve"> → dyspnea, cough, nausea/vomiting, abdominal pain, diaphoresis, dizziness, fatigue. Referred: jaw, tooth, arm, back, scapula, epigastric/left upper quadrant </w:t>
+      </w:r>
+      <w:r>
+        <w:rPr>
+          <w:b w:val="0"/>
+          <w:i w:val="0"/>
+        </w:rPr>
+        <w:t>Slides 25–31</w:t>
       </w:r>
       <w:r>
         <w:rPr>
@@ -13537,14 +12602,14 @@
           <w:b w:val="0"/>
           <w:i w:val="0"/>
         </w:rPr>
-        <w:t xml:space="preserve">ECG within 10 min of arrival: ST elevation &gt;1 mm in ≥2 leads + elevated troponin. Localization: lateral I/aVL/V5–V6 → circumflex or LAD diagonal; inferior II/III/aVF → RCA and/or circumflex; anterior/septal V1–V4 → LAD; posterior V7–V9 (ST depression V1–V3); right ventricular V1/V4R </w:t>
-      </w:r>
-      <w:r>
-        <w:rPr>
-          <w:b w:val="0"/>
-          <w:i w:val="0"/>
-        </w:rPr>
-        <w:t>Slides 61–62, 65, 68, 86</w:t>
+        <w:t xml:space="preserve">Chest-pain workup; stress testing; echo; coronary CT (computed tomography) angiography </w:t>
+      </w:r>
+      <w:r>
+        <w:rPr>
+          <w:b w:val="0"/>
+          <w:i w:val="0"/>
+        </w:rPr>
+        <w:t>Slides 32, 35</w:t>
       </w:r>
       <w:r>
         <w:rPr>
@@ -13558,14 +12623,14 @@
           <w:b w:val="0"/>
           <w:i w:val="0"/>
         </w:rPr>
-        <w:t xml:space="preserve">Chewable aspirin; activate cath team for PCI (percutaneous coronary intervention); then ticagrelor/prasugrel/clopidogrel + heparin drip; nitroglycerin (sublingual/paste/infusion); beta-blocker if no bradycardia; if PCI ≥2 h away give thrombolytics within 30 min of arrival (tenecteplase most common); door-to-balloon &lt;90 min; PCI (angioplasty, atherectomy, stent) or CABG (coronary artery bypass graft: mammary/radial artery or saphenous vein). Post-MI: beta-blocker, high-intensity statin, ACE (angiotensin-converting enzyme) inhibitor, aspirin, clopidogrel ~1 year after stent, warfarin for large anterior MI. Oxygen only if SpO2 &lt;91%; no nitroglycerin within 24 h of a PDE (phosphodiesterase) inhibitor </w:t>
-      </w:r>
-      <w:r>
-        <w:rPr>
-          <w:b w:val="0"/>
-          <w:i w:val="0"/>
-        </w:rPr>
-        <w:t>Slides 66–70, 73–74, 76–77, 80–83</w:t>
+        <w:t xml:space="preserve">See stable angina: sublingual nitroglycerin is the cornerstone </w:t>
+      </w:r>
+      <w:r>
+        <w:rPr>
+          <w:b w:val="0"/>
+          <w:i w:val="0"/>
+        </w:rPr>
+        <w:t>Slides 39–41</w:t>
       </w:r>
       <w:r>
         <w:rPr>
@@ -13579,14 +12644,7 @@
           <w:b w:val="0"/>
           <w:i w:val="0"/>
         </w:rPr>
-        <w:t xml:space="preserve">Complications: post-infarction ischemia, heart failure, myocardial rupture, ventricular aneurysm, thromboembolism, pericarditis (Dressler syndrome, post-MI pericarditis), cardiogenic shock (more common with left-sided MI), arrhythmias; LV (left ventricular) involvement → higher mortality; beta-blockers improve survival </w:t>
-      </w:r>
-      <w:r>
-        <w:rPr>
-          <w:b w:val="0"/>
-          <w:i w:val="0"/>
-        </w:rPr>
-        <w:t>Slides 12, 78, 80</w:t>
+        <w:t>Not covered in the lecture</w:t>
       </w:r>
     </w:p>
     <w:p>
@@ -13598,206 +12656,21 @@
           <w:b w:val="0"/>
           <w:i w:val="0"/>
         </w:rPr>
-        <w:t>Right ventricular infarct</w:t>
-      </w:r>
-      <w:r>
-        <w:rPr>
-          <w:b w:val="0"/>
-          <w:i w:val="0"/>
-        </w:rPr>
-        <w:t>3 not covered</w:t>
-      </w:r>
-      <w:r>
-        <w:br/>
-      </w:r>
-      <w:r>
-        <w:rPr>
-          <w:b w:val="0"/>
-          <w:i w:val="0"/>
-        </w:rPr>
-        <w:t>Name of Condition</w:t>
-      </w:r>
-      <w:r>
-        <w:rPr>
-          <w:b w:val="0"/>
-          <w:i w:val="0"/>
-        </w:rPr>
-        <w:t xml:space="preserve">Right ventricular (RV) infarct </w:t>
-      </w:r>
-      <w:r>
-        <w:rPr>
-          <w:b w:val="0"/>
-          <w:i w:val="0"/>
-        </w:rPr>
-        <w:t>Slide 63</w:t>
-      </w:r>
-      <w:r>
-        <w:rPr>
-          <w:b w:val="0"/>
-          <w:i w:val="0"/>
-        </w:rPr>
-        <w:t>Definition</w:t>
-      </w:r>
-      <w:r>
-        <w:rPr>
-          <w:b w:val="0"/>
-          <w:i w:val="0"/>
-        </w:rPr>
-        <w:t xml:space="preserve">RCA (right coronary artery) occlusion affecting the inferior and posterior left ventricular wall and septum, extending into the RV in 15–30% </w:t>
-      </w:r>
-      <w:r>
-        <w:rPr>
-          <w:b w:val="0"/>
-          <w:i w:val="0"/>
-        </w:rPr>
-        <w:t>Slide 63</w:t>
-      </w:r>
-      <w:r>
-        <w:rPr>
-          <w:b w:val="0"/>
-          <w:i w:val="0"/>
-        </w:rPr>
-        <w:t>Etiology (cause)</w:t>
-      </w:r>
-      <w:r>
-        <w:rPr>
-          <w:b w:val="0"/>
-          <w:i w:val="0"/>
-        </w:rPr>
-        <w:t xml:space="preserve">Occlusion of the RCA (right coronary artery) </w:t>
-      </w:r>
-      <w:r>
-        <w:rPr>
-          <w:b w:val="0"/>
-          <w:i w:val="0"/>
-        </w:rPr>
-        <w:t>Slide 63</w:t>
-      </w:r>
-      <w:r>
-        <w:rPr>
-          <w:b w:val="0"/>
-          <w:i w:val="0"/>
-        </w:rPr>
-        <w:t>Epidemiology (who)</w:t>
-      </w:r>
-      <w:r>
-        <w:rPr>
-          <w:b w:val="0"/>
-          <w:i w:val="0"/>
-        </w:rPr>
-        <w:t xml:space="preserve">RV extension in 15–30% of RCA (right coronary artery) occlusions </w:t>
-      </w:r>
-      <w:r>
-        <w:rPr>
-          <w:b w:val="0"/>
-          <w:i w:val="0"/>
-        </w:rPr>
-        <w:t>Slide 63</w:t>
-      </w:r>
-      <w:r>
-        <w:rPr>
-          <w:b w:val="0"/>
-          <w:i w:val="0"/>
-        </w:rPr>
-        <w:t>Risk Factors</w:t>
-      </w:r>
-      <w:r>
-        <w:rPr>
-          <w:b w:val="0"/>
-          <w:i w:val="0"/>
-        </w:rPr>
-        <w:t>Not covered in the lecture</w:t>
-      </w:r>
-      <w:r>
-        <w:rPr>
-          <w:b w:val="0"/>
-          <w:i w:val="0"/>
-        </w:rPr>
-        <w:t>Pathology</w:t>
-      </w:r>
-      <w:r>
-        <w:rPr>
-          <w:b w:val="0"/>
-          <w:i w:val="0"/>
-        </w:rPr>
-        <w:t xml:space="preserve">Preload-dependent RV (right ventricle): ↓ preload reduces Frank-Starling effect → RV failure (right-sided heart failure) </w:t>
-      </w:r>
-      <w:r>
-        <w:rPr>
-          <w:b w:val="0"/>
-          <w:i w:val="0"/>
-        </w:rPr>
-        <w:t>Slide 63</w:t>
-      </w:r>
-      <w:r>
-        <w:rPr>
-          <w:b w:val="0"/>
-          <w:i w:val="0"/>
-        </w:rPr>
-        <w:t>Clinical Manifestation</w:t>
-      </w:r>
-      <w:r>
-        <w:rPr>
-          <w:b w:val="0"/>
-          <w:i w:val="0"/>
-        </w:rPr>
-        <w:t>Not covered in the lecture</w:t>
-      </w:r>
-      <w:r>
-        <w:rPr>
-          <w:b w:val="0"/>
-          <w:i w:val="0"/>
-        </w:rPr>
-        <w:t>Diagnosis</w:t>
-      </w:r>
-      <w:r>
-        <w:rPr>
-          <w:b w:val="0"/>
-          <w:i w:val="0"/>
-        </w:rPr>
-        <w:t xml:space="preserve">STEMI chart: ST elevation V1 and V4R, reciprocal depression I and aVL; culprit RCA (right coronary artery); RCA supplies the AV (atrioventricular) node → dysrhythmias </w:t>
-      </w:r>
-      <w:r>
-        <w:rPr>
-          <w:b w:val="0"/>
-          <w:i w:val="0"/>
-        </w:rPr>
-        <w:t>Slides 11, 62</w:t>
-      </w:r>
-      <w:r>
-        <w:rPr>
-          <w:b w:val="0"/>
-          <w:i w:val="0"/>
-        </w:rPr>
-        <w:t>Treatment/Therapy</w:t>
-      </w:r>
-      <w:r>
-        <w:rPr>
-          <w:b w:val="0"/>
-          <w:i w:val="0"/>
-        </w:rPr>
-        <w:t xml:space="preserve">Nitroglycerin: slide 63 says DO NOT GIVE (↓ preload/output, precipitates shock); slide 73 says use with caution in inferior (right-sided) MI (myocardial infarction) with heart failure </w:t>
-      </w:r>
-      <w:r>
-        <w:rPr>
-          <w:b w:val="0"/>
-          <w:i w:val="0"/>
-        </w:rPr>
-        <w:t>Slides 63, 73</w:t>
-      </w:r>
-      <w:r>
-        <w:rPr>
-          <w:b w:val="0"/>
-          <w:i w:val="0"/>
-        </w:rPr>
-        <w:t>Mortality ★</w:t>
-      </w:r>
-      <w:r>
-        <w:rPr>
-          <w:b w:val="0"/>
-          <w:i w:val="0"/>
-        </w:rPr>
-        <w:t>Not covered in the lecture</w:t>
+        <w:t>Stable angina (SIHD)</w:t>
+      </w:r>
+      <w:r>
+        <w:rPr>
+          <w:b w:val="0"/>
+          <w:i w:val="0"/>
+        </w:rPr>
+        <w:t>★ Professor emphasized</w:t>
+      </w:r>
+      <w:r>
+        <w:rPr>
+          <w:b w:val="0"/>
+          <w:i w:val="0"/>
+        </w:rPr>
+        <w:t>2 not covered</w:t>
       </w:r>
     </w:p>
     <w:p>
@@ -13809,185 +12682,7 @@
           <w:b w:val="0"/>
           <w:i w:val="0"/>
         </w:rPr>
-        <w:t>Sudden cardiac death</w:t>
-      </w:r>
-      <w:r>
-        <w:rPr>
-          <w:b w:val="0"/>
-          <w:i w:val="0"/>
-        </w:rPr>
-        <w:t>6 not covered</w:t>
-      </w:r>
-      <w:r>
-        <w:br/>
-      </w:r>
-      <w:r>
-        <w:rPr>
-          <w:b w:val="0"/>
-          <w:i w:val="0"/>
-        </w:rPr>
-        <w:t>Name of Condition</w:t>
-      </w:r>
-      <w:r>
-        <w:rPr>
-          <w:b w:val="0"/>
-          <w:i w:val="0"/>
-        </w:rPr>
-        <w:t xml:space="preserve">Sudden cardiac death </w:t>
-      </w:r>
-      <w:r>
-        <w:rPr>
-          <w:b w:val="0"/>
-          <w:i w:val="0"/>
-        </w:rPr>
-        <w:t>Slide 85</w:t>
-      </w:r>
-      <w:r>
-        <w:rPr>
-          <w:b w:val="0"/>
-          <w:i w:val="0"/>
-        </w:rPr>
-        <w:t>Definition</w:t>
-      </w:r>
-      <w:r>
-        <w:rPr>
-          <w:b w:val="0"/>
-          <w:i w:val="0"/>
-        </w:rPr>
-        <w:t>Not covered in the lecture</w:t>
-      </w:r>
-      <w:r>
-        <w:rPr>
-          <w:b w:val="0"/>
-          <w:i w:val="0"/>
-        </w:rPr>
-        <w:t>Etiology (cause)</w:t>
-      </w:r>
-      <w:r>
-        <w:rPr>
-          <w:b w:val="0"/>
-          <w:i w:val="0"/>
-        </w:rPr>
-        <w:t xml:space="preserve">Most common: ventricular fibrillation; also LVH (left ventricular hypertrophy), hypertrophic cardiomyopathy, hypoxia, electrolyte abnormalities </w:t>
-      </w:r>
-      <w:r>
-        <w:rPr>
-          <w:b w:val="0"/>
-          <w:i w:val="0"/>
-        </w:rPr>
-        <w:t>Slide 85</w:t>
-      </w:r>
-      <w:r>
-        <w:rPr>
-          <w:b w:val="0"/>
-          <w:i w:val="0"/>
-        </w:rPr>
-        <w:t>Epidemiology (who)</w:t>
-      </w:r>
-      <w:r>
-        <w:rPr>
-          <w:b w:val="0"/>
-          <w:i w:val="0"/>
-        </w:rPr>
-        <w:t xml:space="preserve">First manifestation of CAD (coronary artery disease) in &gt;20% of patients </w:t>
-      </w:r>
-      <w:r>
-        <w:rPr>
-          <w:b w:val="0"/>
-          <w:i w:val="0"/>
-        </w:rPr>
-        <w:t>Slide 85</w:t>
-      </w:r>
-      <w:r>
-        <w:rPr>
-          <w:b w:val="0"/>
-          <w:i w:val="0"/>
-        </w:rPr>
-        <w:t>Risk Factors</w:t>
-      </w:r>
-      <w:r>
-        <w:rPr>
-          <w:b w:val="0"/>
-          <w:i w:val="0"/>
-        </w:rPr>
-        <w:t xml:space="preserve">Sudden death in a first-degree relative (listed as a CAD (coronary artery disease) risk factor) </w:t>
-      </w:r>
-      <w:r>
-        <w:rPr>
-          <w:b w:val="0"/>
-          <w:i w:val="0"/>
-        </w:rPr>
-        <w:t>Slide 22</w:t>
-      </w:r>
-      <w:r>
-        <w:rPr>
-          <w:b w:val="0"/>
-          <w:i w:val="0"/>
-        </w:rPr>
-        <w:t>Pathology</w:t>
-      </w:r>
-      <w:r>
-        <w:rPr>
-          <w:b w:val="0"/>
-          <w:i w:val="0"/>
-        </w:rPr>
-        <w:t>Not covered in the lecture</w:t>
-      </w:r>
-      <w:r>
-        <w:rPr>
-          <w:b w:val="0"/>
-          <w:i w:val="0"/>
-        </w:rPr>
-        <w:t>Clinical Manifestation</w:t>
-      </w:r>
-      <w:r>
-        <w:rPr>
-          <w:b w:val="0"/>
-          <w:i w:val="0"/>
-        </w:rPr>
-        <w:t>Not covered in the lecture</w:t>
-      </w:r>
-      <w:r>
-        <w:rPr>
-          <w:b w:val="0"/>
-          <w:i w:val="0"/>
-        </w:rPr>
-        <w:t>Diagnosis</w:t>
-      </w:r>
-      <w:r>
-        <w:rPr>
-          <w:b w:val="0"/>
-          <w:i w:val="0"/>
-        </w:rPr>
-        <w:t>Not covered in the lecture</w:t>
-      </w:r>
-      <w:r>
-        <w:rPr>
-          <w:b w:val="0"/>
-          <w:i w:val="0"/>
-        </w:rPr>
-        <w:t>Treatment/Therapy</w:t>
-      </w:r>
-      <w:r>
-        <w:rPr>
-          <w:b w:val="0"/>
-          <w:i w:val="0"/>
-        </w:rPr>
-        <w:t>Not covered in the lecture</w:t>
-      </w:r>
-      <w:r>
-        <w:rPr>
-          <w:b w:val="0"/>
-          <w:i w:val="0"/>
-        </w:rPr>
-        <w:t>Mortality ★</w:t>
-      </w:r>
-      <w:r>
-        <w:rPr>
-          <w:b w:val="0"/>
-          <w:i w:val="0"/>
-        </w:rPr>
-        <w:t>Not covered in the lecture</w:t>
+        <w:t>★ Call EMS if pain is unimproved 5 minutes after one nitroglycerin dose or after 3 doses; coronary angiography is the gold standard</w:t>
       </w:r>
     </w:p>
     <w:p>
@@ -13999,23 +12694,6 @@
           <w:b w:val="0"/>
           <w:i w:val="0"/>
         </w:rPr>
-        <w:t>Vasospastic (Prinzmetal) angina</w:t>
-      </w:r>
-      <w:r>
-        <w:rPr>
-          <w:b w:val="0"/>
-          <w:i w:val="0"/>
-        </w:rPr>
-        <w:t>1 not covered</w:t>
-      </w:r>
-      <w:r>
-        <w:br/>
-      </w:r>
-      <w:r>
-        <w:rPr>
-          <w:b w:val="0"/>
-          <w:i w:val="0"/>
-        </w:rPr>
         <w:t>Name of Condition</w:t>
       </w:r>
       <w:r>
@@ -14023,14 +12701,14 @@
           <w:b w:val="0"/>
           <w:i w:val="0"/>
         </w:rPr>
-        <w:t xml:space="preserve">Vasospastic angina; Prinzmetal angina; variant angina; coronary vasospasm angina </w:t>
-      </w:r>
-      <w:r>
-        <w:rPr>
-          <w:b w:val="0"/>
-          <w:i w:val="0"/>
-        </w:rPr>
-        <w:t>Slides 87, 89</w:t>
+        <w:t xml:space="preserve">Stable angina; SIHD (stable ischemic heart disease) </w:t>
+      </w:r>
+      <w:r>
+        <w:rPr>
+          <w:b w:val="0"/>
+          <w:i w:val="0"/>
+        </w:rPr>
+        <w:t>Slides 36–37</w:t>
       </w:r>
       <w:r>
         <w:rPr>
@@ -14044,14 +12722,14 @@
           <w:b w:val="0"/>
           <w:i w:val="0"/>
         </w:rPr>
-        <w:t xml:space="preserve">Angina due to coronary artery vasospasm, occurring at rest and responding to nitroglycerin </w:t>
-      </w:r>
-      <w:r>
-        <w:rPr>
-          <w:b w:val="0"/>
-          <w:i w:val="0"/>
-        </w:rPr>
-        <w:t>Slide 88</w:t>
+        <w:t xml:space="preserve">Angina usually brought on by activity and relieved by rest and nitroglycerin (unstable angina occurs at rest) </w:t>
+      </w:r>
+      <w:r>
+        <w:rPr>
+          <w:b w:val="0"/>
+          <w:i w:val="0"/>
+        </w:rPr>
+        <w:t>Slides 37, 86</w:t>
       </w:r>
       <w:r>
         <w:rPr>
@@ -14065,14 +12743,14 @@
           <w:b w:val="0"/>
           <w:i w:val="0"/>
         </w:rPr>
-        <w:t xml:space="preserve">Vasospasm in normal or diseased coronaries; drug triggers: cocaine, ephedrine, marijuana, alcohol, amphetamine, triptans </w:t>
-      </w:r>
-      <w:r>
-        <w:rPr>
-          <w:b w:val="0"/>
-          <w:i w:val="0"/>
-        </w:rPr>
-        <w:t>Slides 88–89</w:t>
+        <w:t xml:space="preserve">Exertion raises myocardial oxygen demand </w:t>
+      </w:r>
+      <w:r>
+        <w:rPr>
+          <w:b w:val="0"/>
+          <w:i w:val="0"/>
+        </w:rPr>
+        <w:t>Slides 6, 37</w:t>
       </w:r>
       <w:r>
         <w:rPr>
@@ -14086,14 +12764,14 @@
           <w:b w:val="0"/>
           <w:i w:val="0"/>
         </w:rPr>
-        <w:t xml:space="preserve">Relatively uncommon; often age &lt;50 </w:t>
-      </w:r>
-      <w:r>
-        <w:rPr>
-          <w:b w:val="0"/>
-          <w:i w:val="0"/>
-        </w:rPr>
-        <w:t>Slide 88</w:t>
+        <w:t xml:space="preserve">Most common form of angina pectoris </w:t>
+      </w:r>
+      <w:r>
+        <w:rPr>
+          <w:b w:val="0"/>
+          <w:i w:val="0"/>
+        </w:rPr>
+        <w:t>Slide 37</w:t>
       </w:r>
       <w:r>
         <w:rPr>
@@ -14107,14 +12785,14 @@
           <w:b w:val="0"/>
           <w:i w:val="0"/>
         </w:rPr>
-        <w:t xml:space="preserve">Cigarette smoking (major risk factor) </w:t>
-      </w:r>
-      <w:r>
-        <w:rPr>
-          <w:b w:val="0"/>
-          <w:i w:val="0"/>
-        </w:rPr>
-        <w:t>Slide 89</w:t>
+        <w:t xml:space="preserve">Coronary artery disease risk factors </w:t>
+      </w:r>
+      <w:r>
+        <w:rPr>
+          <w:b w:val="0"/>
+          <w:i w:val="0"/>
+        </w:rPr>
+        <w:t>Slides 22–23</w:t>
       </w:r>
       <w:r>
         <w:rPr>
@@ -14128,14 +12806,7 @@
           <w:b w:val="0"/>
           <w:i w:val="0"/>
         </w:rPr>
-        <w:t xml:space="preserve">Vasospasm without high-grade stenosis on arteriography </w:t>
-      </w:r>
-      <w:r>
-        <w:rPr>
-          <w:b w:val="0"/>
-          <w:i w:val="0"/>
-        </w:rPr>
-        <w:t>Slides 88, 90</w:t>
+        <w:t>Not covered in the lecture</w:t>
       </w:r>
       <w:r>
         <w:rPr>
@@ -14149,14 +12820,14 @@
           <w:b w:val="0"/>
           <w:i w:val="0"/>
         </w:rPr>
-        <w:t xml:space="preserve">Recurrent chest pain at rest, mostly midnight to 8 am; gradual onset/offset, 5–15 min (may last longer); typical chest pain </w:t>
-      </w:r>
-      <w:r>
-        <w:rPr>
-          <w:b w:val="0"/>
-          <w:i w:val="0"/>
-        </w:rPr>
-        <w:t>Slides 89–90</w:t>
+        <w:t xml:space="preserve">Pain with exertion; improves with nitroglycerin; resolves with rest </w:t>
+      </w:r>
+      <w:r>
+        <w:rPr>
+          <w:b w:val="0"/>
+          <w:i w:val="0"/>
+        </w:rPr>
+        <w:t>Slides 37, 86</w:t>
       </w:r>
       <w:r>
         <w:rPr>
@@ -14170,14 +12841,29 @@
           <w:b w:val="0"/>
           <w:i w:val="0"/>
         </w:rPr>
-        <w:t xml:space="preserve">ECG (electrocardiogram): slide 90 says transient ST elevation during an episode (transient ischemic ST elevation or depression, &lt;15 min, multiple leads); slide 91 criteria say transient T-wave inversion, maybe ST depression, with nitroglycerin response and no cause for ↑ oxygen demand. Gold standard: spasm on angiography provoked by ergonovine or acetylcholine, relieved by nitroglycerin </w:t>
-      </w:r>
-      <w:r>
-        <w:rPr>
-          <w:b w:val="0"/>
-          <w:i w:val="0"/>
-        </w:rPr>
-        <w:t>Slides 90–91</w:t>
+        <w:t xml:space="preserve">Stress-test ECG (electrocardiogram) changes, usually T-wave inversion: exercise treadmill, nuclear stress, cardiac CT (computed tomography); </w:t>
+      </w:r>
+      <w:r>
+        <w:rPr>
+          <w:b w:val="0"/>
+          <w:i w:val="0"/>
+          <w:highlight w:val="yellow"/>
+        </w:rPr>
+        <w:t>★ coronary angiography is the gold standard for CAD (coronary artery disease)</w:t>
+      </w:r>
+      <w:r>
+        <w:rPr>
+          <w:b w:val="0"/>
+          <w:i w:val="0"/>
+        </w:rPr>
+        <w:t xml:space="preserve"> </w:t>
+      </w:r>
+      <w:r>
+        <w:rPr>
+          <w:b w:val="0"/>
+          <w:i w:val="0"/>
+        </w:rPr>
+        <w:t>Slide 38</w:t>
       </w:r>
       <w:r>
         <w:rPr>
@@ -14191,14 +12877,14 @@
           <w:b w:val="0"/>
           <w:i w:val="0"/>
         </w:rPr>
-        <w:t xml:space="preserve">Stop smoking; nitrates for symptoms; FIRST-LINE calcium channel blockers (diltiazem, amlodipine); AVOID nonselective beta-blockers, aspirin, triptans </w:t>
-      </w:r>
-      <w:r>
-        <w:rPr>
-          <w:b w:val="0"/>
-          <w:i w:val="0"/>
-        </w:rPr>
-        <w:t>Slide 92</w:t>
+        <w:t xml:space="preserve">Sublingual nitroglycerin (venodilator: ↓ preload → ↓ wall stress → ↓ oxygen demand; also dilates arteries); call EMS (emergency medical services) if no relief 5 min after a dose or after 3 doses; lifestyle modification; beta-blocker (calcium channel blocker if contraindicated); statin; aspirin; prevention: aspirin + clopidogrel, more effective together </w:t>
+      </w:r>
+      <w:r>
+        <w:rPr>
+          <w:b w:val="0"/>
+          <w:i w:val="0"/>
+        </w:rPr>
+        <w:t>Slides 39–41</w:t>
       </w:r>
       <w:r>
         <w:rPr>
@@ -14224,6 +12910,1930 @@
           <w:b w:val="0"/>
           <w:i w:val="0"/>
         </w:rPr>
+        <w:t>Acute coronary syndrome</w:t>
+      </w:r>
+      <w:r>
+        <w:rPr>
+          <w:b w:val="0"/>
+          <w:i w:val="0"/>
+        </w:rPr>
+        <w:t>★ Professor emphasized</w:t>
+      </w:r>
+      <w:r>
+        <w:rPr>
+          <w:b w:val="0"/>
+          <w:i w:val="0"/>
+        </w:rPr>
+        <w:t>1 not covered</w:t>
+      </w:r>
+    </w:p>
+    <w:p>
+      <w:pPr>
+        <w:spacing w:after="120"/>
+      </w:pPr>
+      <w:r>
+        <w:rPr>
+          <w:b w:val="0"/>
+          <w:i w:val="0"/>
+        </w:rPr>
+        <w:t>★ Troponin I numbers "for testing" (slide 72a, shown in class): standard &gt;0.04 ng/mL, high-sensitivity 12 ng/L women / 20 ng/L men; rule-out tool, repeat it; TIMI 3 or higher → early invasive approach</w:t>
+      </w:r>
+    </w:p>
+    <w:p>
+      <w:pPr>
+        <w:spacing w:after="120"/>
+      </w:pPr>
+      <w:r>
+        <w:rPr>
+          <w:b w:val="0"/>
+          <w:i w:val="0"/>
+        </w:rPr>
+        <w:t>Name of Condition</w:t>
+      </w:r>
+      <w:r>
+        <w:rPr>
+          <w:b w:val="0"/>
+          <w:i w:val="0"/>
+        </w:rPr>
+        <w:t xml:space="preserve">ACS (acute coronary syndromes) </w:t>
+      </w:r>
+      <w:r>
+        <w:rPr>
+          <w:b w:val="0"/>
+          <w:i w:val="0"/>
+        </w:rPr>
+        <w:t>Slides 4, 42–43</w:t>
+      </w:r>
+      <w:r>
+        <w:rPr>
+          <w:b w:val="0"/>
+          <w:i w:val="0"/>
+        </w:rPr>
+        <w:t>Definition</w:t>
+      </w:r>
+      <w:r>
+        <w:rPr>
+          <w:b w:val="0"/>
+          <w:i w:val="0"/>
+        </w:rPr>
+        <w:t xml:space="preserve">Umbrella for unstable angina, NSTEMI (non-ST-elevation myocardial infarction) and STEMI (ST-elevation myocardial infarction) </w:t>
+      </w:r>
+      <w:r>
+        <w:rPr>
+          <w:b w:val="0"/>
+          <w:i w:val="0"/>
+        </w:rPr>
+        <w:t>Slides 42–43</w:t>
+      </w:r>
+      <w:r>
+        <w:rPr>
+          <w:b w:val="0"/>
+          <w:i w:val="0"/>
+        </w:rPr>
+        <w:t>Etiology (cause)</w:t>
+      </w:r>
+      <w:r>
+        <w:rPr>
+          <w:b w:val="0"/>
+          <w:i w:val="0"/>
+        </w:rPr>
+        <w:t xml:space="preserve">Plaque rupture → platelet activation + tissue factor → clotting cascade → fibrin </w:t>
+      </w:r>
+      <w:r>
+        <w:rPr>
+          <w:b w:val="0"/>
+          <w:i w:val="0"/>
+        </w:rPr>
+        <w:t>Slide 20</w:t>
+      </w:r>
+      <w:r>
+        <w:rPr>
+          <w:b w:val="0"/>
+          <w:i w:val="0"/>
+        </w:rPr>
+        <w:t>Epidemiology (who)</w:t>
+      </w:r>
+      <w:r>
+        <w:rPr>
+          <w:b w:val="0"/>
+          <w:i w:val="0"/>
+        </w:rPr>
+        <w:t>Not covered in the lecture</w:t>
+      </w:r>
+      <w:r>
+        <w:rPr>
+          <w:b w:val="0"/>
+          <w:i w:val="0"/>
+        </w:rPr>
+        <w:t>Risk Factors</w:t>
+      </w:r>
+      <w:r>
+        <w:rPr>
+          <w:b w:val="0"/>
+          <w:i w:val="0"/>
+        </w:rPr>
+        <w:t xml:space="preserve">CAD (coronary artery disease) risk factors; HEART/TIMI (Thrombolysis in Myocardial Infarction) risk factors: diabetes, hypertension, hyperlipidemia, obesity, smoking, family history of CAD, known CAD </w:t>
+      </w:r>
+      <w:r>
+        <w:rPr>
+          <w:b w:val="0"/>
+          <w:i w:val="0"/>
+        </w:rPr>
+        <w:t>Slides 22–23, 34, 71</w:t>
+      </w:r>
+      <w:r>
+        <w:rPr>
+          <w:b w:val="0"/>
+          <w:i w:val="0"/>
+        </w:rPr>
+        <w:t>Pathology</w:t>
+      </w:r>
+      <w:r>
+        <w:rPr>
+          <w:b w:val="0"/>
+          <w:i w:val="0"/>
+        </w:rPr>
+        <w:t xml:space="preserve">Plaque rupture with thrombus </w:t>
+      </w:r>
+      <w:r>
+        <w:rPr>
+          <w:b w:val="0"/>
+          <w:i w:val="0"/>
+        </w:rPr>
+        <w:t>Slide 20</w:t>
+      </w:r>
+      <w:r>
+        <w:rPr>
+          <w:b w:val="0"/>
+          <w:i w:val="0"/>
+        </w:rPr>
+        <w:t>Clinical Manifestation</w:t>
+      </w:r>
+      <w:r>
+        <w:rPr>
+          <w:b w:val="0"/>
+          <w:i w:val="0"/>
+        </w:rPr>
+        <w:t xml:space="preserve">Referred pain most often to jaw/tooth/arm, also back, scapula, epigastric/left upper quadrant </w:t>
+      </w:r>
+      <w:r>
+        <w:rPr>
+          <w:b w:val="0"/>
+          <w:i w:val="0"/>
+        </w:rPr>
+        <w:t>Slide 31</w:t>
+      </w:r>
+      <w:r>
+        <w:rPr>
+          <w:b w:val="0"/>
+          <w:i w:val="0"/>
+        </w:rPr>
+        <w:t>Diagnosis</w:t>
+      </w:r>
+      <w:r>
+        <w:rPr>
+          <w:b w:val="0"/>
+          <w:i w:val="0"/>
+        </w:rPr>
+        <w:t xml:space="preserve">Chest-pain workup. </w:t>
+      </w:r>
+      <w:r>
+        <w:rPr>
+          <w:b w:val="0"/>
+          <w:i w:val="0"/>
+          <w:highlight w:val="yellow"/>
+        </w:rPr>
+        <w:t>★ Troponin I (slide 72a, shown in class, not in the posted deck): standard troponin I abnormal above 0.04 ng/mL; high-sensitivity troponin I 99th percentile 12 ng/L in women, 20 ng/L in men</w:t>
+      </w:r>
+      <w:r>
+        <w:rPr>
+          <w:b w:val="0"/>
+          <w:i w:val="0"/>
+        </w:rPr>
+        <w:t xml:space="preserve">; troponin I is heart-specific (troponins are proteins of cardiac and skeletal muscle, none in smooth muscle); </w:t>
+      </w:r>
+      <w:r>
+        <w:rPr>
+          <w:b w:val="0"/>
+          <w:i w:val="0"/>
+          <w:highlight w:val="yellow"/>
+        </w:rPr>
+        <w:t>★ a rule-OUT tool</w:t>
+      </w:r>
+      <w:r>
+        <w:rPr>
+          <w:b w:val="0"/>
+          <w:i w:val="0"/>
+        </w:rPr>
+        <w:t xml:space="preserve">, and one draw means two (watch for a rise). Risk scores GRACE, TIMI (Thrombolysis in Myocardial Infarction), PURSUIT, HEART (History, ECG, Age, Risk factors, Troponin). </w:t>
+      </w:r>
+      <w:r>
+        <w:rPr>
+          <w:b w:val="0"/>
+          <w:i w:val="0"/>
+          <w:highlight w:val="yellow"/>
+        </w:rPr>
+        <w:t>★ TIMI 3 or higher justifies an early invasive approach</w:t>
+      </w:r>
+      <w:r>
+        <w:rPr>
+          <w:b w:val="0"/>
+          <w:i w:val="0"/>
+        </w:rPr>
+        <w:t xml:space="preserve">; HEART bands and MACE (major adverse cardiac event) percentages are not tested </w:t>
+      </w:r>
+      <w:r>
+        <w:rPr>
+          <w:b w:val="0"/>
+          <w:i w:val="0"/>
+        </w:rPr>
+        <w:t>Slides 32–34, 71–72, 72a</w:t>
+      </w:r>
+      <w:r>
+        <w:rPr>
+          <w:b w:val="0"/>
+          <w:i w:val="0"/>
+        </w:rPr>
+        <w:t>Treatment/Therapy</w:t>
+      </w:r>
+      <w:r>
+        <w:rPr>
+          <w:b w:val="0"/>
+          <w:i w:val="0"/>
+        </w:rPr>
+        <w:t xml:space="preserve">High-intensity statin (atorvastatin, rosuvastatin) for all ACS regardless of LDL (low-density lipoprotein), started before discharge </w:t>
+      </w:r>
+      <w:r>
+        <w:rPr>
+          <w:b w:val="0"/>
+          <w:i w:val="0"/>
+        </w:rPr>
+        <w:t>Slide 81</w:t>
+      </w:r>
+      <w:r>
+        <w:rPr>
+          <w:b w:val="0"/>
+          <w:i w:val="0"/>
+        </w:rPr>
+        <w:t>Mortality ★</w:t>
+      </w:r>
+      <w:r>
+        <w:rPr>
+          <w:b w:val="0"/>
+          <w:i w:val="0"/>
+        </w:rPr>
+        <w:t xml:space="preserve">Estimated by the risk scores; the HEART and TIMI (Thrombolysis in Myocardial Infarction) outcome percentages on slides 34 and 72 are not tested </w:t>
+      </w:r>
+      <w:r>
+        <w:rPr>
+          <w:b w:val="0"/>
+          <w:i w:val="0"/>
+        </w:rPr>
+        <w:t>Slide 34</w:t>
+      </w:r>
+    </w:p>
+    <w:p>
+      <w:pPr>
+        <w:spacing w:after="120"/>
+      </w:pPr>
+      <w:r>
+        <w:rPr>
+          <w:b w:val="0"/>
+          <w:i w:val="0"/>
+        </w:rPr>
+        <w:t>Unstable angina</w:t>
+      </w:r>
+      <w:r>
+        <w:rPr>
+          <w:b w:val="0"/>
+          <w:i w:val="0"/>
+        </w:rPr>
+        <w:t>★ Professor emphasized</w:t>
+      </w:r>
+      <w:r>
+        <w:rPr>
+          <w:b w:val="0"/>
+          <w:i w:val="0"/>
+        </w:rPr>
+        <w:t>2 not covered</w:t>
+      </w:r>
+    </w:p>
+    <w:p>
+      <w:pPr>
+        <w:spacing w:after="120"/>
+      </w:pPr>
+      <w:r>
+        <w:rPr>
+          <w:b w:val="0"/>
+          <w:i w:val="0"/>
+        </w:rPr>
+        <w:t>★ Troponin separates unstable angina (normal) from NSTEMI (elevated); oxygen only if SpO2 &lt;91%</w:t>
+      </w:r>
+    </w:p>
+    <w:p>
+      <w:pPr>
+        <w:spacing w:after="120"/>
+      </w:pPr>
+      <w:r>
+        <w:rPr>
+          <w:b w:val="0"/>
+          <w:i w:val="0"/>
+        </w:rPr>
+        <w:t>Name of Condition</w:t>
+      </w:r>
+      <w:r>
+        <w:rPr>
+          <w:b w:val="0"/>
+          <w:i w:val="0"/>
+        </w:rPr>
+        <w:t xml:space="preserve">Unstable angina (UA) </w:t>
+      </w:r>
+      <w:r>
+        <w:rPr>
+          <w:b w:val="0"/>
+          <w:i w:val="0"/>
+        </w:rPr>
+        <w:t>Slides 44–45</w:t>
+      </w:r>
+      <w:r>
+        <w:rPr>
+          <w:b w:val="0"/>
+          <w:i w:val="0"/>
+        </w:rPr>
+        <w:t>Definition</w:t>
+      </w:r>
+      <w:r>
+        <w:rPr>
+          <w:b w:val="0"/>
+          <w:i w:val="0"/>
+        </w:rPr>
+        <w:t xml:space="preserve">Change in a patient's stable angina, considered ACS (acute coronary syndrome): occurs at rest, new-onset and activity-limiting, or increasing (more discomfort, more often) </w:t>
+      </w:r>
+      <w:r>
+        <w:rPr>
+          <w:b w:val="0"/>
+          <w:i w:val="0"/>
+        </w:rPr>
+        <w:t>Slide 45</w:t>
+      </w:r>
+      <w:r>
+        <w:rPr>
+          <w:b w:val="0"/>
+          <w:i w:val="0"/>
+        </w:rPr>
+        <w:t>Etiology (cause)</w:t>
+      </w:r>
+      <w:r>
+        <w:rPr>
+          <w:b w:val="0"/>
+          <w:i w:val="0"/>
+        </w:rPr>
+        <w:t xml:space="preserve">Change in stable angina (plaque rupture); the Braunwald classification on slide 54 (mis-cited "APACHE II") was brushed past and is not tested </w:t>
+      </w:r>
+      <w:r>
+        <w:rPr>
+          <w:b w:val="0"/>
+          <w:i w:val="0"/>
+        </w:rPr>
+        <w:t>Slides 45, 54</w:t>
+      </w:r>
+      <w:r>
+        <w:rPr>
+          <w:b w:val="0"/>
+          <w:i w:val="0"/>
+        </w:rPr>
+        <w:t>Epidemiology (who)</w:t>
+      </w:r>
+      <w:r>
+        <w:rPr>
+          <w:b w:val="0"/>
+          <w:i w:val="0"/>
+        </w:rPr>
+        <w:t>Not covered in the lecture</w:t>
+      </w:r>
+      <w:r>
+        <w:rPr>
+          <w:b w:val="0"/>
+          <w:i w:val="0"/>
+        </w:rPr>
+        <w:t>Risk Factors</w:t>
+      </w:r>
+      <w:r>
+        <w:rPr>
+          <w:b w:val="0"/>
+          <w:i w:val="0"/>
+        </w:rPr>
+        <w:t xml:space="preserve">TIMI (Thrombolysis in Myocardial Infarction) criteria: age ≥65; ≥3 CAD (coronary artery disease) risk factors; known stenosis &gt;50%; aspirin in past 7 days; ≥2 angina episodes in 24 h; ST deviation ≥0.5 mm; elevated marker </w:t>
+      </w:r>
+      <w:r>
+        <w:rPr>
+          <w:b w:val="0"/>
+          <w:i w:val="0"/>
+        </w:rPr>
+        <w:t>Slide 71</w:t>
+      </w:r>
+      <w:r>
+        <w:rPr>
+          <w:b w:val="0"/>
+          <w:i w:val="0"/>
+        </w:rPr>
+        <w:t>Pathology</w:t>
+      </w:r>
+      <w:r>
+        <w:rPr>
+          <w:b w:val="0"/>
+          <w:i w:val="0"/>
+        </w:rPr>
+        <w:t>Not covered in the lecture</w:t>
+      </w:r>
+      <w:r>
+        <w:rPr>
+          <w:b w:val="0"/>
+          <w:i w:val="0"/>
+        </w:rPr>
+        <w:t>Clinical Manifestation</w:t>
+      </w:r>
+      <w:r>
+        <w:rPr>
+          <w:b w:val="0"/>
+          <w:i w:val="0"/>
+        </w:rPr>
+        <w:t xml:space="preserve">Pain at rest; nitroglycerin usually (not always) helps </w:t>
+      </w:r>
+      <w:r>
+        <w:rPr>
+          <w:b w:val="0"/>
+          <w:i w:val="0"/>
+        </w:rPr>
+        <w:t>Slides 46, 86</w:t>
+      </w:r>
+      <w:r>
+        <w:rPr>
+          <w:b w:val="0"/>
+          <w:i w:val="0"/>
+        </w:rPr>
+        <w:t>Diagnosis</w:t>
+      </w:r>
+      <w:r>
+        <w:rPr>
+          <w:b w:val="0"/>
+          <w:i w:val="0"/>
+        </w:rPr>
+        <w:t xml:space="preserve">Nonspecific ECG (electrocardiogram) changes (usually inverted T waves) with </w:t>
+      </w:r>
+      <w:r>
+        <w:rPr>
+          <w:b w:val="0"/>
+          <w:i w:val="0"/>
+          <w:highlight w:val="yellow"/>
+        </w:rPr>
+        <w:t>★ NORMAL troponin</w:t>
+      </w:r>
+      <w:r>
+        <w:rPr>
+          <w:b w:val="0"/>
+          <w:i w:val="0"/>
+        </w:rPr>
+        <w:t xml:space="preserve"> (troponin separates UA from NSTEMI (non-ST-elevation MI)); stress-test ST depression or T inversion; nuclear stress: reversible defect = ischemia, fixed = infarction; TIMI (Thrombolysis in Myocardial Infarction) 3 or higher → early invasive approach </w:t>
+      </w:r>
+      <w:r>
+        <w:rPr>
+          <w:b w:val="0"/>
+          <w:i w:val="0"/>
+        </w:rPr>
+        <w:t>Slides 46–47, 71–72</w:t>
+      </w:r>
+      <w:r>
+        <w:rPr>
+          <w:b w:val="0"/>
+          <w:i w:val="0"/>
+        </w:rPr>
+        <w:t>Treatment/Therapy</w:t>
+      </w:r>
+      <w:r>
+        <w:rPr>
+          <w:b w:val="0"/>
+          <w:i w:val="0"/>
+        </w:rPr>
+        <w:t xml:space="preserve">Medical emergency, same as NSTEMI: chewable aspirin, beta-blocker, IV nitrates; DAPT (dual antiplatelet therapy: aspirin + clopidogrel) ± anticoagulation; MONA (morphine, oxygen, nitroglycerin, aspirin), </w:t>
+      </w:r>
+      <w:r>
+        <w:rPr>
+          <w:b w:val="0"/>
+          <w:i w:val="0"/>
+          <w:highlight w:val="yellow"/>
+        </w:rPr>
+        <w:t>★ oxygen only if SpO2 &lt;91%</w:t>
+      </w:r>
+      <w:r>
+        <w:rPr>
+          <w:b w:val="0"/>
+          <w:i w:val="0"/>
+        </w:rPr>
+        <w:t xml:space="preserve">. After stabilization: left heart catheterization/angiography, balloon angioplasty, PCI (percutaneous coronary intervention) with stent. Post-PCI: DAPT, statin, ACE (angiotensin-converting enzyme) inhibitor, anticoagulant if indicated; </w:t>
+      </w:r>
+      <w:r>
+        <w:rPr>
+          <w:b w:val="0"/>
+          <w:i w:val="0"/>
+          <w:highlight w:val="yellow"/>
+        </w:rPr>
+        <w:t>★ missing DAPT in the first 6 weeks → 50% risk of sudden in-stent restenosis</w:t>
+      </w:r>
+      <w:r>
+        <w:rPr>
+          <w:b w:val="0"/>
+          <w:i w:val="0"/>
+        </w:rPr>
+        <w:t xml:space="preserve"> (the DAPT durations on slides 52 and 83 disagree and are not tested); exercise as tolerated, low-salt/low-fat diet, follow-up </w:t>
+      </w:r>
+      <w:r>
+        <w:rPr>
+          <w:b w:val="0"/>
+          <w:i w:val="0"/>
+        </w:rPr>
+        <w:t>Slides 48–53</w:t>
+      </w:r>
+      <w:r>
+        <w:rPr>
+          <w:b w:val="0"/>
+          <w:i w:val="0"/>
+        </w:rPr>
+        <w:t>Mortality ★</w:t>
+      </w:r>
+      <w:r>
+        <w:rPr>
+          <w:b w:val="0"/>
+          <w:i w:val="0"/>
+        </w:rPr>
+        <w:t xml:space="preserve">TIMI (Thrombolysis in Myocardial Infarction) 3–7 needs ICU (intensive care unit) or emergent revascularization; the percentage table (slide 72) and Braunwald prognosis (slide 54) are not tested </w:t>
+      </w:r>
+      <w:r>
+        <w:rPr>
+          <w:b w:val="0"/>
+          <w:i w:val="0"/>
+        </w:rPr>
+        <w:t>Slide 72</w:t>
+      </w:r>
+    </w:p>
+    <w:p>
+      <w:pPr>
+        <w:spacing w:after="120"/>
+      </w:pPr>
+      <w:r>
+        <w:rPr>
+          <w:b w:val="0"/>
+          <w:i w:val="0"/>
+        </w:rPr>
+        <w:t>NSTEMI</w:t>
+      </w:r>
+      <w:r>
+        <w:rPr>
+          <w:b w:val="0"/>
+          <w:i w:val="0"/>
+        </w:rPr>
+        <w:t>★ Professor emphasized</w:t>
+      </w:r>
+      <w:r>
+        <w:rPr>
+          <w:b w:val="0"/>
+          <w:i w:val="0"/>
+        </w:rPr>
+        <w:t>2 not covered</w:t>
+      </w:r>
+    </w:p>
+    <w:p>
+      <w:pPr>
+        <w:spacing w:after="120"/>
+      </w:pPr>
+      <w:r>
+        <w:rPr>
+          <w:b w:val="0"/>
+          <w:i w:val="0"/>
+        </w:rPr>
+        <w:t>★ ST depression &gt;1 mm and/or T-wave inversion in two or more consecutive leads with elevated troponin</w:t>
+      </w:r>
+    </w:p>
+    <w:p>
+      <w:pPr>
+        <w:spacing w:after="120"/>
+      </w:pPr>
+      <w:r>
+        <w:rPr>
+          <w:b w:val="0"/>
+          <w:i w:val="0"/>
+        </w:rPr>
+        <w:t>Name of Condition</w:t>
+      </w:r>
+      <w:r>
+        <w:rPr>
+          <w:b w:val="0"/>
+          <w:i w:val="0"/>
+        </w:rPr>
+        <w:t xml:space="preserve">NSTEMI (non-ST-elevation myocardial infarction); non-ST elevation ischemia </w:t>
+      </w:r>
+      <w:r>
+        <w:rPr>
+          <w:b w:val="0"/>
+          <w:i w:val="0"/>
+        </w:rPr>
+        <w:t>Slides 4, 56, 86</w:t>
+      </w:r>
+      <w:r>
+        <w:rPr>
+          <w:b w:val="0"/>
+          <w:i w:val="0"/>
+        </w:rPr>
+        <w:t>Definition</w:t>
+      </w:r>
+      <w:r>
+        <w:rPr>
+          <w:b w:val="0"/>
+          <w:i w:val="0"/>
+        </w:rPr>
+        <w:t xml:space="preserve">MI (myocardial infarction) diagnosed by ECG (electrocardiogram) changes + ischemic symptoms + elevated troponin/high-sensitivity troponin </w:t>
+      </w:r>
+      <w:r>
+        <w:rPr>
+          <w:b w:val="0"/>
+          <w:i w:val="0"/>
+        </w:rPr>
+        <w:t>Slide 47</w:t>
+      </w:r>
+      <w:r>
+        <w:rPr>
+          <w:b w:val="0"/>
+          <w:i w:val="0"/>
+        </w:rPr>
+        <w:t>Etiology (cause)</w:t>
+      </w:r>
+      <w:r>
+        <w:rPr>
+          <w:b w:val="0"/>
+          <w:i w:val="0"/>
+        </w:rPr>
+        <w:t>Not covered in the lecture</w:t>
+      </w:r>
+      <w:r>
+        <w:rPr>
+          <w:b w:val="0"/>
+          <w:i w:val="0"/>
+        </w:rPr>
+        <w:t>Epidemiology (who)</w:t>
+      </w:r>
+      <w:r>
+        <w:rPr>
+          <w:b w:val="0"/>
+          <w:i w:val="0"/>
+        </w:rPr>
+        <w:t>Not covered in the lecture</w:t>
+      </w:r>
+      <w:r>
+        <w:rPr>
+          <w:b w:val="0"/>
+          <w:i w:val="0"/>
+        </w:rPr>
+        <w:t>Risk Factors</w:t>
+      </w:r>
+      <w:r>
+        <w:rPr>
+          <w:b w:val="0"/>
+          <w:i w:val="0"/>
+        </w:rPr>
+        <w:t xml:space="preserve">TIMI (Thrombolysis in Myocardial Infarction) criteria </w:t>
+      </w:r>
+      <w:r>
+        <w:rPr>
+          <w:b w:val="0"/>
+          <w:i w:val="0"/>
+        </w:rPr>
+        <w:t>Slide 71</w:t>
+      </w:r>
+      <w:r>
+        <w:rPr>
+          <w:b w:val="0"/>
+          <w:i w:val="0"/>
+        </w:rPr>
+        <w:t>Pathology</w:t>
+      </w:r>
+      <w:r>
+        <w:rPr>
+          <w:b w:val="0"/>
+          <w:i w:val="0"/>
+        </w:rPr>
+        <w:t xml:space="preserve">Subendocardial ischemia → ST depression </w:t>
+      </w:r>
+      <w:r>
+        <w:rPr>
+          <w:b w:val="0"/>
+          <w:i w:val="0"/>
+        </w:rPr>
+        <w:t>Slide 55</w:t>
+      </w:r>
+      <w:r>
+        <w:rPr>
+          <w:b w:val="0"/>
+          <w:i w:val="0"/>
+        </w:rPr>
+        <w:t>Clinical Manifestation</w:t>
+      </w:r>
+      <w:r>
+        <w:rPr>
+          <w:b w:val="0"/>
+          <w:i w:val="0"/>
+        </w:rPr>
+        <w:t xml:space="preserve">Signs and symptoms of ischemia; nitroglycerin may help the pain </w:t>
+      </w:r>
+      <w:r>
+        <w:rPr>
+          <w:b w:val="0"/>
+          <w:i w:val="0"/>
+        </w:rPr>
+        <w:t>Slides 47, 86</w:t>
+      </w:r>
+      <w:r>
+        <w:rPr>
+          <w:b w:val="0"/>
+          <w:i w:val="0"/>
+        </w:rPr>
+        <w:t>Diagnosis</w:t>
+      </w:r>
+      <w:r>
+        <w:rPr>
+          <w:b w:val="0"/>
+          <w:i w:val="0"/>
+          <w:highlight w:val="yellow"/>
+        </w:rPr>
+        <w:t>★ Slide 47: ST depression &gt;1 mm and/or T-wave inversion in ≥2 consecutive leads + ELEVATED troponin</w:t>
+      </w:r>
+      <w:r>
+        <w:rPr>
+          <w:b w:val="0"/>
+          <w:i w:val="0"/>
+        </w:rPr>
+        <w:t xml:space="preserve"> (what separates it from unstable angina); troponin I abnormal above 0.04 ng/mL (high-sensitivity 12 ng/L women, 20 ng/L men). Slide 86's "ST inversion (&gt;1 mm)" is a deck error (ST segments are depressed; T waves invert) </w:t>
+      </w:r>
+      <w:r>
+        <w:rPr>
+          <w:b w:val="0"/>
+          <w:i w:val="0"/>
+        </w:rPr>
+        <w:t>Slides 47, 55, 72a, 86</w:t>
+      </w:r>
+      <w:r>
+        <w:rPr>
+          <w:b w:val="0"/>
+          <w:i w:val="0"/>
+        </w:rPr>
+        <w:t>Treatment/Therapy</w:t>
+      </w:r>
+      <w:r>
+        <w:rPr>
+          <w:b w:val="0"/>
+          <w:i w:val="0"/>
+        </w:rPr>
+        <w:t xml:space="preserve">Treated the same as unstable angina (see that card) </w:t>
+      </w:r>
+      <w:r>
+        <w:rPr>
+          <w:b w:val="0"/>
+          <w:i w:val="0"/>
+        </w:rPr>
+        <w:t>Slides 48–53</w:t>
+      </w:r>
+      <w:r>
+        <w:rPr>
+          <w:b w:val="0"/>
+          <w:i w:val="0"/>
+        </w:rPr>
+        <w:t>Mortality ★</w:t>
+      </w:r>
+      <w:r>
+        <w:rPr>
+          <w:b w:val="0"/>
+          <w:i w:val="0"/>
+        </w:rPr>
+        <w:t xml:space="preserve">TIMI (Thrombolysis in Myocardial Infarction) 3 or higher → early invasive approach (percentages not tested) </w:t>
+      </w:r>
+      <w:r>
+        <w:rPr>
+          <w:b w:val="0"/>
+          <w:i w:val="0"/>
+        </w:rPr>
+        <w:t>Slide 72</w:t>
+      </w:r>
+    </w:p>
+    <w:p>
+      <w:pPr>
+        <w:spacing w:after="120"/>
+      </w:pPr>
+      <w:r>
+        <w:rPr>
+          <w:b w:val="0"/>
+          <w:i w:val="0"/>
+        </w:rPr>
+        <w:t>STEMI (transmural MI)</w:t>
+      </w:r>
+      <w:r>
+        <w:rPr>
+          <w:b w:val="0"/>
+          <w:i w:val="0"/>
+        </w:rPr>
+        <w:t>★ Professor emphasized</w:t>
+      </w:r>
+      <w:r>
+        <w:rPr>
+          <w:b w:val="0"/>
+          <w:i w:val="0"/>
+        </w:rPr>
+        <w:t>1 not covered</w:t>
+      </w:r>
+    </w:p>
+    <w:p>
+      <w:pPr>
+        <w:spacing w:after="120"/>
+      </w:pPr>
+      <w:r>
+        <w:rPr>
+          <w:b w:val="0"/>
+          <w:i w:val="0"/>
+        </w:rPr>
+        <w:t>★ Lead groups name the artery (II, III, aVF = RCA); ST depression V1–V3 = posterior, get V7–V9; new LBBB = STEMI equivalent; ECG within 10 min, door-to-balloon &lt;90 min</w:t>
+      </w:r>
+    </w:p>
+    <w:p>
+      <w:pPr>
+        <w:spacing w:after="120"/>
+      </w:pPr>
+      <w:r>
+        <w:rPr>
+          <w:b w:val="0"/>
+          <w:i w:val="0"/>
+        </w:rPr>
+        <w:t>Name of Condition</w:t>
+      </w:r>
+      <w:r>
+        <w:rPr>
+          <w:b w:val="0"/>
+          <w:i w:val="0"/>
+        </w:rPr>
+        <w:t xml:space="preserve">STEMI (ST-elevation myocardial infarction); transmural myocardial infarction (MI) </w:t>
+      </w:r>
+      <w:r>
+        <w:rPr>
+          <w:b w:val="0"/>
+          <w:i w:val="0"/>
+        </w:rPr>
+        <w:t>Slides 57, 65</w:t>
+      </w:r>
+      <w:r>
+        <w:rPr>
+          <w:b w:val="0"/>
+          <w:i w:val="0"/>
+        </w:rPr>
+        <w:t>Definition</w:t>
+      </w:r>
+      <w:r>
+        <w:rPr>
+          <w:b w:val="0"/>
+          <w:i w:val="0"/>
+        </w:rPr>
+        <w:t xml:space="preserve">Myocardial necrosis with ST elevation in ≥2 consecutive leads not quickly reversed by nitroglycerin, reciprocal ST depression, </w:t>
+      </w:r>
+      <w:r>
+        <w:rPr>
+          <w:b w:val="0"/>
+          <w:i w:val="0"/>
+          <w:highlight w:val="yellow"/>
+        </w:rPr>
+        <w:t>★ new LBBB (left bundle branch block) = STEMI equivalent</w:t>
+      </w:r>
+      <w:r>
+        <w:rPr>
+          <w:b w:val="0"/>
+          <w:i w:val="0"/>
+        </w:rPr>
+        <w:t xml:space="preserve">, Q waves. Slide 65 adds "elevated cardiac markers must be present"; in class he said troponin is not required (it may not have risen yet), so this is not keyed </w:t>
+      </w:r>
+      <w:r>
+        <w:rPr>
+          <w:b w:val="0"/>
+          <w:i w:val="0"/>
+        </w:rPr>
+        <w:t>Slide 65</w:t>
+      </w:r>
+      <w:r>
+        <w:rPr>
+          <w:b w:val="0"/>
+          <w:i w:val="0"/>
+        </w:rPr>
+        <w:t>Etiology (cause)</w:t>
+      </w:r>
+      <w:r>
+        <w:rPr>
+          <w:b w:val="0"/>
+          <w:i w:val="0"/>
+        </w:rPr>
+        <w:t xml:space="preserve">Coronary occlusion; LAD (left anterior descending) most common culprit (40–50%), RCA (right coronary artery) 30–40%, left circumflex 15–20% </w:t>
+      </w:r>
+      <w:r>
+        <w:rPr>
+          <w:b w:val="0"/>
+          <w:i w:val="0"/>
+        </w:rPr>
+        <w:t>Slide 14</w:t>
+      </w:r>
+      <w:r>
+        <w:rPr>
+          <w:b w:val="0"/>
+          <w:i w:val="0"/>
+        </w:rPr>
+        <w:t>Epidemiology (who)</w:t>
+      </w:r>
+      <w:r>
+        <w:rPr>
+          <w:b w:val="0"/>
+          <w:i w:val="0"/>
+        </w:rPr>
+        <w:t>Not covered in the lecture</w:t>
+      </w:r>
+      <w:r>
+        <w:rPr>
+          <w:b w:val="0"/>
+          <w:i w:val="0"/>
+        </w:rPr>
+        <w:t>Risk Factors</w:t>
+      </w:r>
+      <w:r>
+        <w:rPr>
+          <w:b w:val="0"/>
+          <w:i w:val="0"/>
+        </w:rPr>
+        <w:t xml:space="preserve">CAD (coronary artery disease) risk factors </w:t>
+      </w:r>
+      <w:r>
+        <w:rPr>
+          <w:b w:val="0"/>
+          <w:i w:val="0"/>
+        </w:rPr>
+        <w:t>Slides 22–23</w:t>
+      </w:r>
+      <w:r>
+        <w:rPr>
+          <w:b w:val="0"/>
+          <w:i w:val="0"/>
+        </w:rPr>
+        <w:t>Pathology</w:t>
+      </w:r>
+      <w:r>
+        <w:rPr>
+          <w:b w:val="0"/>
+          <w:i w:val="0"/>
+        </w:rPr>
+        <w:t xml:space="preserve">Transmural ischemia → ST elevation; ECG (electrocardiogram) evolution: hyperacute T/ST elevation (minutes–hours) → T inversion + Q (hours–1 day) → Q + coronary T (1 week) → Q wave (months) </w:t>
+      </w:r>
+      <w:r>
+        <w:rPr>
+          <w:b w:val="0"/>
+          <w:i w:val="0"/>
+        </w:rPr>
+        <w:t>Slides 55, 64</w:t>
+      </w:r>
+      <w:r>
+        <w:rPr>
+          <w:b w:val="0"/>
+          <w:i w:val="0"/>
+        </w:rPr>
+        <w:t>Clinical Manifestation</w:t>
+      </w:r>
+      <w:r>
+        <w:rPr>
+          <w:b w:val="0"/>
+          <w:i w:val="0"/>
+        </w:rPr>
+        <w:t xml:space="preserve">Typical and referred chest pain as for ACS (acute coronary syndrome) </w:t>
+      </w:r>
+      <w:r>
+        <w:rPr>
+          <w:b w:val="0"/>
+          <w:i w:val="0"/>
+        </w:rPr>
+        <w:t>Slides 25, 31</w:t>
+      </w:r>
+      <w:r>
+        <w:rPr>
+          <w:b w:val="0"/>
+          <w:i w:val="0"/>
+        </w:rPr>
+        <w:t>Diagnosis</w:t>
+      </w:r>
+      <w:r>
+        <w:rPr>
+          <w:b w:val="0"/>
+          <w:i w:val="0"/>
+          <w:highlight w:val="yellow"/>
+        </w:rPr>
+        <w:t>★ ECG (electrocardiogram) within 10 min of arrival</w:t>
+      </w:r>
+      <w:r>
+        <w:rPr>
+          <w:b w:val="0"/>
+          <w:i w:val="0"/>
+        </w:rPr>
+        <w:t xml:space="preserve">: ST elevation &gt;1 mm in ≥2 consecutive leads. Localization: </w:t>
+      </w:r>
+      <w:r>
+        <w:rPr>
+          <w:b w:val="0"/>
+          <w:i w:val="0"/>
+          <w:highlight w:val="yellow"/>
+        </w:rPr>
+        <w:t>★ inferior II/III/aVF → RCA (right coronary artery)</w:t>
+      </w:r>
+      <w:r>
+        <w:rPr>
+          <w:b w:val="0"/>
+          <w:i w:val="0"/>
+        </w:rPr>
+        <w:t xml:space="preserve"> (and/or circumflex); lateral I/aVL/V5–V6 → circumflex or LAD (left anterior descending) diagonal; anterior/septal V1–V4 → LAD (V4 is anterior); </w:t>
+      </w:r>
+      <w:r>
+        <w:rPr>
+          <w:b w:val="0"/>
+          <w:i w:val="0"/>
+          <w:highlight w:val="yellow"/>
+        </w:rPr>
+        <w:t>★ posterior = ST depression V1–V3, confirmed with posterior leads V7–V9</w:t>
+      </w:r>
+      <w:r>
+        <w:rPr>
+          <w:b w:val="0"/>
+          <w:i w:val="0"/>
+        </w:rPr>
+        <w:t xml:space="preserve">; right ventricular V1/V4R. Pathologic Q waves = infarct already happened. Slide 62's other rows and V2–V3 cut-offs are self-study </w:t>
+      </w:r>
+      <w:r>
+        <w:rPr>
+          <w:b w:val="0"/>
+          <w:i w:val="0"/>
+        </w:rPr>
+        <w:t>Slides 61–62, 65, 68, 86</w:t>
+      </w:r>
+      <w:r>
+        <w:rPr>
+          <w:b w:val="0"/>
+          <w:i w:val="0"/>
+        </w:rPr>
+        <w:t>Treatment/Therapy</w:t>
+      </w:r>
+      <w:r>
+        <w:rPr>
+          <w:b w:val="0"/>
+          <w:i w:val="0"/>
+        </w:rPr>
+        <w:t xml:space="preserve">Chewable aspirin; activate cath team for PCI (percutaneous coronary intervention); then ticagrelor/prasugrel/clopidogrel + heparin drip; nitroglycerin (sublingual/paste/infusion); beta-blocker if no bradycardia; </w:t>
+      </w:r>
+      <w:r>
+        <w:rPr>
+          <w:b w:val="0"/>
+          <w:i w:val="0"/>
+          <w:highlight w:val="yellow"/>
+        </w:rPr>
+        <w:t>★ if PCI ≥2 h away give thrombolytics within 30 min of arrival</w:t>
+      </w:r>
+      <w:r>
+        <w:rPr>
+          <w:b w:val="0"/>
+          <w:i w:val="0"/>
+        </w:rPr>
+        <w:t xml:space="preserve"> (tenecteplase most common; also alteplase, reteplase, streptokinase, anistreplase, lanoteplase); </w:t>
+      </w:r>
+      <w:r>
+        <w:rPr>
+          <w:b w:val="0"/>
+          <w:i w:val="0"/>
+          <w:highlight w:val="yellow"/>
+        </w:rPr>
+        <w:t>★ door-to-balloon &lt;90 min</w:t>
+      </w:r>
+      <w:r>
+        <w:rPr>
+          <w:b w:val="0"/>
+          <w:i w:val="0"/>
+        </w:rPr>
+        <w:t xml:space="preserve">; GP (glycoprotein) IIb/IIIa inhibitors have fallen out of favor. PCI (angioplasty, atherectomy, stent) or CABG (coronary artery bypass graft: mammary or radial ARTERY first, great saphenous vein only if an artery cannot be used). Post-MI: </w:t>
+      </w:r>
+      <w:r>
+        <w:rPr>
+          <w:b w:val="0"/>
+          <w:i w:val="0"/>
+          <w:highlight w:val="yellow"/>
+        </w:rPr>
+        <w:t>★ beta-blocker improves survival; calcium channel blockers do not</w:t>
+      </w:r>
+      <w:r>
+        <w:rPr>
+          <w:b w:val="0"/>
+          <w:i w:val="0"/>
+        </w:rPr>
+        <w:t xml:space="preserve"> (diltiazem/verapamil only with preserved LV function); high-intensity statin for all ACS before discharge; ACE (angiotensin-converting enzyme) inhibitor with reduced LV function; aspirin; clopidogrel after stent; warfarin for large anterior MI. Oxygen only if SpO2 &lt;91%; </w:t>
+      </w:r>
+      <w:r>
+        <w:rPr>
+          <w:b w:val="0"/>
+          <w:i w:val="0"/>
+          <w:highlight w:val="yellow"/>
+        </w:rPr>
+        <w:t>★ no nitroglycerin within 24 h of a PDE (phosphodiesterase) inhibitor</w:t>
+      </w:r>
+      <w:r>
+        <w:rPr>
+          <w:b w:val="0"/>
+          <w:i w:val="0"/>
+        </w:rPr>
+        <w:t xml:space="preserve"> (ask women too: pulmonary arterial hypertension) </w:t>
+      </w:r>
+      <w:r>
+        <w:rPr>
+          <w:b w:val="0"/>
+          <w:i w:val="0"/>
+        </w:rPr>
+        <w:t>Slides 66–70, 73–74, 76–77, 80–83</w:t>
+      </w:r>
+      <w:r>
+        <w:rPr>
+          <w:b w:val="0"/>
+          <w:i w:val="0"/>
+        </w:rPr>
+        <w:t>Mortality ★</w:t>
+      </w:r>
+      <w:r>
+        <w:rPr>
+          <w:b w:val="0"/>
+          <w:i w:val="0"/>
+        </w:rPr>
+        <w:t xml:space="preserve">Complications: post-infarction ischemia, heart failure, myocardial rupture, ventricular aneurysm, thromboembolism, pericarditis (Dressler syndrome, post-MI pericarditis), cardiogenic shock (more common with left-sided MI), arrhythmias; LV (left ventricular) involvement → higher mortality; beta-blockers improve survival </w:t>
+      </w:r>
+      <w:r>
+        <w:rPr>
+          <w:b w:val="0"/>
+          <w:i w:val="0"/>
+        </w:rPr>
+        <w:t>Slides 12, 78, 80</w:t>
+      </w:r>
+    </w:p>
+    <w:p>
+      <w:pPr>
+        <w:spacing w:after="120"/>
+      </w:pPr>
+      <w:r>
+        <w:rPr>
+          <w:b w:val="0"/>
+          <w:i w:val="0"/>
+        </w:rPr>
+        <w:t>Right ventricular infarct</w:t>
+      </w:r>
+      <w:r>
+        <w:rPr>
+          <w:b w:val="0"/>
+          <w:i w:val="0"/>
+        </w:rPr>
+        <w:t>★ Professor emphasized</w:t>
+      </w:r>
+      <w:r>
+        <w:rPr>
+          <w:b w:val="0"/>
+          <w:i w:val="0"/>
+        </w:rPr>
+        <w:t>3 not covered</w:t>
+      </w:r>
+    </w:p>
+    <w:p>
+      <w:pPr>
+        <w:spacing w:after="120"/>
+      </w:pPr>
+      <w:r>
+        <w:rPr>
+          <w:b w:val="0"/>
+          <w:i w:val="0"/>
+        </w:rPr>
+        <w:t>★ Do NOT give nitroglycerin in a right ventricular infarct ("you will kill somebody")</w:t>
+      </w:r>
+    </w:p>
+    <w:p>
+      <w:pPr>
+        <w:spacing w:after="120"/>
+      </w:pPr>
+      <w:r>
+        <w:rPr>
+          <w:b w:val="0"/>
+          <w:i w:val="0"/>
+        </w:rPr>
+        <w:t>Name of Condition</w:t>
+      </w:r>
+      <w:r>
+        <w:rPr>
+          <w:b w:val="0"/>
+          <w:i w:val="0"/>
+        </w:rPr>
+        <w:t xml:space="preserve">Right ventricular (RV) infarct </w:t>
+      </w:r>
+      <w:r>
+        <w:rPr>
+          <w:b w:val="0"/>
+          <w:i w:val="0"/>
+        </w:rPr>
+        <w:t>Slide 63</w:t>
+      </w:r>
+      <w:r>
+        <w:rPr>
+          <w:b w:val="0"/>
+          <w:i w:val="0"/>
+        </w:rPr>
+        <w:t>Definition</w:t>
+      </w:r>
+      <w:r>
+        <w:rPr>
+          <w:b w:val="0"/>
+          <w:i w:val="0"/>
+        </w:rPr>
+        <w:t xml:space="preserve">RCA (right coronary artery) occlusion affecting the inferior and posterior left ventricular wall and septum, extending into the RV in 15–30% </w:t>
+      </w:r>
+      <w:r>
+        <w:rPr>
+          <w:b w:val="0"/>
+          <w:i w:val="0"/>
+        </w:rPr>
+        <w:t>Slide 63</w:t>
+      </w:r>
+      <w:r>
+        <w:rPr>
+          <w:b w:val="0"/>
+          <w:i w:val="0"/>
+        </w:rPr>
+        <w:t>Etiology (cause)</w:t>
+      </w:r>
+      <w:r>
+        <w:rPr>
+          <w:b w:val="0"/>
+          <w:i w:val="0"/>
+        </w:rPr>
+        <w:t xml:space="preserve">Occlusion of the RCA (right coronary artery) </w:t>
+      </w:r>
+      <w:r>
+        <w:rPr>
+          <w:b w:val="0"/>
+          <w:i w:val="0"/>
+        </w:rPr>
+        <w:t>Slide 63</w:t>
+      </w:r>
+      <w:r>
+        <w:rPr>
+          <w:b w:val="0"/>
+          <w:i w:val="0"/>
+        </w:rPr>
+        <w:t>Epidemiology (who)</w:t>
+      </w:r>
+      <w:r>
+        <w:rPr>
+          <w:b w:val="0"/>
+          <w:i w:val="0"/>
+        </w:rPr>
+        <w:t xml:space="preserve">RV extension in 15–30% of RCA (right coronary artery) occlusions </w:t>
+      </w:r>
+      <w:r>
+        <w:rPr>
+          <w:b w:val="0"/>
+          <w:i w:val="0"/>
+        </w:rPr>
+        <w:t>Slide 63</w:t>
+      </w:r>
+      <w:r>
+        <w:rPr>
+          <w:b w:val="0"/>
+          <w:i w:val="0"/>
+        </w:rPr>
+        <w:t>Risk Factors</w:t>
+      </w:r>
+      <w:r>
+        <w:rPr>
+          <w:b w:val="0"/>
+          <w:i w:val="0"/>
+        </w:rPr>
+        <w:t>Not covered in the lecture</w:t>
+      </w:r>
+      <w:r>
+        <w:rPr>
+          <w:b w:val="0"/>
+          <w:i w:val="0"/>
+        </w:rPr>
+        <w:t>Pathology</w:t>
+      </w:r>
+      <w:r>
+        <w:rPr>
+          <w:b w:val="0"/>
+          <w:i w:val="0"/>
+        </w:rPr>
+        <w:t xml:space="preserve">Preload-dependent RV (right ventricle): ↓ preload reduces Frank-Starling effect → RV failure (right-sided heart failure) </w:t>
+      </w:r>
+      <w:r>
+        <w:rPr>
+          <w:b w:val="0"/>
+          <w:i w:val="0"/>
+        </w:rPr>
+        <w:t>Slide 63</w:t>
+      </w:r>
+      <w:r>
+        <w:rPr>
+          <w:b w:val="0"/>
+          <w:i w:val="0"/>
+        </w:rPr>
+        <w:t>Clinical Manifestation</w:t>
+      </w:r>
+      <w:r>
+        <w:rPr>
+          <w:b w:val="0"/>
+          <w:i w:val="0"/>
+        </w:rPr>
+        <w:t>Not covered in the lecture</w:t>
+      </w:r>
+      <w:r>
+        <w:rPr>
+          <w:b w:val="0"/>
+          <w:i w:val="0"/>
+        </w:rPr>
+        <w:t>Diagnosis</w:t>
+      </w:r>
+      <w:r>
+        <w:rPr>
+          <w:b w:val="0"/>
+          <w:i w:val="0"/>
+        </w:rPr>
+        <w:t xml:space="preserve">STEMI chart: ST elevation V1 and V4R, reciprocal depression I and aVL; culprit RCA (right coronary artery); RCA supplies the AV (atrioventricular) node → dysrhythmias </w:t>
+      </w:r>
+      <w:r>
+        <w:rPr>
+          <w:b w:val="0"/>
+          <w:i w:val="0"/>
+        </w:rPr>
+        <w:t>Slides 11, 62</w:t>
+      </w:r>
+      <w:r>
+        <w:rPr>
+          <w:b w:val="0"/>
+          <w:i w:val="0"/>
+        </w:rPr>
+        <w:t>Treatment/Therapy</w:t>
+      </w:r>
+      <w:r>
+        <w:rPr>
+          <w:b w:val="0"/>
+          <w:i w:val="0"/>
+          <w:highlight w:val="yellow"/>
+        </w:rPr>
+        <w:t>★ DO NOT GIVE nitroglycerin</w:t>
+      </w:r>
+      <w:r>
+        <w:rPr>
+          <w:b w:val="0"/>
+          <w:i w:val="0"/>
+        </w:rPr>
+        <w:t xml:space="preserve"> (slide 63; said three times in class): dropping preload loses the Frank-Starling push of the RV, output falls and the patient goes into shock. Slide 73's "caution in inferior MIs (right sided) with evidence of CHF" was never read and is not keyed; the rule is for right ventricular involvement, not every inferior MI (only 15–30% of RCA occlusions reach the RV) </w:t>
+      </w:r>
+      <w:r>
+        <w:rPr>
+          <w:b w:val="0"/>
+          <w:i w:val="0"/>
+        </w:rPr>
+        <w:t>Slides 63, 73</w:t>
+      </w:r>
+      <w:r>
+        <w:rPr>
+          <w:b w:val="0"/>
+          <w:i w:val="0"/>
+        </w:rPr>
+        <w:t>Mortality ★</w:t>
+      </w:r>
+      <w:r>
+        <w:rPr>
+          <w:b w:val="0"/>
+          <w:i w:val="0"/>
+        </w:rPr>
+        <w:t>Not covered in the lecture</w:t>
+      </w:r>
+    </w:p>
+    <w:p>
+      <w:pPr>
+        <w:spacing w:after="120"/>
+      </w:pPr>
+      <w:r>
+        <w:rPr>
+          <w:b w:val="0"/>
+          <w:i w:val="0"/>
+        </w:rPr>
+        <w:t>Sudden cardiac death</w:t>
+      </w:r>
+      <w:r>
+        <w:rPr>
+          <w:b w:val="0"/>
+          <w:i w:val="0"/>
+        </w:rPr>
+        <w:t>★ Professor emphasized</w:t>
+      </w:r>
+      <w:r>
+        <w:rPr>
+          <w:b w:val="0"/>
+          <w:i w:val="0"/>
+        </w:rPr>
+        <w:t>6 not covered</w:t>
+      </w:r>
+    </w:p>
+    <w:p>
+      <w:pPr>
+        <w:spacing w:after="120"/>
+      </w:pPr>
+      <w:r>
+        <w:rPr>
+          <w:b w:val="0"/>
+          <w:i w:val="0"/>
+        </w:rPr>
+        <w:t>★ Ventricular fibrillation is the most common cause; the first manifestation of CAD in over 20% ("one in five")</w:t>
+      </w:r>
+    </w:p>
+    <w:p>
+      <w:pPr>
+        <w:spacing w:after="120"/>
+      </w:pPr>
+      <w:r>
+        <w:rPr>
+          <w:b w:val="0"/>
+          <w:i w:val="0"/>
+        </w:rPr>
+        <w:t>Name of Condition</w:t>
+      </w:r>
+      <w:r>
+        <w:rPr>
+          <w:b w:val="0"/>
+          <w:i w:val="0"/>
+        </w:rPr>
+        <w:t xml:space="preserve">Sudden cardiac death </w:t>
+      </w:r>
+      <w:r>
+        <w:rPr>
+          <w:b w:val="0"/>
+          <w:i w:val="0"/>
+        </w:rPr>
+        <w:t>Slide 85</w:t>
+      </w:r>
+      <w:r>
+        <w:rPr>
+          <w:b w:val="0"/>
+          <w:i w:val="0"/>
+        </w:rPr>
+        <w:t>Definition</w:t>
+      </w:r>
+      <w:r>
+        <w:rPr>
+          <w:b w:val="0"/>
+          <w:i w:val="0"/>
+        </w:rPr>
+        <w:t>Not covered in the lecture</w:t>
+      </w:r>
+      <w:r>
+        <w:rPr>
+          <w:b w:val="0"/>
+          <w:i w:val="0"/>
+        </w:rPr>
+        <w:t>Etiology (cause)</w:t>
+      </w:r>
+      <w:r>
+        <w:rPr>
+          <w:b w:val="0"/>
+          <w:i w:val="0"/>
+          <w:highlight w:val="yellow"/>
+        </w:rPr>
+        <w:t>★ Most common: ventricular fibrillation</w:t>
+      </w:r>
+      <w:r>
+        <w:rPr>
+          <w:b w:val="0"/>
+          <w:i w:val="0"/>
+        </w:rPr>
+        <w:t xml:space="preserve">; also LVH (left ventricular hypertrophy), hypertrophic cardiomyopathy, hypoxia, electrolyte abnormalities </w:t>
+      </w:r>
+      <w:r>
+        <w:rPr>
+          <w:b w:val="0"/>
+          <w:i w:val="0"/>
+        </w:rPr>
+        <w:t>Slide 85</w:t>
+      </w:r>
+      <w:r>
+        <w:rPr>
+          <w:b w:val="0"/>
+          <w:i w:val="0"/>
+        </w:rPr>
+        <w:t>Epidemiology (who)</w:t>
+      </w:r>
+      <w:r>
+        <w:rPr>
+          <w:b w:val="0"/>
+          <w:i w:val="0"/>
+          <w:highlight w:val="yellow"/>
+        </w:rPr>
+        <w:t>★ First manifestation of CAD (coronary artery disease) in &gt;20% of patients</w:t>
+      </w:r>
+      <w:r>
+        <w:rPr>
+          <w:b w:val="0"/>
+          <w:i w:val="0"/>
+        </w:rPr>
+        <w:t xml:space="preserve"> </w:t>
+      </w:r>
+      <w:r>
+        <w:rPr>
+          <w:b w:val="0"/>
+          <w:i w:val="0"/>
+        </w:rPr>
+        <w:t>Slide 85</w:t>
+      </w:r>
+      <w:r>
+        <w:rPr>
+          <w:b w:val="0"/>
+          <w:i w:val="0"/>
+        </w:rPr>
+        <w:t>Risk Factors</w:t>
+      </w:r>
+      <w:r>
+        <w:rPr>
+          <w:b w:val="0"/>
+          <w:i w:val="0"/>
+        </w:rPr>
+        <w:t xml:space="preserve">Sudden death in a first-degree relative (listed as a CAD (coronary artery disease) risk factor) </w:t>
+      </w:r>
+      <w:r>
+        <w:rPr>
+          <w:b w:val="0"/>
+          <w:i w:val="0"/>
+        </w:rPr>
+        <w:t>Slide 22</w:t>
+      </w:r>
+      <w:r>
+        <w:rPr>
+          <w:b w:val="0"/>
+          <w:i w:val="0"/>
+        </w:rPr>
+        <w:t>Pathology</w:t>
+      </w:r>
+      <w:r>
+        <w:rPr>
+          <w:b w:val="0"/>
+          <w:i w:val="0"/>
+        </w:rPr>
+        <w:t>Not covered in the lecture</w:t>
+      </w:r>
+      <w:r>
+        <w:rPr>
+          <w:b w:val="0"/>
+          <w:i w:val="0"/>
+        </w:rPr>
+        <w:t>Clinical Manifestation</w:t>
+      </w:r>
+      <w:r>
+        <w:rPr>
+          <w:b w:val="0"/>
+          <w:i w:val="0"/>
+        </w:rPr>
+        <w:t>Not covered in the lecture</w:t>
+      </w:r>
+      <w:r>
+        <w:rPr>
+          <w:b w:val="0"/>
+          <w:i w:val="0"/>
+        </w:rPr>
+        <w:t>Diagnosis</w:t>
+      </w:r>
+      <w:r>
+        <w:rPr>
+          <w:b w:val="0"/>
+          <w:i w:val="0"/>
+        </w:rPr>
+        <w:t>Not covered in the lecture</w:t>
+      </w:r>
+      <w:r>
+        <w:rPr>
+          <w:b w:val="0"/>
+          <w:i w:val="0"/>
+        </w:rPr>
+        <w:t>Treatment/Therapy</w:t>
+      </w:r>
+      <w:r>
+        <w:rPr>
+          <w:b w:val="0"/>
+          <w:i w:val="0"/>
+        </w:rPr>
+        <w:t>Not covered in the lecture</w:t>
+      </w:r>
+      <w:r>
+        <w:rPr>
+          <w:b w:val="0"/>
+          <w:i w:val="0"/>
+        </w:rPr>
+        <w:t>Mortality ★</w:t>
+      </w:r>
+      <w:r>
+        <w:rPr>
+          <w:b w:val="0"/>
+          <w:i w:val="0"/>
+        </w:rPr>
+        <w:t>Not covered in the lecture</w:t>
+      </w:r>
+    </w:p>
+    <w:p>
+      <w:pPr>
+        <w:spacing w:after="120"/>
+      </w:pPr>
+      <w:r>
+        <w:rPr>
+          <w:b w:val="0"/>
+          <w:i w:val="0"/>
+        </w:rPr>
+        <w:t>Vasospastic (Prinzmetal) angina</w:t>
+      </w:r>
+      <w:r>
+        <w:rPr>
+          <w:b w:val="0"/>
+          <w:i w:val="0"/>
+        </w:rPr>
+        <w:t>★ Professor emphasized</w:t>
+      </w:r>
+      <w:r>
+        <w:rPr>
+          <w:b w:val="0"/>
+          <w:i w:val="0"/>
+        </w:rPr>
+        <w:t>1 not covered</w:t>
+      </w:r>
+    </w:p>
+    <w:p>
+      <w:pPr>
+        <w:spacing w:after="120"/>
+      </w:pPr>
+      <w:r>
+        <w:rPr>
+          <w:b w:val="0"/>
+          <w:i w:val="0"/>
+        </w:rPr>
+        <w:t>★ Gold standard: ergonovine or acetylcholine provocation at angiography, relieved by nitroglycerin; calcium channel blocker first-line</w:t>
+      </w:r>
+    </w:p>
+    <w:p>
+      <w:pPr>
+        <w:spacing w:after="120"/>
+      </w:pPr>
+      <w:r>
+        <w:rPr>
+          <w:b w:val="0"/>
+          <w:i w:val="0"/>
+        </w:rPr>
+        <w:t>Name of Condition</w:t>
+      </w:r>
+      <w:r>
+        <w:rPr>
+          <w:b w:val="0"/>
+          <w:i w:val="0"/>
+        </w:rPr>
+        <w:t xml:space="preserve">Vasospastic angina; Prinzmetal angina; variant angina; coronary vasospasm angina </w:t>
+      </w:r>
+      <w:r>
+        <w:rPr>
+          <w:b w:val="0"/>
+          <w:i w:val="0"/>
+        </w:rPr>
+        <w:t>Slides 87, 89</w:t>
+      </w:r>
+      <w:r>
+        <w:rPr>
+          <w:b w:val="0"/>
+          <w:i w:val="0"/>
+        </w:rPr>
+        <w:t>Definition</w:t>
+      </w:r>
+      <w:r>
+        <w:rPr>
+          <w:b w:val="0"/>
+          <w:i w:val="0"/>
+        </w:rPr>
+        <w:t xml:space="preserve">Angina due to coronary artery vasospasm, occurring at rest and responding to nitroglycerin </w:t>
+      </w:r>
+      <w:r>
+        <w:rPr>
+          <w:b w:val="0"/>
+          <w:i w:val="0"/>
+        </w:rPr>
+        <w:t>Slide 88</w:t>
+      </w:r>
+      <w:r>
+        <w:rPr>
+          <w:b w:val="0"/>
+          <w:i w:val="0"/>
+        </w:rPr>
+        <w:t>Etiology (cause)</w:t>
+      </w:r>
+      <w:r>
+        <w:rPr>
+          <w:b w:val="0"/>
+          <w:i w:val="0"/>
+        </w:rPr>
+        <w:t xml:space="preserve">Vasospasm in normal or diseased coronaries; drug triggers: cocaine, ephedrine, marijuana, alcohol, amphetamine, triptans </w:t>
+      </w:r>
+      <w:r>
+        <w:rPr>
+          <w:b w:val="0"/>
+          <w:i w:val="0"/>
+        </w:rPr>
+        <w:t>Slides 88–89</w:t>
+      </w:r>
+      <w:r>
+        <w:rPr>
+          <w:b w:val="0"/>
+          <w:i w:val="0"/>
+        </w:rPr>
+        <w:t>Epidemiology (who)</w:t>
+      </w:r>
+      <w:r>
+        <w:rPr>
+          <w:b w:val="0"/>
+          <w:i w:val="0"/>
+        </w:rPr>
+        <w:t xml:space="preserve">Relatively uncommon; often age &lt;50 </w:t>
+      </w:r>
+      <w:r>
+        <w:rPr>
+          <w:b w:val="0"/>
+          <w:i w:val="0"/>
+        </w:rPr>
+        <w:t>Slide 88</w:t>
+      </w:r>
+      <w:r>
+        <w:rPr>
+          <w:b w:val="0"/>
+          <w:i w:val="0"/>
+        </w:rPr>
+        <w:t>Risk Factors</w:t>
+      </w:r>
+      <w:r>
+        <w:rPr>
+          <w:b w:val="0"/>
+          <w:i w:val="0"/>
+        </w:rPr>
+        <w:t xml:space="preserve">Cigarette smoking (major risk factor) </w:t>
+      </w:r>
+      <w:r>
+        <w:rPr>
+          <w:b w:val="0"/>
+          <w:i w:val="0"/>
+        </w:rPr>
+        <w:t>Slide 89</w:t>
+      </w:r>
+      <w:r>
+        <w:rPr>
+          <w:b w:val="0"/>
+          <w:i w:val="0"/>
+        </w:rPr>
+        <w:t>Pathology</w:t>
+      </w:r>
+      <w:r>
+        <w:rPr>
+          <w:b w:val="0"/>
+          <w:i w:val="0"/>
+        </w:rPr>
+        <w:t xml:space="preserve">Vasospasm without high-grade stenosis on arteriography </w:t>
+      </w:r>
+      <w:r>
+        <w:rPr>
+          <w:b w:val="0"/>
+          <w:i w:val="0"/>
+        </w:rPr>
+        <w:t>Slides 88, 90</w:t>
+      </w:r>
+      <w:r>
+        <w:rPr>
+          <w:b w:val="0"/>
+          <w:i w:val="0"/>
+        </w:rPr>
+        <w:t>Clinical Manifestation</w:t>
+      </w:r>
+      <w:r>
+        <w:rPr>
+          <w:b w:val="0"/>
+          <w:i w:val="0"/>
+        </w:rPr>
+        <w:t xml:space="preserve">Recurrent chest pain at rest, mostly midnight to 8 am; gradual onset/offset, 5–15 min (may last longer); typical chest pain </w:t>
+      </w:r>
+      <w:r>
+        <w:rPr>
+          <w:b w:val="0"/>
+          <w:i w:val="0"/>
+        </w:rPr>
+        <w:t>Slides 89–90</w:t>
+      </w:r>
+      <w:r>
+        <w:rPr>
+          <w:b w:val="0"/>
+          <w:i w:val="0"/>
+        </w:rPr>
+        <w:t>Diagnosis</w:t>
+      </w:r>
+      <w:r>
+        <w:rPr>
+          <w:b w:val="0"/>
+          <w:i w:val="0"/>
+        </w:rPr>
+        <w:t xml:space="preserve">ECG (electrocardiogram): transient ST elevation during an episode (transient ischemic ST changes in multiple leads, &lt;15 min) that resolves (slide 90, as described in class); slide 91's "T-wave inversion; maybe ST depression" is not keyed. No high-grade stenoses. </w:t>
+      </w:r>
+      <w:r>
+        <w:rPr>
+          <w:b w:val="0"/>
+          <w:i w:val="0"/>
+          <w:highlight w:val="yellow"/>
+        </w:rPr>
+        <w:t>★ Gold standard: spasm on angiography provoked by ergonovine or acetylcholine, relieved by nitroglycerin</w:t>
+      </w:r>
+      <w:r>
+        <w:rPr>
+          <w:b w:val="0"/>
+          <w:i w:val="0"/>
+        </w:rPr>
+        <w:t xml:space="preserve"> </w:t>
+      </w:r>
+      <w:r>
+        <w:rPr>
+          <w:b w:val="0"/>
+          <w:i w:val="0"/>
+        </w:rPr>
+        <w:t>Slides 90–91</w:t>
+      </w:r>
+      <w:r>
+        <w:rPr>
+          <w:b w:val="0"/>
+          <w:i w:val="0"/>
+        </w:rPr>
+        <w:t>Treatment/Therapy</w:t>
+      </w:r>
+      <w:r>
+        <w:rPr>
+          <w:b w:val="0"/>
+          <w:i w:val="0"/>
+        </w:rPr>
+        <w:t xml:space="preserve">Stop smoking; nitrates for symptoms; </w:t>
+      </w:r>
+      <w:r>
+        <w:rPr>
+          <w:b w:val="0"/>
+          <w:i w:val="0"/>
+          <w:highlight w:val="yellow"/>
+        </w:rPr>
+        <w:t>★ FIRST-LINE calcium channel blockers</w:t>
+      </w:r>
+      <w:r>
+        <w:rPr>
+          <w:b w:val="0"/>
+          <w:i w:val="0"/>
+        </w:rPr>
+        <w:t xml:space="preserve"> (diltiazem, amlodipine); AVOID nonselective beta-blockers, aspirin, triptans </w:t>
+      </w:r>
+      <w:r>
+        <w:rPr>
+          <w:b w:val="0"/>
+          <w:i w:val="0"/>
+        </w:rPr>
+        <w:t>Slide 92</w:t>
+      </w:r>
+      <w:r>
+        <w:rPr>
+          <w:b w:val="0"/>
+          <w:i w:val="0"/>
+        </w:rPr>
+        <w:t>Mortality ★</w:t>
+      </w:r>
+      <w:r>
+        <w:rPr>
+          <w:b w:val="0"/>
+          <w:i w:val="0"/>
+        </w:rPr>
+        <w:t>Not covered in the lecture</w:t>
+      </w:r>
+    </w:p>
+    <w:p>
+      <w:pPr>
+        <w:spacing w:after="120"/>
+      </w:pPr>
+      <w:r>
+        <w:rPr>
+          <w:b w:val="0"/>
+          <w:i w:val="0"/>
+        </w:rPr>
         <w:t>Microvascular angina (cardiac syndrome X)</w:t>
       </w:r>
       <w:r>
@@ -14248,7 +14858,7 @@
           <w:b w:val="0"/>
           <w:i w:val="0"/>
         </w:rPr>
-        <w:t xml:space="preserve">Microvascular angina (formerly cardiac syndrome X); MINOCA (myocardial infarction with non-obstructive coronary arteries) </w:t>
+        <w:t xml:space="preserve">Microvascular angina (formerly cardiac syndrome X); the slide also lists MINOCA (myocardial infarction with non-obstructive coronary arteries). Caveat: in standard usage MINOCA requires an infarction and microvascular angina does not; the deck (and the lecture) treat them as one, and no question asks you to separate them </w:t>
       </w:r>
       <w:r>
         <w:rPr>

</xml_diff>

<commit_message>
CMS E4 Clin Med Pro: Postural (not 'Positional') orthostatic tachycardia syndrome
Jaxon 2026-09-28: when sources conflict, use what is true. The deck and lecture
expand POTS as 'positional'; the standard name is postural. Kept a one-line note
that the slide says positional. Page, dark tokens and .docx regenerated.

Co-Authored-By: Claude Opus 5.5 (1M context) <noreply@anthropic.com>
</commit_message>
<xml_diff>
--- a/Clinical Medicine and Surgery I Exam 4/cms-exam-4-clin-med-pro-guide.docx
+++ b/Clinical Medicine and Surgery I Exam 4/cms-exam-4-clin-med-pro-guide.docx
@@ -5273,7 +5273,7 @@
           <w:b w:val="0"/>
           <w:i w:val="0"/>
         </w:rPr>
-        <w:t xml:space="preserve">Most common: orthostatic (neurogenic, non-neurogenic), reflex (situational, vasovagal), cardiogenic (arrhythmia, structural, vascular). Non-hypotensive causes: hypoglycemia, seizure, toxic/overdose, electrolyte imbalance, hypoxia (chronic obstructive pulmonary disease, congestive heart failure), anxiety, anemia, positional orthostatic tachycardia syndrome (POTS); HEAD-HEART-VESSELS mnemonic. </w:t>
+        <w:t xml:space="preserve">Most common: orthostatic (neurogenic, non-neurogenic), reflex (situational, vasovagal), cardiogenic (arrhythmia, structural, vascular). Non-hypotensive causes: hypoglycemia, seizure, toxic/overdose, electrolyte imbalance, hypoxia (chronic obstructive pulmonary disease, congestive heart failure), anxiety, anemia, postural orthostatic tachycardia syndrome (POTS); HEAD-HEART-VESSELS mnemonic. </w:t>
       </w:r>
       <w:r>
         <w:rPr>
@@ -6546,7 +6546,7 @@
           <w:b w:val="0"/>
           <w:i w:val="0"/>
         </w:rPr>
-        <w:t xml:space="preserve">Positional orthostatic tachycardia syndrome (POTS), as expanded on the slide </w:t>
+        <w:t xml:space="preserve">Postural orthostatic tachycardia syndrome (POTS); the slide expands it as "positional", but the standard name is postural </w:t>
       </w:r>
       <w:r>
         <w:rPr>

</xml_diff>